<commit_message>
fix : ajout condition convention.adresse operation sur FicheCAF-template.docx
</commit_message>
<xml_diff>
--- a/documents/FicheCAF-template.docx
+++ b/documents/FicheCAF-template.docx
@@ -17,7 +17,71 @@
           <w:sz w:val="28"/>
           <w:szCs w:val="28"/>
         </w:rPr>
-        <w:t>{% if convention.is_resiliation -%} Résiliation de la convention n° {{ convention.parent.numero }}</w:t>
+        <w:t xml:space="preserve">{% if </w:t>
+      </w:r>
+      <w:proofErr w:type="spellStart"/>
+      <w:r>
+        <w:rPr>
+          <w:b/>
+          <w:sz w:val="28"/>
+          <w:szCs w:val="28"/>
+        </w:rPr>
+        <w:t>convention.is_resiliation</w:t>
+      </w:r>
+      <w:proofErr w:type="spellEnd"/>
+      <w:r>
+        <w:rPr>
+          <w:b/>
+          <w:sz w:val="28"/>
+          <w:szCs w:val="28"/>
+        </w:rPr>
+        <w:t xml:space="preserve"> -%} Résiliation de la convention n° </w:t>
+      </w:r>
+      <w:proofErr w:type="gramStart"/>
+      <w:r>
+        <w:rPr>
+          <w:b/>
+          <w:sz w:val="28"/>
+          <w:szCs w:val="28"/>
+        </w:rPr>
+        <w:t xml:space="preserve">{{ </w:t>
+      </w:r>
+      <w:proofErr w:type="spellStart"/>
+      <w:r>
+        <w:rPr>
+          <w:b/>
+          <w:sz w:val="28"/>
+          <w:szCs w:val="28"/>
+        </w:rPr>
+        <w:t>convention</w:t>
+      </w:r>
+      <w:proofErr w:type="gramEnd"/>
+      <w:r>
+        <w:rPr>
+          <w:b/>
+          <w:sz w:val="28"/>
+          <w:szCs w:val="28"/>
+        </w:rPr>
+        <w:t>.</w:t>
+      </w:r>
+      <w:proofErr w:type="gramStart"/>
+      <w:r>
+        <w:rPr>
+          <w:b/>
+          <w:sz w:val="28"/>
+          <w:szCs w:val="28"/>
+        </w:rPr>
+        <w:t>parent.numero</w:t>
+      </w:r>
+      <w:proofErr w:type="spellEnd"/>
+      <w:proofErr w:type="gramEnd"/>
+      <w:r>
+        <w:rPr>
+          <w:b/>
+          <w:sz w:val="28"/>
+          <w:szCs w:val="28"/>
+        </w:rPr>
+        <w:t xml:space="preserve"> }}</w:t>
       </w:r>
     </w:p>
     <w:p>
@@ -34,7 +98,89 @@
           <w:sz w:val="28"/>
           <w:szCs w:val="28"/>
         </w:rPr>
-        <w:t>{% elif convention.is_denonciation -%} Dénonciation à la convention n° {{ convention.parent.numero }}</w:t>
+        <w:t xml:space="preserve">{% </w:t>
+      </w:r>
+      <w:proofErr w:type="spellStart"/>
+      <w:r>
+        <w:rPr>
+          <w:b/>
+          <w:sz w:val="28"/>
+          <w:szCs w:val="28"/>
+        </w:rPr>
+        <w:t>elif</w:t>
+      </w:r>
+      <w:proofErr w:type="spellEnd"/>
+      <w:r>
+        <w:rPr>
+          <w:b/>
+          <w:sz w:val="28"/>
+          <w:szCs w:val="28"/>
+        </w:rPr>
+        <w:t xml:space="preserve"> </w:t>
+      </w:r>
+      <w:proofErr w:type="spellStart"/>
+      <w:r>
+        <w:rPr>
+          <w:b/>
+          <w:sz w:val="28"/>
+          <w:szCs w:val="28"/>
+        </w:rPr>
+        <w:t>convention.is_denonciation</w:t>
+      </w:r>
+      <w:proofErr w:type="spellEnd"/>
+      <w:r>
+        <w:rPr>
+          <w:b/>
+          <w:sz w:val="28"/>
+          <w:szCs w:val="28"/>
+        </w:rPr>
+        <w:t xml:space="preserve"> -%} Dénonciation à la convention n° </w:t>
+      </w:r>
+      <w:proofErr w:type="gramStart"/>
+      <w:r>
+        <w:rPr>
+          <w:b/>
+          <w:sz w:val="28"/>
+          <w:szCs w:val="28"/>
+        </w:rPr>
+        <w:t xml:space="preserve">{{ </w:t>
+      </w:r>
+      <w:proofErr w:type="spellStart"/>
+      <w:r>
+        <w:rPr>
+          <w:b/>
+          <w:sz w:val="28"/>
+          <w:szCs w:val="28"/>
+        </w:rPr>
+        <w:t>convention</w:t>
+      </w:r>
+      <w:proofErr w:type="gramEnd"/>
+      <w:r>
+        <w:rPr>
+          <w:b/>
+          <w:sz w:val="28"/>
+          <w:szCs w:val="28"/>
+        </w:rPr>
+        <w:t>.</w:t>
+      </w:r>
+      <w:proofErr w:type="gramStart"/>
+      <w:r>
+        <w:rPr>
+          <w:b/>
+          <w:sz w:val="28"/>
+          <w:szCs w:val="28"/>
+        </w:rPr>
+        <w:t>parent.numero</w:t>
+      </w:r>
+      <w:proofErr w:type="spellEnd"/>
+      <w:proofErr w:type="gramEnd"/>
+      <w:r>
+        <w:rPr>
+          <w:b/>
+          <w:sz w:val="28"/>
+          <w:szCs w:val="28"/>
+        </w:rPr>
+        <w:t xml:space="preserve"> }}</w:t>
       </w:r>
     </w:p>
     <w:p>
@@ -51,7 +197,61 @@
           <w:sz w:val="28"/>
           <w:szCs w:val="28"/>
         </w:rPr>
-        <w:t>{% elif convention.is_avenant() -%}</w:t>
+        <w:t xml:space="preserve">{% </w:t>
+      </w:r>
+      <w:proofErr w:type="spellStart"/>
+      <w:r>
+        <w:rPr>
+          <w:b/>
+          <w:sz w:val="28"/>
+          <w:szCs w:val="28"/>
+        </w:rPr>
+        <w:t>elif</w:t>
+      </w:r>
+      <w:proofErr w:type="spellEnd"/>
+      <w:r>
+        <w:rPr>
+          <w:b/>
+          <w:sz w:val="28"/>
+          <w:szCs w:val="28"/>
+        </w:rPr>
+        <w:t xml:space="preserve"> </w:t>
+      </w:r>
+      <w:proofErr w:type="spellStart"/>
+      <w:r>
+        <w:rPr>
+          <w:b/>
+          <w:sz w:val="28"/>
+          <w:szCs w:val="28"/>
+        </w:rPr>
+        <w:t>convention.is_</w:t>
+      </w:r>
+      <w:proofErr w:type="gramStart"/>
+      <w:r>
+        <w:rPr>
+          <w:b/>
+          <w:sz w:val="28"/>
+          <w:szCs w:val="28"/>
+        </w:rPr>
+        <w:t>avenant</w:t>
+      </w:r>
+      <w:proofErr w:type="spellEnd"/>
+      <w:r>
+        <w:rPr>
+          <w:b/>
+          <w:sz w:val="28"/>
+          <w:szCs w:val="28"/>
+        </w:rPr>
+        <w:t>(</w:t>
+      </w:r>
+      <w:proofErr w:type="gramEnd"/>
+      <w:r>
+        <w:rPr>
+          <w:b/>
+          <w:sz w:val="28"/>
+          <w:szCs w:val="28"/>
+        </w:rPr>
+        <w:t>) -%}</w:t>
       </w:r>
     </w:p>
     <w:p>
@@ -68,7 +268,73 @@
           <w:sz w:val="28"/>
           <w:szCs w:val="28"/>
         </w:rPr>
-        <w:t>Avenant n° {{convention.numero}} à la convention n° {{ convention.parent.numero }}</w:t>
+        <w:t>Avenant n° {{</w:t>
+      </w:r>
+      <w:proofErr w:type="spellStart"/>
+      <w:proofErr w:type="gramStart"/>
+      <w:r>
+        <w:rPr>
+          <w:b/>
+          <w:sz w:val="28"/>
+          <w:szCs w:val="28"/>
+        </w:rPr>
+        <w:t>convention.numero</w:t>
+      </w:r>
+      <w:proofErr w:type="spellEnd"/>
+      <w:proofErr w:type="gramEnd"/>
+      <w:r>
+        <w:rPr>
+          <w:b/>
+          <w:sz w:val="28"/>
+          <w:szCs w:val="28"/>
+        </w:rPr>
+        <w:t xml:space="preserve">}} à la convention n° </w:t>
+      </w:r>
+      <w:proofErr w:type="gramStart"/>
+      <w:r>
+        <w:rPr>
+          <w:b/>
+          <w:sz w:val="28"/>
+          <w:szCs w:val="28"/>
+        </w:rPr>
+        <w:t xml:space="preserve">{{ </w:t>
+      </w:r>
+      <w:proofErr w:type="spellStart"/>
+      <w:r>
+        <w:rPr>
+          <w:b/>
+          <w:sz w:val="28"/>
+          <w:szCs w:val="28"/>
+        </w:rPr>
+        <w:t>convention</w:t>
+      </w:r>
+      <w:proofErr w:type="gramEnd"/>
+      <w:r>
+        <w:rPr>
+          <w:b/>
+          <w:sz w:val="28"/>
+          <w:szCs w:val="28"/>
+        </w:rPr>
+        <w:t>.</w:t>
+      </w:r>
+      <w:proofErr w:type="gramStart"/>
+      <w:r>
+        <w:rPr>
+          <w:b/>
+          <w:sz w:val="28"/>
+          <w:szCs w:val="28"/>
+        </w:rPr>
+        <w:t>parent.numero</w:t>
+      </w:r>
+      <w:proofErr w:type="spellEnd"/>
+      <w:proofErr w:type="gramEnd"/>
+      <w:r>
+        <w:rPr>
+          <w:b/>
+          <w:sz w:val="28"/>
+          <w:szCs w:val="28"/>
+        </w:rPr>
+        <w:t xml:space="preserve"> }}</w:t>
       </w:r>
     </w:p>
     <w:p>
@@ -85,7 +351,25 @@
           <w:sz w:val="28"/>
           <w:szCs w:val="28"/>
         </w:rPr>
-        <w:t>{%- else -%}</w:t>
+        <w:t xml:space="preserve">{%- </w:t>
+      </w:r>
+      <w:proofErr w:type="spellStart"/>
+      <w:r>
+        <w:rPr>
+          <w:b/>
+          <w:sz w:val="28"/>
+          <w:szCs w:val="28"/>
+        </w:rPr>
+        <w:t>else</w:t>
+      </w:r>
+      <w:proofErr w:type="spellEnd"/>
+      <w:r>
+        <w:rPr>
+          <w:b/>
+          <w:sz w:val="28"/>
+          <w:szCs w:val="28"/>
+        </w:rPr>
+        <w:t xml:space="preserve"> -%}</w:t>
       </w:r>
     </w:p>
     <w:p>
@@ -102,7 +386,43 @@
           <w:sz w:val="28"/>
           <w:szCs w:val="28"/>
         </w:rPr>
-        <w:t>Convention n° {{ convention.numero}}</w:t>
+        <w:t xml:space="preserve">Convention n° </w:t>
+      </w:r>
+      <w:proofErr w:type="gramStart"/>
+      <w:r>
+        <w:rPr>
+          <w:b/>
+          <w:sz w:val="28"/>
+          <w:szCs w:val="28"/>
+        </w:rPr>
+        <w:t xml:space="preserve">{{ </w:t>
+      </w:r>
+      <w:proofErr w:type="spellStart"/>
+      <w:r>
+        <w:rPr>
+          <w:b/>
+          <w:sz w:val="28"/>
+          <w:szCs w:val="28"/>
+        </w:rPr>
+        <w:t>convention</w:t>
+      </w:r>
+      <w:proofErr w:type="gramEnd"/>
+      <w:r>
+        <w:rPr>
+          <w:b/>
+          <w:sz w:val="28"/>
+          <w:szCs w:val="28"/>
+        </w:rPr>
+        <w:t>.numero</w:t>
+      </w:r>
+      <w:proofErr w:type="spellEnd"/>
+      <w:r>
+        <w:rPr>
+          <w:b/>
+          <w:sz w:val="28"/>
+          <w:szCs w:val="28"/>
+        </w:rPr>
+        <w:t>}}</w:t>
       </w:r>
     </w:p>
     <w:p>
@@ -119,7 +439,25 @@
           <w:sz w:val="28"/>
           <w:szCs w:val="28"/>
         </w:rPr>
-        <w:t>{%- endif %}</w:t>
+        <w:t xml:space="preserve">{%- </w:t>
+      </w:r>
+      <w:proofErr w:type="spellStart"/>
+      <w:r>
+        <w:rPr>
+          <w:b/>
+          <w:sz w:val="28"/>
+          <w:szCs w:val="28"/>
+        </w:rPr>
+        <w:t>endif</w:t>
+      </w:r>
+      <w:proofErr w:type="spellEnd"/>
+      <w:r>
+        <w:rPr>
+          <w:b/>
+          <w:sz w:val="28"/>
+          <w:szCs w:val="28"/>
+        </w:rPr>
+        <w:t xml:space="preserve"> %}</w:t>
       </w:r>
     </w:p>
     <w:p>
@@ -136,7 +474,61 @@
           <w:sz w:val="28"/>
           <w:szCs w:val="28"/>
         </w:rPr>
-        <w:t xml:space="preserve">{% if  convention.date_resiliation  %} </w:t>
+        <w:t xml:space="preserve">{% </w:t>
+      </w:r>
+      <w:proofErr w:type="gramStart"/>
+      <w:r>
+        <w:rPr>
+          <w:b/>
+          <w:sz w:val="28"/>
+          <w:szCs w:val="28"/>
+        </w:rPr>
+        <w:t xml:space="preserve">if  </w:t>
+      </w:r>
+      <w:proofErr w:type="spellStart"/>
+      <w:r>
+        <w:rPr>
+          <w:b/>
+          <w:sz w:val="28"/>
+          <w:szCs w:val="28"/>
+        </w:rPr>
+        <w:t>convention</w:t>
+      </w:r>
+      <w:proofErr w:type="gramEnd"/>
+      <w:r>
+        <w:rPr>
+          <w:b/>
+          <w:sz w:val="28"/>
+          <w:szCs w:val="28"/>
+        </w:rPr>
+        <w:t>.date_</w:t>
+      </w:r>
+      <w:proofErr w:type="gramStart"/>
+      <w:r>
+        <w:rPr>
+          <w:b/>
+          <w:sz w:val="28"/>
+          <w:szCs w:val="28"/>
+        </w:rPr>
+        <w:t>resiliation</w:t>
+      </w:r>
+      <w:proofErr w:type="spellEnd"/>
+      <w:r>
+        <w:rPr>
+          <w:b/>
+          <w:sz w:val="28"/>
+          <w:szCs w:val="28"/>
+        </w:rPr>
+        <w:t xml:space="preserve">  %</w:t>
+      </w:r>
+      <w:proofErr w:type="gramEnd"/>
+      <w:r>
+        <w:rPr>
+          <w:b/>
+          <w:sz w:val="28"/>
+          <w:szCs w:val="28"/>
+        </w:rPr>
+        <w:t xml:space="preserve">} </w:t>
       </w:r>
     </w:p>
     <w:tbl>
@@ -184,7 +576,35 @@
                 <w:sz w:val="28"/>
                 <w:szCs w:val="28"/>
               </w:rPr>
-              <w:t xml:space="preserve">La convention et ses avenants sont résiliés à partir du {{convention.date_resiliation|d}} </w:t>
+              <w:t>La convention et ses avenants sont résiliés à partir du {{</w:t>
+            </w:r>
+            <w:proofErr w:type="spellStart"/>
+            <w:proofErr w:type="gramStart"/>
+            <w:r>
+              <w:rPr>
+                <w:b/>
+                <w:sz w:val="28"/>
+                <w:szCs w:val="28"/>
+              </w:rPr>
+              <w:t>convention.date</w:t>
+            </w:r>
+            <w:proofErr w:type="gramEnd"/>
+            <w:r>
+              <w:rPr>
+                <w:b/>
+                <w:sz w:val="28"/>
+                <w:szCs w:val="28"/>
+              </w:rPr>
+              <w:t>_resiliation|d</w:t>
+            </w:r>
+            <w:proofErr w:type="spellEnd"/>
+            <w:r>
+              <w:rPr>
+                <w:b/>
+                <w:sz w:val="28"/>
+                <w:szCs w:val="28"/>
+              </w:rPr>
+              <w:t xml:space="preserve">}} </w:t>
             </w:r>
           </w:p>
         </w:tc>
@@ -204,7 +624,71 @@
           <w:sz w:val="28"/>
           <w:szCs w:val="28"/>
         </w:rPr>
-        <w:t xml:space="preserve">{% elif  convention.date_denonciation  %} </w:t>
+        <w:t xml:space="preserve">{% </w:t>
+      </w:r>
+      <w:proofErr w:type="spellStart"/>
+      <w:proofErr w:type="gramStart"/>
+      <w:r>
+        <w:rPr>
+          <w:b/>
+          <w:sz w:val="28"/>
+          <w:szCs w:val="28"/>
+        </w:rPr>
+        <w:t>elif</w:t>
+      </w:r>
+      <w:proofErr w:type="spellEnd"/>
+      <w:r>
+        <w:rPr>
+          <w:b/>
+          <w:sz w:val="28"/>
+          <w:szCs w:val="28"/>
+        </w:rPr>
+        <w:t xml:space="preserve">  </w:t>
+      </w:r>
+      <w:proofErr w:type="spellStart"/>
+      <w:r>
+        <w:rPr>
+          <w:b/>
+          <w:sz w:val="28"/>
+          <w:szCs w:val="28"/>
+        </w:rPr>
+        <w:t>convention</w:t>
+      </w:r>
+      <w:proofErr w:type="gramEnd"/>
+      <w:r>
+        <w:rPr>
+          <w:b/>
+          <w:sz w:val="28"/>
+          <w:szCs w:val="28"/>
+        </w:rPr>
+        <w:t>.date_</w:t>
+      </w:r>
+      <w:proofErr w:type="gramStart"/>
+      <w:r>
+        <w:rPr>
+          <w:b/>
+          <w:sz w:val="28"/>
+          <w:szCs w:val="28"/>
+        </w:rPr>
+        <w:t>denonciation</w:t>
+      </w:r>
+      <w:proofErr w:type="spellEnd"/>
+      <w:r>
+        <w:rPr>
+          <w:b/>
+          <w:sz w:val="28"/>
+          <w:szCs w:val="28"/>
+        </w:rPr>
+        <w:t xml:space="preserve">  %</w:t>
+      </w:r>
+      <w:proofErr w:type="gramEnd"/>
+      <w:r>
+        <w:rPr>
+          <w:b/>
+          <w:sz w:val="28"/>
+          <w:szCs w:val="28"/>
+        </w:rPr>
+        <w:t xml:space="preserve">} </w:t>
       </w:r>
     </w:p>
     <w:tbl>
@@ -252,7 +736,35 @@
                 <w:sz w:val="28"/>
                 <w:szCs w:val="28"/>
               </w:rPr>
-              <w:t xml:space="preserve">La convention et ses avenants sont dénoncés à partir du {{convention.date_denonciation|d}} </w:t>
+              <w:t>La convention et ses avenants sont dénoncés à partir du {{</w:t>
+            </w:r>
+            <w:proofErr w:type="spellStart"/>
+            <w:proofErr w:type="gramStart"/>
+            <w:r>
+              <w:rPr>
+                <w:b/>
+                <w:sz w:val="28"/>
+                <w:szCs w:val="28"/>
+              </w:rPr>
+              <w:t>convention.date</w:t>
+            </w:r>
+            <w:proofErr w:type="gramEnd"/>
+            <w:r>
+              <w:rPr>
+                <w:b/>
+                <w:sz w:val="28"/>
+                <w:szCs w:val="28"/>
+              </w:rPr>
+              <w:t>_denonciation|d</w:t>
+            </w:r>
+            <w:proofErr w:type="spellEnd"/>
+            <w:r>
+              <w:rPr>
+                <w:b/>
+                <w:sz w:val="28"/>
+                <w:szCs w:val="28"/>
+              </w:rPr>
+              <w:t xml:space="preserve">}} </w:t>
             </w:r>
           </w:p>
         </w:tc>
@@ -272,7 +784,25 @@
           <w:sz w:val="28"/>
           <w:szCs w:val="28"/>
         </w:rPr>
-        <w:t>{% endif %}</w:t>
+        <w:t xml:space="preserve">{% </w:t>
+      </w:r>
+      <w:proofErr w:type="spellStart"/>
+      <w:r>
+        <w:rPr>
+          <w:b/>
+          <w:sz w:val="28"/>
+          <w:szCs w:val="28"/>
+        </w:rPr>
+        <w:t>endif</w:t>
+      </w:r>
+      <w:proofErr w:type="spellEnd"/>
+      <w:r>
+        <w:rPr>
+          <w:b/>
+          <w:sz w:val="28"/>
+          <w:szCs w:val="28"/>
+        </w:rPr>
+        <w:t xml:space="preserve"> %}</w:t>
       </w:r>
     </w:p>
     <w:p>
@@ -285,6 +815,11 @@
       <w:bookmarkEnd w:id="0"/>
     </w:p>
     <w:p>
+      <w:pPr>
+        <w:rPr>
+          <w:rFonts w:cs="TimesNewRomanPSMT"/>
+        </w:rPr>
+      </w:pPr>
       <w:r>
         <w:rPr>
           <w:rFonts w:cs="TimesNewRomanPSMT"/>
@@ -297,46 +832,35 @@
         <w:rPr>
           <w:rFonts w:cs="TimesNewRomanPSMT"/>
         </w:rPr>
-        <w:t xml:space="preserve"> {{ programme.nom }}</w:t>
-      </w:r>
-    </w:p>
-    <w:p>
-      <w:pPr>
-        <w:rPr>
-          <w:rFonts w:cs="TimesNewRomanPSMT"/>
-        </w:rPr>
-      </w:pPr>
-    </w:p>
-    <w:p>
-      <w:r>
-        <w:rPr>
-          <w:rFonts w:cs="TimesNewRomanPSMT"/>
-          <w:b/>
-          <w:bCs/>
-        </w:rPr>
-        <w:t xml:space="preserve">Adresse(s) de l’opération : </w:t>
-      </w:r>
-      <w:r>
-        <w:rPr>
-          <w:rFonts w:cs="TimesNewRomanPSMT"/>
-        </w:rPr>
-        <w:t xml:space="preserve">{{ programme.adresse|inline_text_multiline }}, </w:t>
-      </w:r>
-      <w:bookmarkStart w:id="1" w:name="CodePostal2"/>
-      <w:bookmarkEnd w:id="1"/>
-      <w:r>
-        <w:rPr>
-          <w:rFonts w:cs="TimesNewRomanPSMT"/>
-        </w:rPr>
-        <w:t xml:space="preserve">{{ programme.code_postal }} </w:t>
-      </w:r>
-      <w:bookmarkStart w:id="2" w:name="Ville2"/>
-      <w:bookmarkEnd w:id="2"/>
-      <w:r>
-        <w:rPr>
-          <w:rFonts w:cs="TimesNewRomanPSMT"/>
-        </w:rPr>
-        <w:t>{{ programme.ville }}</w:t>
+        <w:t xml:space="preserve"> </w:t>
+      </w:r>
+      <w:proofErr w:type="gramStart"/>
+      <w:r>
+        <w:rPr>
+          <w:rFonts w:cs="TimesNewRomanPSMT"/>
+        </w:rPr>
+        <w:t xml:space="preserve">{{ </w:t>
+      </w:r>
+      <w:proofErr w:type="spellStart"/>
+      <w:r>
+        <w:rPr>
+          <w:rFonts w:cs="TimesNewRomanPSMT"/>
+        </w:rPr>
+        <w:t>programme.nom</w:t>
+      </w:r>
+      <w:proofErr w:type="spellEnd"/>
+      <w:proofErr w:type="gramEnd"/>
+      <w:r>
+        <w:rPr>
+          <w:rFonts w:cs="TimesNewRomanPSMT"/>
+        </w:rPr>
+        <w:t xml:space="preserve"> }</w:t>
+      </w:r>
+      <w:r>
+        <w:rPr>
+          <w:rFonts w:cs="TimesNewRomanPSMT"/>
+        </w:rPr>
+        <w:t>}</w:t>
       </w:r>
     </w:p>
     <w:p>
@@ -355,10 +879,145 @@
       <w:r>
         <w:rPr>
           <w:rFonts w:cs="TimesNewRomanPSMT"/>
+        </w:rPr>
+        <w:t xml:space="preserve">{% if </w:t>
+      </w:r>
+      <w:proofErr w:type="spellStart"/>
+      <w:proofErr w:type="gramStart"/>
+      <w:r>
+        <w:rPr>
+          <w:rFonts w:cs="TimesNewRomanPSMT"/>
+        </w:rPr>
+        <w:t>convention.adresse</w:t>
+      </w:r>
+      <w:proofErr w:type="spellEnd"/>
+      <w:proofErr w:type="gramEnd"/>
+      <w:r>
+        <w:rPr>
+          <w:rFonts w:cs="TimesNewRomanPSMT"/>
+        </w:rPr>
+        <w:t xml:space="preserve"> %}</w:t>
+      </w:r>
+      <w:r>
+        <w:rPr>
+          <w:rFonts w:cs="TimesNewRomanPSMT"/>
           <w:b/>
           <w:bCs/>
         </w:rPr>
-        <w:t>Financement</w:t>
+        <w:br/>
+        <w:t xml:space="preserve">Adresse(s) de l’opération : </w:t>
+      </w:r>
+      <w:proofErr w:type="gramStart"/>
+      <w:r>
+        <w:rPr>
+          <w:rFonts w:cs="TimesNewRomanPSMT"/>
+        </w:rPr>
+        <w:t xml:space="preserve">{{ </w:t>
+      </w:r>
+      <w:proofErr w:type="spellStart"/>
+      <w:r>
+        <w:rPr>
+          <w:rFonts w:cs="TimesNewRomanPSMT"/>
+        </w:rPr>
+        <w:t>convention</w:t>
+      </w:r>
+      <w:proofErr w:type="gramEnd"/>
+      <w:r>
+        <w:rPr>
+          <w:rFonts w:cs="TimesNewRomanPSMT"/>
+        </w:rPr>
+        <w:t>.adresse|inline_text_</w:t>
+      </w:r>
+      <w:proofErr w:type="gramStart"/>
+      <w:r>
+        <w:rPr>
+          <w:rFonts w:cs="TimesNewRomanPSMT"/>
+        </w:rPr>
+        <w:t>multiline</w:t>
+      </w:r>
+      <w:proofErr w:type="spellEnd"/>
+      <w:r>
+        <w:rPr>
+          <w:rFonts w:cs="TimesNewRomanPSMT"/>
+        </w:rPr>
+        <w:t xml:space="preserve"> }</w:t>
+      </w:r>
+      <w:proofErr w:type="gramEnd"/>
+      <w:r>
+        <w:rPr>
+          <w:rFonts w:cs="TimesNewRomanPSMT"/>
+        </w:rPr>
+        <w:t xml:space="preserve">}, </w:t>
+      </w:r>
+      <w:proofErr w:type="gramStart"/>
+      <w:r>
+        <w:rPr>
+          <w:rFonts w:cs="TimesNewRomanPSMT"/>
+        </w:rPr>
+        <w:t xml:space="preserve">{{ </w:t>
+      </w:r>
+      <w:proofErr w:type="spellStart"/>
+      <w:r>
+        <w:rPr>
+          <w:rFonts w:cs="TimesNewRomanPSMT"/>
+        </w:rPr>
+        <w:t>programme</w:t>
+      </w:r>
+      <w:proofErr w:type="gramEnd"/>
+      <w:r>
+        <w:rPr>
+          <w:rFonts w:cs="TimesNewRomanPSMT"/>
+        </w:rPr>
+        <w:t>.code_</w:t>
+      </w:r>
+      <w:proofErr w:type="gramStart"/>
+      <w:r>
+        <w:rPr>
+          <w:rFonts w:cs="TimesNewRomanPSMT"/>
+        </w:rPr>
+        <w:t>postal</w:t>
+      </w:r>
+      <w:proofErr w:type="spellEnd"/>
+      <w:r>
+        <w:rPr>
+          <w:rFonts w:cs="TimesNewRomanPSMT"/>
+        </w:rPr>
+        <w:t xml:space="preserve"> }</w:t>
+      </w:r>
+      <w:proofErr w:type="gramEnd"/>
+      <w:r>
+        <w:rPr>
+          <w:rFonts w:cs="TimesNewRomanPSMT"/>
+        </w:rPr>
+        <w:t xml:space="preserve">} </w:t>
+      </w:r>
+      <w:proofErr w:type="gramStart"/>
+      <w:r>
+        <w:rPr>
+          <w:rFonts w:cs="TimesNewRomanPSMT"/>
+        </w:rPr>
+        <w:t xml:space="preserve">{{ </w:t>
+      </w:r>
+      <w:proofErr w:type="spellStart"/>
+      <w:r>
+        <w:rPr>
+          <w:rFonts w:cs="TimesNewRomanPSMT"/>
+        </w:rPr>
+        <w:t>programme</w:t>
+      </w:r>
+      <w:proofErr w:type="gramEnd"/>
+      <w:r>
+        <w:rPr>
+          <w:rFonts w:cs="TimesNewRomanPSMT"/>
+        </w:rPr>
+        <w:t>.ville</w:t>
+      </w:r>
+      <w:proofErr w:type="spellEnd"/>
+      <w:r>
+        <w:rPr>
+          <w:rFonts w:cs="TimesNewRomanPSMT"/>
+        </w:rPr>
+        <w:t xml:space="preserve"> }}</w:t>
       </w:r>
       <w:r>
         <w:rPr>
@@ -366,13 +1025,27 @@
           <w:b/>
           <w:bCs/>
         </w:rPr>
-        <w:t>{{</w:t>
-      </w:r>
-      <w:r>
-        <w:rPr>
-          <w:rFonts w:cs="TimesNewRomanPSMT"/>
-        </w:rPr>
-        <w:t xml:space="preserve"> </w:t>
+        <w:br/>
+      </w:r>
+      <w:r>
+        <w:rPr>
+          <w:rFonts w:cs="TimesNewRomanPSMT"/>
+        </w:rPr>
+        <w:t xml:space="preserve">{% </w:t>
+      </w:r>
+      <w:proofErr w:type="spellStart"/>
+      <w:r>
+        <w:rPr>
+          <w:rFonts w:cs="TimesNewRomanPSMT"/>
+        </w:rPr>
+        <w:t>else</w:t>
+      </w:r>
+      <w:proofErr w:type="spellEnd"/>
+      <w:r>
+        <w:rPr>
+          <w:rFonts w:cs="TimesNewRomanPSMT"/>
+        </w:rPr>
+        <w:t xml:space="preserve"> %}</w:t>
       </w:r>
       <w:r>
         <w:rPr>
@@ -380,64 +1053,141 @@
           <w:b/>
           <w:bCs/>
         </w:rPr>
-        <w:t>convention.get_financements</w:t>
-      </w:r>
-      <w:r>
-        <w:rPr>
-          <w:rFonts w:cs="TimesNewRomanPSMT"/>
-          <w:b/>
-          <w:bCs/>
-        </w:rPr>
-        <w:t>|length</w:t>
-      </w:r>
-      <w:r>
-        <w:rPr>
-          <w:rFonts w:cs="TimesNewRomanPSMT"/>
-          <w:b/>
-          <w:bCs/>
-        </w:rPr>
-        <w:t>|pl</w:t>
-      </w:r>
-      <w:r>
-        <w:rPr>
-          <w:b/>
-          <w:bCs/>
+        <w:br/>
+        <w:t xml:space="preserve">Adresse(s) de l’opération : </w:t>
+      </w:r>
+      <w:proofErr w:type="gramStart"/>
+      <w:r>
+        <w:rPr>
+          <w:rFonts w:cs="TimesNewRomanPSMT"/>
+        </w:rPr>
+        <w:t xml:space="preserve">{{ </w:t>
+      </w:r>
+      <w:proofErr w:type="spellStart"/>
+      <w:r>
+        <w:rPr>
+          <w:rFonts w:cs="TimesNewRomanPSMT"/>
+        </w:rPr>
+        <w:t>programme</w:t>
+      </w:r>
+      <w:proofErr w:type="gramEnd"/>
+      <w:r>
+        <w:rPr>
+          <w:rFonts w:cs="TimesNewRomanPSMT"/>
+        </w:rPr>
+        <w:t>.adresse|inline_text_</w:t>
+      </w:r>
+      <w:proofErr w:type="gramStart"/>
+      <w:r>
+        <w:rPr>
+          <w:rFonts w:cs="TimesNewRomanPSMT"/>
+        </w:rPr>
+        <w:t>multiline</w:t>
+      </w:r>
+      <w:proofErr w:type="spellEnd"/>
+      <w:r>
+        <w:rPr>
+          <w:rFonts w:cs="TimesNewRomanPSMT"/>
+        </w:rPr>
+        <w:t xml:space="preserve"> }</w:t>
+      </w:r>
+      <w:proofErr w:type="gramEnd"/>
+      <w:r>
+        <w:rPr>
+          <w:rFonts w:cs="TimesNewRomanPSMT"/>
+        </w:rPr>
+        <w:t xml:space="preserve">}, </w:t>
+      </w:r>
+      <w:proofErr w:type="gramStart"/>
+      <w:r>
+        <w:rPr>
+          <w:rFonts w:cs="TimesNewRomanPSMT"/>
+        </w:rPr>
+        <w:t xml:space="preserve">{{ </w:t>
+      </w:r>
+      <w:proofErr w:type="spellStart"/>
+      <w:r>
+        <w:rPr>
+          <w:rFonts w:cs="TimesNewRomanPSMT"/>
+        </w:rPr>
+        <w:t>programme</w:t>
+      </w:r>
+      <w:proofErr w:type="gramEnd"/>
+      <w:r>
+        <w:rPr>
+          <w:rFonts w:cs="TimesNewRomanPSMT"/>
+        </w:rPr>
+        <w:t>.code_</w:t>
+      </w:r>
+      <w:proofErr w:type="gramStart"/>
+      <w:r>
+        <w:rPr>
+          <w:rFonts w:cs="TimesNewRomanPSMT"/>
+        </w:rPr>
+        <w:t>postal</w:t>
+      </w:r>
+      <w:proofErr w:type="spellEnd"/>
+      <w:r>
+        <w:rPr>
+          <w:rFonts w:cs="TimesNewRomanPSMT"/>
+        </w:rPr>
+        <w:t xml:space="preserve"> }</w:t>
+      </w:r>
+      <w:proofErr w:type="gramEnd"/>
+      <w:r>
+        <w:rPr>
+          <w:rFonts w:cs="TimesNewRomanPSMT"/>
+        </w:rPr>
+        <w:t xml:space="preserve">} </w:t>
+      </w:r>
+      <w:proofErr w:type="gramStart"/>
+      <w:r>
+        <w:rPr>
+          <w:rFonts w:cs="TimesNewRomanPSMT"/>
+        </w:rPr>
+        <w:t xml:space="preserve">{{ </w:t>
+      </w:r>
+      <w:proofErr w:type="spellStart"/>
+      <w:r>
+        <w:rPr>
+          <w:rFonts w:cs="TimesNewRomanPSMT"/>
+        </w:rPr>
+        <w:t>programme</w:t>
+      </w:r>
+      <w:proofErr w:type="gramEnd"/>
+      <w:r>
+        <w:rPr>
+          <w:rFonts w:cs="TimesNewRomanPSMT"/>
+        </w:rPr>
+        <w:t>.ville</w:t>
+      </w:r>
+      <w:proofErr w:type="spellEnd"/>
+      <w:r>
+        <w:rPr>
+          <w:rFonts w:cs="TimesNewRomanPSMT"/>
         </w:rPr>
         <w:t xml:space="preserve"> }}</w:t>
       </w:r>
       <w:r>
         <w:rPr>
           <w:rFonts w:cs="TimesNewRomanPSMT"/>
-          <w:b/>
-          <w:bCs/>
-        </w:rPr>
-        <w:t> :</w:t>
-      </w:r>
-      <w:r>
-        <w:rPr>
-          <w:rFonts w:cs="TimesNewRomanPSMT"/>
-        </w:rPr>
-        <w:t xml:space="preserve"> {{ </w:t>
-      </w:r>
-      <w:r>
-        <w:rPr>
-          <w:rFonts w:cs="TimesNewRomanPSMT"/>
-        </w:rPr>
-        <w:t>convention.</w:t>
-      </w:r>
-      <w:r>
-        <w:rPr>
-          <w:rFonts w:cs="TimesNewRomanPSMT"/>
-        </w:rPr>
-        <w:t>get_financement_display</w:t>
-      </w:r>
-    </w:p>
-    <w:p>
-      <w:r>
-        <w:rPr>
-          <w:rFonts w:cs="TimesNewRomanPSMT"/>
-        </w:rPr>
-        <w:t xml:space="preserve"> }}</w:t>
+        </w:rPr>
+        <w:br/>
+        <w:t xml:space="preserve">{% </w:t>
+      </w:r>
+      <w:proofErr w:type="spellStart"/>
+      <w:r>
+        <w:rPr>
+          <w:rFonts w:cs="TimesNewRomanPSMT"/>
+        </w:rPr>
+        <w:t>endif</w:t>
+      </w:r>
+      <w:proofErr w:type="spellEnd"/>
+      <w:r>
+        <w:rPr>
+          <w:rFonts w:cs="TimesNewRomanPSMT"/>
+        </w:rPr>
+        <w:t xml:space="preserve"> %}</w:t>
       </w:r>
     </w:p>
     <w:p>
@@ -453,19 +1203,137 @@
           <w:rFonts w:cs="TimesNewRomanPSMT"/>
         </w:rPr>
       </w:pPr>
+      <w:proofErr w:type="gramStart"/>
       <w:r>
         <w:rPr>
           <w:rFonts w:cs="TimesNewRomanPSMT"/>
           <w:b/>
           <w:bCs/>
         </w:rPr>
-        <w:t xml:space="preserve">Date d’expiration de la convention APL : </w:t>
-      </w:r>
-      <w:r>
-        <w:rPr>
-          <w:rFonts w:cs="TimesNewRomanPSMT"/>
-        </w:rPr>
-        <w:t>{{ convention.date_fin_conventionnement|d }}</w:t>
+        <w:t>Financement</w:t>
+      </w:r>
+      <w:r>
+        <w:rPr>
+          <w:rFonts w:cs="TimesNewRomanPSMT"/>
+          <w:b/>
+          <w:bCs/>
+        </w:rPr>
+        <w:t>{{</w:t>
+      </w:r>
+      <w:r>
+        <w:rPr>
+          <w:rFonts w:cs="TimesNewRomanPSMT"/>
+        </w:rPr>
+        <w:t xml:space="preserve"> </w:t>
+      </w:r>
+      <w:proofErr w:type="spellStart"/>
+      <w:r>
+        <w:rPr>
+          <w:rFonts w:cs="TimesNewRomanPSMT"/>
+          <w:b/>
+          <w:bCs/>
+        </w:rPr>
+        <w:t>convention.get</w:t>
+      </w:r>
+      <w:proofErr w:type="gramEnd"/>
+      <w:r>
+        <w:rPr>
+          <w:rFonts w:cs="TimesNewRomanPSMT"/>
+          <w:b/>
+          <w:bCs/>
+        </w:rPr>
+        <w:t>_financements</w:t>
+      </w:r>
+      <w:r>
+        <w:rPr>
+          <w:rFonts w:cs="TimesNewRomanPSMT"/>
+          <w:b/>
+          <w:bCs/>
+        </w:rPr>
+        <w:t>|length</w:t>
+      </w:r>
+      <w:r>
+        <w:rPr>
+          <w:rFonts w:cs="TimesNewRomanPSMT"/>
+          <w:b/>
+          <w:bCs/>
+        </w:rPr>
+        <w:t>|</w:t>
+      </w:r>
+      <w:proofErr w:type="gramStart"/>
+      <w:r>
+        <w:rPr>
+          <w:rFonts w:cs="TimesNewRomanPSMT"/>
+          <w:b/>
+          <w:bCs/>
+        </w:rPr>
+        <w:t>pl</w:t>
+      </w:r>
+      <w:proofErr w:type="spellEnd"/>
+      <w:r>
+        <w:rPr>
+          <w:b/>
+          <w:bCs/>
+        </w:rPr>
+        <w:t xml:space="preserve"> }</w:t>
+      </w:r>
+      <w:proofErr w:type="gramEnd"/>
+      <w:r>
+        <w:rPr>
+          <w:b/>
+          <w:bCs/>
+        </w:rPr>
+        <w:t>}</w:t>
+      </w:r>
+      <w:r>
+        <w:rPr>
+          <w:rFonts w:cs="TimesNewRomanPSMT"/>
+          <w:b/>
+          <w:bCs/>
+        </w:rPr>
+        <w:t> :</w:t>
+      </w:r>
+      <w:r>
+        <w:rPr>
+          <w:rFonts w:cs="TimesNewRomanPSMT"/>
+        </w:rPr>
+        <w:t xml:space="preserve"> </w:t>
+      </w:r>
+      <w:proofErr w:type="gramStart"/>
+      <w:r>
+        <w:rPr>
+          <w:rFonts w:cs="TimesNewRomanPSMT"/>
+        </w:rPr>
+        <w:t xml:space="preserve">{{ </w:t>
+      </w:r>
+      <w:proofErr w:type="spellStart"/>
+      <w:r>
+        <w:rPr>
+          <w:rFonts w:cs="TimesNewRomanPSMT"/>
+        </w:rPr>
+        <w:t>convention.</w:t>
+      </w:r>
+      <w:r>
+        <w:rPr>
+          <w:rFonts w:cs="TimesNewRomanPSMT"/>
+        </w:rPr>
+        <w:t>get</w:t>
+      </w:r>
+      <w:proofErr w:type="gramEnd"/>
+      <w:r>
+        <w:rPr>
+          <w:rFonts w:cs="TimesNewRomanPSMT"/>
+        </w:rPr>
+        <w:t>_financement_display</w:t>
+      </w:r>
+      <w:proofErr w:type="spellEnd"/>
+    </w:p>
+    <w:p>
+      <w:r>
+        <w:rPr>
+          <w:rFonts w:cs="TimesNewRomanPSMT"/>
+        </w:rPr>
+        <w:t xml:space="preserve"> }}</w:t>
       </w:r>
     </w:p>
     <w:p>
@@ -487,43 +1355,49 @@
           <w:b/>
           <w:bCs/>
         </w:rPr>
-        <w:t xml:space="preserve">Type de la convention : </w:t>
-      </w:r>
-      <w:r>
-        <w:rPr>
-          <w:rFonts w:cs="TimesNewRomanPSMT"/>
-        </w:rPr>
-        <w:t>{{ convention.</w:t>
-      </w:r>
-      <w:r>
-        <w:rPr>
-          <w:rFonts w:cs="TimesNewRomanPSMT"/>
-        </w:rPr>
-        <w:t>programme.</w:t>
-      </w:r>
-      <w:r>
-        <w:rPr>
-          <w:rFonts w:cs="TimesNewRomanPSMT"/>
-        </w:rPr>
-        <w:t>get_</w:t>
-      </w:r>
-      <w:r>
-        <w:rPr>
-          <w:rFonts w:cs="TimesNewRomanPSMT"/>
-        </w:rPr>
-        <w:t>nature_logement</w:t>
-      </w:r>
-      <w:r>
-        <w:rPr>
-          <w:rFonts w:cs="TimesNewRomanPSMT"/>
-        </w:rPr>
-        <w:t>_display()</w:t>
-      </w:r>
-      <w:r>
-        <w:rPr>
-          <w:rFonts w:cs="TimesNewRomanPSMT"/>
-        </w:rPr>
-        <w:t xml:space="preserve"> }}</w:t>
+        <w:t xml:space="preserve">Date d’expiration de la convention APL : </w:t>
+      </w:r>
+      <w:proofErr w:type="gramStart"/>
+      <w:r>
+        <w:rPr>
+          <w:rFonts w:cs="TimesNewRomanPSMT"/>
+        </w:rPr>
+        <w:t xml:space="preserve">{{ </w:t>
+      </w:r>
+      <w:proofErr w:type="spellStart"/>
+      <w:r>
+        <w:rPr>
+          <w:rFonts w:cs="TimesNewRomanPSMT"/>
+        </w:rPr>
+        <w:t>convention</w:t>
+      </w:r>
+      <w:proofErr w:type="gramEnd"/>
+      <w:r>
+        <w:rPr>
+          <w:rFonts w:cs="TimesNewRomanPSMT"/>
+        </w:rPr>
+        <w:t>.date_fin_conventionnement|</w:t>
+      </w:r>
+      <w:proofErr w:type="gramStart"/>
+      <w:r>
+        <w:rPr>
+          <w:rFonts w:cs="TimesNewRomanPSMT"/>
+        </w:rPr>
+        <w:t>d</w:t>
+      </w:r>
+      <w:proofErr w:type="spellEnd"/>
+      <w:r>
+        <w:rPr>
+          <w:rFonts w:cs="TimesNewRomanPSMT"/>
+        </w:rPr>
+        <w:t xml:space="preserve"> }</w:t>
+      </w:r>
+      <w:proofErr w:type="gramEnd"/>
+      <w:r>
+        <w:rPr>
+          <w:rFonts w:cs="TimesNewRomanPSMT"/>
+        </w:rPr>
+        <w:t>}</w:t>
       </w:r>
     </w:p>
     <w:p>
@@ -542,298 +1416,984 @@
       <w:r>
         <w:rPr>
           <w:rFonts w:cs="TimesNewRomanPSMT"/>
-        </w:rPr>
-        <w:t>{% if convention.programme.is_residence %}</w:t>
-      </w:r>
-      <w:r>
-        <w:rPr>
-          <w:rFonts w:cs="TimesNewRomanPSMT"/>
           <w:b/>
           <w:bCs/>
         </w:rPr>
-        <w:t xml:space="preserve">Détail </w:t>
-      </w:r>
-      <w:r>
-        <w:rPr>
-          <w:rFonts w:cs="TimesNewRomanPSMT"/>
-          <w:b/>
-          <w:bCs/>
-        </w:rPr>
-        <w:t xml:space="preserve">du type de résidence </w:t>
-      </w:r>
-      <w:r>
-        <w:rPr>
-          <w:rFonts w:cs="TimesNewRomanPSMT"/>
-          <w:b/>
-          <w:bCs/>
-        </w:rPr>
-        <w:t xml:space="preserve">: </w:t>
-      </w:r>
-      <w:r>
-        <w:rPr>
-          <w:rFonts w:cs="TimesNewRomanPSMT"/>
-        </w:rPr>
-        <w:t>{</w:t>
-      </w:r>
-      <w:r>
-        <w:rPr>
-          <w:rFonts w:cs="TimesNewRomanPSMT"/>
-        </w:rPr>
-        <w:t>{ residence</w:t>
-      </w:r>
-      <w:r>
-        <w:rPr>
-          <w:rFonts w:cs="TimesNewRomanPSMT"/>
-        </w:rPr>
-        <w:t>_attributions</w:t>
-      </w:r>
-      <w:r>
-        <w:rPr>
-          <w:rFonts w:cs="TimesNewRomanPSMT"/>
-        </w:rPr>
-        <w:t xml:space="preserve"> }}</w:t>
-      </w:r>
-      <w:r>
-        <w:rPr>
-          <w:rFonts w:cs="TimesNewRomanPSMT"/>
-        </w:rPr>
-        <w:t>{% endif %}{% if convention.programme.is_foyer %}</w:t>
-      </w:r>
-      <w:r>
-        <w:rPr>
-          <w:rFonts w:cs="TimesNewRomanPSMT"/>
-          <w:b/>
-          <w:bCs/>
-        </w:rPr>
-        <w:t>Détail</w:t>
-      </w:r>
-      <w:r>
-        <w:rPr>
-          <w:rFonts w:cs="TimesNewRomanPSMT"/>
-          <w:b/>
-          <w:bCs/>
-        </w:rPr>
-        <w:t xml:space="preserve"> du type de foyer </w:t>
-      </w:r>
-      <w:r>
-        <w:rPr>
-          <w:rFonts w:cs="TimesNewRomanPSMT"/>
-          <w:b/>
-          <w:bCs/>
-        </w:rPr>
-        <w:t xml:space="preserve">: </w:t>
-      </w:r>
+        <w:t xml:space="preserve">Type de la convention : </w:t>
+      </w:r>
+      <w:proofErr w:type="gramStart"/>
       <w:r>
         <w:rPr>
           <w:rFonts w:cs="TimesNewRomanPSMT"/>
         </w:rPr>
         <w:t xml:space="preserve">{{ </w:t>
       </w:r>
-      <w:r>
-        <w:rPr>
-          <w:rFonts w:cs="TimesNewRomanPSMT"/>
-        </w:rPr>
-        <w:t>foyer_</w:t>
-      </w:r>
-      <w:r>
-        <w:rPr>
-          <w:rFonts w:cs="TimesNewRomanPSMT"/>
-        </w:rPr>
-        <w:t>attribution</w:t>
-      </w:r>
-      <w:r>
-        <w:rPr>
-          <w:rFonts w:cs="TimesNewRomanPSMT"/>
-        </w:rPr>
-        <w:t>s</w:t>
-      </w:r>
-      <w:r>
-        <w:rPr>
-          <w:rFonts w:cs="TimesNewRomanPSMT"/>
-        </w:rPr>
-        <w:t xml:space="preserve"> }}</w:t>
-      </w:r>
-      <w:r>
-        <w:rPr>
-          <w:rFonts w:cs="TimesNewRomanPSMT"/>
-        </w:rPr>
-        <w:t>{% endif %}</w:t>
+      <w:proofErr w:type="spellStart"/>
+      <w:r>
+        <w:rPr>
+          <w:rFonts w:cs="TimesNewRomanPSMT"/>
+        </w:rPr>
+        <w:t>convention.</w:t>
+      </w:r>
+      <w:r>
+        <w:rPr>
+          <w:rFonts w:cs="TimesNewRomanPSMT"/>
+        </w:rPr>
+        <w:t>programme.</w:t>
+      </w:r>
+      <w:r>
+        <w:rPr>
+          <w:rFonts w:cs="TimesNewRomanPSMT"/>
+        </w:rPr>
+        <w:t>get</w:t>
+      </w:r>
+      <w:proofErr w:type="gramEnd"/>
+      <w:r>
+        <w:rPr>
+          <w:rFonts w:cs="TimesNewRomanPSMT"/>
+        </w:rPr>
+        <w:t>_</w:t>
+      </w:r>
+      <w:r>
+        <w:rPr>
+          <w:rFonts w:cs="TimesNewRomanPSMT"/>
+        </w:rPr>
+        <w:t>nature_logement</w:t>
+      </w:r>
+      <w:r>
+        <w:rPr>
+          <w:rFonts w:cs="TimesNewRomanPSMT"/>
+        </w:rPr>
+        <w:t>_</w:t>
+      </w:r>
+      <w:proofErr w:type="gramStart"/>
+      <w:r>
+        <w:rPr>
+          <w:rFonts w:cs="TimesNewRomanPSMT"/>
+        </w:rPr>
+        <w:t>display</w:t>
+      </w:r>
+      <w:proofErr w:type="spellEnd"/>
+      <w:r>
+        <w:rPr>
+          <w:rFonts w:cs="TimesNewRomanPSMT"/>
+        </w:rPr>
+        <w:t>()</w:t>
+      </w:r>
+      <w:r>
+        <w:rPr>
+          <w:rFonts w:cs="TimesNewRomanPSMT"/>
+        </w:rPr>
+        <w:t xml:space="preserve"> }</w:t>
+      </w:r>
+      <w:proofErr w:type="gramEnd"/>
+      <w:r>
+        <w:rPr>
+          <w:rFonts w:cs="TimesNewRomanPSMT"/>
+        </w:rPr>
+        <w:t>}</w:t>
       </w:r>
     </w:p>
     <w:p>
       <w:pPr>
         <w:rPr>
           <w:rFonts w:cs="TimesNewRomanPSMT"/>
-        </w:rPr>
-      </w:pPr>
-    </w:p>
-    <w:p>
-      <w:r>
-        <w:rPr>
-          <w:rFonts w:cs="TimesNewRomanPSMT"/>
-          <w:b/>
-          <w:bCs/>
-        </w:rPr>
-        <w:t xml:space="preserve">Date de signature de la convention APL : </w:t>
-      </w:r>
-      <w:r>
-        <w:rPr>
-          <w:rFonts w:cs="TimesNewRomanPSMT"/>
-        </w:rPr>
-        <w:t>{{ convention</w:t>
-      </w:r>
-      <w:r>
-        <w:t xml:space="preserve"> </w:t>
-      </w:r>
-      <w:r>
-        <w:rPr>
-          <w:rFonts w:cs="TimesNewRomanPSMT"/>
-        </w:rPr>
-        <w:t>.televersement_convention_signee_le|d }}</w:t>
-      </w:r>
-    </w:p>
-    <w:p>
-      <w:pPr>
-        <w:rPr>
-          <w:rFonts w:cs="TimesNewRomanPSMT"/>
-        </w:rPr>
-      </w:pPr>
-    </w:p>
-    <w:p>
-      <w:r>
-        <w:rPr>
-          <w:rFonts w:cs="TimesNewRomanPSMT"/>
-          <w:b/>
-          <w:bCs/>
-        </w:rPr>
-        <w:lastRenderedPageBreak/>
-        <w:t xml:space="preserve">Coordonnées du propriétaire : </w:t>
-      </w:r>
-      <w:r>
-        <w:rPr>
-          <w:rFonts w:cs="TimesNewRomanPSMT"/>
-        </w:rPr>
-        <w:t>{{ bailleur.nom|upper }}</w:t>
-      </w:r>
-      <w:bookmarkStart w:id="3" w:name="NomProgramme1"/>
-      <w:bookmarkEnd w:id="3"/>
-      <w:r>
-        <w:rPr>
-          <w:rFonts w:cs="TimesNewRomanPSMT"/>
-        </w:rPr>
-        <w:t>, {{ bailleur.adresse }}, {{ bailleur.code_postal }} {{ bailleur.ville }}</w:t>
-      </w:r>
-    </w:p>
-    <w:p>
-      <w:pPr>
-        <w:rPr>
-          <w:rFonts w:cs="TimesNewRomanPSMT"/>
-        </w:rPr>
-      </w:pPr>
-    </w:p>
-    <w:p>
-      <w:r>
-        <w:rPr>
-          <w:rFonts w:cs="TimesNewRomanPSMT"/>
-          <w:b/>
-          <w:bCs/>
-        </w:rPr>
-        <w:t xml:space="preserve">Coordonnées du gestionnaire : </w:t>
-      </w:r>
-      <w:r>
-        <w:rPr>
-          <w:rFonts w:cs="TimesNewRomanPSMT"/>
-        </w:rPr>
-        <w:t>{{ bailleur.nom|upper }}, {{ bailleur.adresse }}, {{ bailleur.code_postal }} {{ bailleur.ville }}</w:t>
-      </w:r>
-    </w:p>
-    <w:p>
-      <w:pPr>
-        <w:rPr>
-          <w:rFonts w:cs="TimesNewRomanPSMT"/>
-        </w:rPr>
-      </w:pPr>
-    </w:p>
-    <w:p>
-      <w:r>
-        <w:rPr>
-          <w:b/>
-          <w:bCs/>
-        </w:rPr>
-        <w:t xml:space="preserve">Nature de programme de logements : </w:t>
-      </w:r>
-      <w:r>
-        <w:rPr>
-          <w:rFonts w:cs="TimesNewRomanPSMT"/>
-        </w:rPr>
-        <w:t xml:space="preserve">{% for lot in lots %} </w:t>
-      </w:r>
-      <w:r>
-        <w:rPr>
-          <w:rFonts w:cs="TimesNewRomanPSMT"/>
-        </w:rPr>
-        <w:t>{{ lot.financement }}</w:t>
-      </w:r>
-      <w:r>
-        <w:rPr>
-          <w:rFonts w:cs="TimesNewRomanPSMT"/>
-        </w:rPr>
-        <w:t xml:space="preserve"> : </w:t>
-      </w:r>
-      <w:r>
-        <w:t>{{ lot.get_type_habitat_advanced_display(lot.nb_logements) }}</w:t>
-      </w:r>
-      <w:bookmarkStart w:id="4" w:name="Fi4"/>
-      <w:bookmarkEnd w:id="4"/>
-      <w:r>
-        <w:rPr>
-          <w:rFonts w:cs="TimesNewRomanPSMT"/>
-        </w:rPr>
-        <w:t>{% if not loop.last %}, {% endif %}{% endfor %}</w:t>
-      </w:r>
-    </w:p>
-    <w:p>
-      <w:pPr>
-        <w:rPr>
-          <w:b/>
-          <w:bCs/>
         </w:rPr>
       </w:pPr>
     </w:p>
     <w:p>
       <w:pPr>
         <w:rPr>
-          <w:lang w:val="en-US"/>
+          <w:rFonts w:cs="TimesNewRomanPSMT"/>
         </w:rPr>
       </w:pPr>
       <w:r>
         <w:rPr>
+          <w:rFonts w:cs="TimesNewRomanPSMT"/>
+        </w:rPr>
+        <w:t xml:space="preserve">{% if </w:t>
+      </w:r>
+      <w:proofErr w:type="spellStart"/>
+      <w:r>
+        <w:rPr>
+          <w:rFonts w:cs="TimesNewRomanPSMT"/>
+        </w:rPr>
+        <w:t>convention.programme.is_residence</w:t>
+      </w:r>
+      <w:proofErr w:type="spellEnd"/>
+      <w:r>
+        <w:rPr>
+          <w:rFonts w:cs="TimesNewRomanPSMT"/>
+        </w:rPr>
+        <w:t xml:space="preserve"> </w:t>
+      </w:r>
+      <w:proofErr w:type="gramStart"/>
+      <w:r>
+        <w:rPr>
+          <w:rFonts w:cs="TimesNewRomanPSMT"/>
+        </w:rPr>
+        <w:t>%}</w:t>
+      </w:r>
+      <w:r>
+        <w:rPr>
+          <w:rFonts w:cs="TimesNewRomanPSMT"/>
           <w:b/>
           <w:bCs/>
-          <w:lang w:val="en-US"/>
-        </w:rPr>
-        <w:t>Nature l’opération :</w:t>
-      </w:r>
-      <w:r>
-        <w:rPr>
-          <w:lang w:val="en-US"/>
-        </w:rPr>
-        <w:t xml:space="preserve">  {{ programme.get_type_operation_advanced_display() }}</w:t>
+        </w:rPr>
+        <w:t>Détail</w:t>
+      </w:r>
+      <w:proofErr w:type="gramEnd"/>
+      <w:r>
+        <w:rPr>
+          <w:rFonts w:cs="TimesNewRomanPSMT"/>
+          <w:b/>
+          <w:bCs/>
+        </w:rPr>
+        <w:t xml:space="preserve"> </w:t>
+      </w:r>
+      <w:r>
+        <w:rPr>
+          <w:rFonts w:cs="TimesNewRomanPSMT"/>
+          <w:b/>
+          <w:bCs/>
+        </w:rPr>
+        <w:t xml:space="preserve">du type de résidence </w:t>
+      </w:r>
+      <w:r>
+        <w:rPr>
+          <w:rFonts w:cs="TimesNewRomanPSMT"/>
+          <w:b/>
+          <w:bCs/>
+        </w:rPr>
+        <w:t xml:space="preserve">: </w:t>
+      </w:r>
+      <w:proofErr w:type="gramStart"/>
+      <w:r>
+        <w:rPr>
+          <w:rFonts w:cs="TimesNewRomanPSMT"/>
+        </w:rPr>
+        <w:t>{</w:t>
+      </w:r>
+      <w:r>
+        <w:rPr>
+          <w:rFonts w:cs="TimesNewRomanPSMT"/>
+        </w:rPr>
+        <w:t xml:space="preserve">{ </w:t>
+      </w:r>
+      <w:proofErr w:type="spellStart"/>
+      <w:r>
+        <w:rPr>
+          <w:rFonts w:cs="TimesNewRomanPSMT"/>
+        </w:rPr>
+        <w:t>residence</w:t>
+      </w:r>
+      <w:proofErr w:type="gramEnd"/>
+      <w:r>
+        <w:rPr>
+          <w:rFonts w:cs="TimesNewRomanPSMT"/>
+        </w:rPr>
+        <w:t>_</w:t>
+      </w:r>
+      <w:proofErr w:type="gramStart"/>
+      <w:r>
+        <w:rPr>
+          <w:rFonts w:cs="TimesNewRomanPSMT"/>
+        </w:rPr>
+        <w:t>attributions</w:t>
+      </w:r>
+      <w:proofErr w:type="spellEnd"/>
+      <w:r>
+        <w:rPr>
+          <w:rFonts w:cs="TimesNewRomanPSMT"/>
+        </w:rPr>
+        <w:t xml:space="preserve"> }}</w:t>
+      </w:r>
+      <w:r>
+        <w:rPr>
+          <w:rFonts w:cs="TimesNewRomanPSMT"/>
+        </w:rPr>
+        <w:t>{</w:t>
+      </w:r>
+      <w:proofErr w:type="gramEnd"/>
+      <w:r>
+        <w:rPr>
+          <w:rFonts w:cs="TimesNewRomanPSMT"/>
+        </w:rPr>
+        <w:t xml:space="preserve">% </w:t>
+      </w:r>
+      <w:proofErr w:type="spellStart"/>
+      <w:r>
+        <w:rPr>
+          <w:rFonts w:cs="TimesNewRomanPSMT"/>
+        </w:rPr>
+        <w:t>endif</w:t>
+      </w:r>
+      <w:proofErr w:type="spellEnd"/>
+      <w:r>
+        <w:rPr>
+          <w:rFonts w:cs="TimesNewRomanPSMT"/>
+        </w:rPr>
+        <w:t xml:space="preserve"> </w:t>
+      </w:r>
+      <w:proofErr w:type="gramStart"/>
+      <w:r>
+        <w:rPr>
+          <w:rFonts w:cs="TimesNewRomanPSMT"/>
+        </w:rPr>
+        <w:t>%}{</w:t>
+      </w:r>
+      <w:proofErr w:type="gramEnd"/>
+      <w:r>
+        <w:rPr>
+          <w:rFonts w:cs="TimesNewRomanPSMT"/>
+        </w:rPr>
+        <w:t xml:space="preserve">% if </w:t>
+      </w:r>
+      <w:proofErr w:type="spellStart"/>
+      <w:r>
+        <w:rPr>
+          <w:rFonts w:cs="TimesNewRomanPSMT"/>
+        </w:rPr>
+        <w:t>convention.programme.is_foyer</w:t>
+      </w:r>
+      <w:proofErr w:type="spellEnd"/>
+      <w:r>
+        <w:rPr>
+          <w:rFonts w:cs="TimesNewRomanPSMT"/>
+        </w:rPr>
+        <w:t xml:space="preserve"> </w:t>
+      </w:r>
+      <w:proofErr w:type="gramStart"/>
+      <w:r>
+        <w:rPr>
+          <w:rFonts w:cs="TimesNewRomanPSMT"/>
+        </w:rPr>
+        <w:t>%}</w:t>
+      </w:r>
+      <w:r>
+        <w:rPr>
+          <w:rFonts w:cs="TimesNewRomanPSMT"/>
+          <w:b/>
+          <w:bCs/>
+        </w:rPr>
+        <w:t>Détail</w:t>
+      </w:r>
+      <w:proofErr w:type="gramEnd"/>
+      <w:r>
+        <w:rPr>
+          <w:rFonts w:cs="TimesNewRomanPSMT"/>
+          <w:b/>
+          <w:bCs/>
+        </w:rPr>
+        <w:t xml:space="preserve"> du type de foyer </w:t>
+      </w:r>
+      <w:r>
+        <w:rPr>
+          <w:rFonts w:cs="TimesNewRomanPSMT"/>
+          <w:b/>
+          <w:bCs/>
+        </w:rPr>
+        <w:t xml:space="preserve">: </w:t>
+      </w:r>
+      <w:proofErr w:type="gramStart"/>
+      <w:r>
+        <w:rPr>
+          <w:rFonts w:cs="TimesNewRomanPSMT"/>
+        </w:rPr>
+        <w:t xml:space="preserve">{{ </w:t>
+      </w:r>
+      <w:proofErr w:type="spellStart"/>
+      <w:r>
+        <w:rPr>
+          <w:rFonts w:cs="TimesNewRomanPSMT"/>
+        </w:rPr>
+        <w:t>foyer</w:t>
+      </w:r>
+      <w:proofErr w:type="gramEnd"/>
+      <w:r>
+        <w:rPr>
+          <w:rFonts w:cs="TimesNewRomanPSMT"/>
+        </w:rPr>
+        <w:t>_</w:t>
+      </w:r>
+      <w:proofErr w:type="gramStart"/>
+      <w:r>
+        <w:rPr>
+          <w:rFonts w:cs="TimesNewRomanPSMT"/>
+        </w:rPr>
+        <w:t>attribution</w:t>
+      </w:r>
+      <w:r>
+        <w:rPr>
+          <w:rFonts w:cs="TimesNewRomanPSMT"/>
+        </w:rPr>
+        <w:t>s</w:t>
+      </w:r>
+      <w:proofErr w:type="spellEnd"/>
+      <w:r>
+        <w:rPr>
+          <w:rFonts w:cs="TimesNewRomanPSMT"/>
+        </w:rPr>
+        <w:t xml:space="preserve"> }}</w:t>
+      </w:r>
+      <w:r>
+        <w:rPr>
+          <w:rFonts w:cs="TimesNewRomanPSMT"/>
+        </w:rPr>
+        <w:t>{</w:t>
+      </w:r>
+      <w:proofErr w:type="gramEnd"/>
+      <w:r>
+        <w:rPr>
+          <w:rFonts w:cs="TimesNewRomanPSMT"/>
+        </w:rPr>
+        <w:t xml:space="preserve">% </w:t>
+      </w:r>
+      <w:proofErr w:type="spellStart"/>
+      <w:r>
+        <w:rPr>
+          <w:rFonts w:cs="TimesNewRomanPSMT"/>
+        </w:rPr>
+        <w:t>endif</w:t>
+      </w:r>
+      <w:proofErr w:type="spellEnd"/>
+      <w:r>
+        <w:rPr>
+          <w:rFonts w:cs="TimesNewRomanPSMT"/>
+        </w:rPr>
+        <w:t xml:space="preserve"> %}</w:t>
       </w:r>
     </w:p>
     <w:p>
       <w:pPr>
         <w:rPr>
+          <w:rFonts w:cs="TimesNewRomanPSMT"/>
+        </w:rPr>
+      </w:pPr>
+    </w:p>
+    <w:p>
+      <w:r>
+        <w:rPr>
+          <w:rFonts w:cs="TimesNewRomanPSMT"/>
           <w:b/>
           <w:bCs/>
-          <w:lang w:val="en-US"/>
+        </w:rPr>
+        <w:t xml:space="preserve">Date de signature de la convention APL : </w:t>
+      </w:r>
+      <w:proofErr w:type="gramStart"/>
+      <w:r>
+        <w:rPr>
+          <w:rFonts w:cs="TimesNewRomanPSMT"/>
+        </w:rPr>
+        <w:t>{{ convention</w:t>
+      </w:r>
+      <w:r>
+        <w:t xml:space="preserve"> </w:t>
+      </w:r>
+      <w:r>
+        <w:rPr>
+          <w:rFonts w:cs="TimesNewRomanPSMT"/>
+        </w:rPr>
+        <w:t>.</w:t>
+      </w:r>
+      <w:proofErr w:type="spellStart"/>
+      <w:r>
+        <w:rPr>
+          <w:rFonts w:cs="TimesNewRomanPSMT"/>
+        </w:rPr>
+        <w:t>televersement</w:t>
+      </w:r>
+      <w:proofErr w:type="gramEnd"/>
+      <w:r>
+        <w:rPr>
+          <w:rFonts w:cs="TimesNewRomanPSMT"/>
+        </w:rPr>
+        <w:t>_convention_signee_le|</w:t>
+      </w:r>
+      <w:proofErr w:type="gramStart"/>
+      <w:r>
+        <w:rPr>
+          <w:rFonts w:cs="TimesNewRomanPSMT"/>
+        </w:rPr>
+        <w:t>d</w:t>
+      </w:r>
+      <w:proofErr w:type="spellEnd"/>
+      <w:r>
+        <w:rPr>
+          <w:rFonts w:cs="TimesNewRomanPSMT"/>
+        </w:rPr>
+        <w:t xml:space="preserve"> }</w:t>
+      </w:r>
+      <w:proofErr w:type="gramEnd"/>
+      <w:r>
+        <w:rPr>
+          <w:rFonts w:cs="TimesNewRomanPSMT"/>
+        </w:rPr>
+        <w:t>}</w:t>
+      </w:r>
+    </w:p>
+    <w:p>
+      <w:pPr>
+        <w:rPr>
+          <w:rFonts w:cs="TimesNewRomanPSMT"/>
+        </w:rPr>
+      </w:pPr>
+    </w:p>
+    <w:p>
+      <w:r>
+        <w:rPr>
+          <w:rFonts w:cs="TimesNewRomanPSMT"/>
+          <w:b/>
+          <w:bCs/>
+        </w:rPr>
+        <w:t xml:space="preserve">Coordonnées du propriétaire : </w:t>
+      </w:r>
+      <w:proofErr w:type="gramStart"/>
+      <w:r>
+        <w:rPr>
+          <w:rFonts w:cs="TimesNewRomanPSMT"/>
+        </w:rPr>
+        <w:t xml:space="preserve">{{ </w:t>
+      </w:r>
+      <w:proofErr w:type="spellStart"/>
+      <w:r>
+        <w:rPr>
+          <w:rFonts w:cs="TimesNewRomanPSMT"/>
+        </w:rPr>
+        <w:t>bailleur.nom</w:t>
+      </w:r>
+      <w:proofErr w:type="gramEnd"/>
+      <w:r>
+        <w:rPr>
+          <w:rFonts w:cs="TimesNewRomanPSMT"/>
+        </w:rPr>
+        <w:t>|</w:t>
+      </w:r>
+      <w:proofErr w:type="gramStart"/>
+      <w:r>
+        <w:rPr>
+          <w:rFonts w:cs="TimesNewRomanPSMT"/>
+        </w:rPr>
+        <w:t>upper</w:t>
+      </w:r>
+      <w:proofErr w:type="spellEnd"/>
+      <w:r>
+        <w:rPr>
+          <w:rFonts w:cs="TimesNewRomanPSMT"/>
+        </w:rPr>
+        <w:t xml:space="preserve"> }</w:t>
+      </w:r>
+      <w:proofErr w:type="gramEnd"/>
+      <w:r>
+        <w:rPr>
+          <w:rFonts w:cs="TimesNewRomanPSMT"/>
+        </w:rPr>
+        <w:t>}</w:t>
+      </w:r>
+      <w:bookmarkStart w:id="1" w:name="NomProgramme1"/>
+      <w:bookmarkEnd w:id="1"/>
+      <w:r>
+        <w:rPr>
+          <w:rFonts w:cs="TimesNewRomanPSMT"/>
+        </w:rPr>
+        <w:t xml:space="preserve">, </w:t>
+      </w:r>
+      <w:proofErr w:type="gramStart"/>
+      <w:r>
+        <w:rPr>
+          <w:rFonts w:cs="TimesNewRomanPSMT"/>
+        </w:rPr>
+        <w:t xml:space="preserve">{{ </w:t>
+      </w:r>
+      <w:proofErr w:type="spellStart"/>
+      <w:r>
+        <w:rPr>
+          <w:rFonts w:cs="TimesNewRomanPSMT"/>
+        </w:rPr>
+        <w:t>bailleur</w:t>
+      </w:r>
+      <w:proofErr w:type="gramEnd"/>
+      <w:r>
+        <w:rPr>
+          <w:rFonts w:cs="TimesNewRomanPSMT"/>
+        </w:rPr>
+        <w:t>.</w:t>
+      </w:r>
+      <w:proofErr w:type="gramStart"/>
+      <w:r>
+        <w:rPr>
+          <w:rFonts w:cs="TimesNewRomanPSMT"/>
+        </w:rPr>
+        <w:t>adresse</w:t>
+      </w:r>
+      <w:proofErr w:type="spellEnd"/>
+      <w:r>
+        <w:rPr>
+          <w:rFonts w:cs="TimesNewRomanPSMT"/>
+        </w:rPr>
+        <w:t xml:space="preserve"> }</w:t>
+      </w:r>
+      <w:proofErr w:type="gramEnd"/>
+      <w:r>
+        <w:rPr>
+          <w:rFonts w:cs="TimesNewRomanPSMT"/>
+        </w:rPr>
+        <w:t xml:space="preserve">}, </w:t>
+      </w:r>
+      <w:proofErr w:type="gramStart"/>
+      <w:r>
+        <w:rPr>
+          <w:rFonts w:cs="TimesNewRomanPSMT"/>
+        </w:rPr>
+        <w:t xml:space="preserve">{{ </w:t>
+      </w:r>
+      <w:proofErr w:type="spellStart"/>
+      <w:r>
+        <w:rPr>
+          <w:rFonts w:cs="TimesNewRomanPSMT"/>
+        </w:rPr>
+        <w:t>bailleur</w:t>
+      </w:r>
+      <w:proofErr w:type="gramEnd"/>
+      <w:r>
+        <w:rPr>
+          <w:rFonts w:cs="TimesNewRomanPSMT"/>
+        </w:rPr>
+        <w:t>.code_</w:t>
+      </w:r>
+      <w:proofErr w:type="gramStart"/>
+      <w:r>
+        <w:rPr>
+          <w:rFonts w:cs="TimesNewRomanPSMT"/>
+        </w:rPr>
+        <w:t>postal</w:t>
+      </w:r>
+      <w:proofErr w:type="spellEnd"/>
+      <w:r>
+        <w:rPr>
+          <w:rFonts w:cs="TimesNewRomanPSMT"/>
+        </w:rPr>
+        <w:t xml:space="preserve"> }</w:t>
+      </w:r>
+      <w:proofErr w:type="gramEnd"/>
+      <w:r>
+        <w:rPr>
+          <w:rFonts w:cs="TimesNewRomanPSMT"/>
+        </w:rPr>
+        <w:t xml:space="preserve">} </w:t>
+      </w:r>
+      <w:proofErr w:type="gramStart"/>
+      <w:r>
+        <w:rPr>
+          <w:rFonts w:cs="TimesNewRomanPSMT"/>
+        </w:rPr>
+        <w:t xml:space="preserve">{{ </w:t>
+      </w:r>
+      <w:proofErr w:type="spellStart"/>
+      <w:r>
+        <w:rPr>
+          <w:rFonts w:cs="TimesNewRomanPSMT"/>
+        </w:rPr>
+        <w:t>bailleur</w:t>
+      </w:r>
+      <w:proofErr w:type="gramEnd"/>
+      <w:r>
+        <w:rPr>
+          <w:rFonts w:cs="TimesNewRomanPSMT"/>
+        </w:rPr>
+        <w:t>.</w:t>
+      </w:r>
+      <w:proofErr w:type="gramStart"/>
+      <w:r>
+        <w:rPr>
+          <w:rFonts w:cs="TimesNewRomanPSMT"/>
+        </w:rPr>
+        <w:t>ville</w:t>
+      </w:r>
+      <w:proofErr w:type="spellEnd"/>
+      <w:r>
+        <w:rPr>
+          <w:rFonts w:cs="TimesNewRomanPSMT"/>
+        </w:rPr>
+        <w:t xml:space="preserve"> }</w:t>
+      </w:r>
+      <w:proofErr w:type="gramEnd"/>
+      <w:r>
+        <w:rPr>
+          <w:rFonts w:cs="TimesNewRomanPSMT"/>
+        </w:rPr>
+        <w:t>}</w:t>
+      </w:r>
+    </w:p>
+    <w:p>
+      <w:pPr>
+        <w:rPr>
+          <w:rFonts w:cs="TimesNewRomanPSMT"/>
+        </w:rPr>
+      </w:pPr>
+    </w:p>
+    <w:p>
+      <w:r>
+        <w:rPr>
+          <w:rFonts w:cs="TimesNewRomanPSMT"/>
+          <w:b/>
+          <w:bCs/>
+        </w:rPr>
+        <w:t xml:space="preserve">Coordonnées du gestionnaire : </w:t>
+      </w:r>
+      <w:proofErr w:type="gramStart"/>
+      <w:r>
+        <w:rPr>
+          <w:rFonts w:cs="TimesNewRomanPSMT"/>
+        </w:rPr>
+        <w:t xml:space="preserve">{{ </w:t>
+      </w:r>
+      <w:proofErr w:type="spellStart"/>
+      <w:r>
+        <w:rPr>
+          <w:rFonts w:cs="TimesNewRomanPSMT"/>
+        </w:rPr>
+        <w:t>bailleur.nom</w:t>
+      </w:r>
+      <w:proofErr w:type="gramEnd"/>
+      <w:r>
+        <w:rPr>
+          <w:rFonts w:cs="TimesNewRomanPSMT"/>
+        </w:rPr>
+        <w:t>|</w:t>
+      </w:r>
+      <w:proofErr w:type="gramStart"/>
+      <w:r>
+        <w:rPr>
+          <w:rFonts w:cs="TimesNewRomanPSMT"/>
+        </w:rPr>
+        <w:t>upper</w:t>
+      </w:r>
+      <w:proofErr w:type="spellEnd"/>
+      <w:r>
+        <w:rPr>
+          <w:rFonts w:cs="TimesNewRomanPSMT"/>
+        </w:rPr>
+        <w:t xml:space="preserve"> }</w:t>
+      </w:r>
+      <w:proofErr w:type="gramEnd"/>
+      <w:r>
+        <w:rPr>
+          <w:rFonts w:cs="TimesNewRomanPSMT"/>
+        </w:rPr>
+        <w:t xml:space="preserve">}, </w:t>
+      </w:r>
+      <w:proofErr w:type="gramStart"/>
+      <w:r>
+        <w:rPr>
+          <w:rFonts w:cs="TimesNewRomanPSMT"/>
+        </w:rPr>
+        <w:t xml:space="preserve">{{ </w:t>
+      </w:r>
+      <w:proofErr w:type="spellStart"/>
+      <w:r>
+        <w:rPr>
+          <w:rFonts w:cs="TimesNewRomanPSMT"/>
+        </w:rPr>
+        <w:t>bailleur</w:t>
+      </w:r>
+      <w:proofErr w:type="gramEnd"/>
+      <w:r>
+        <w:rPr>
+          <w:rFonts w:cs="TimesNewRomanPSMT"/>
+        </w:rPr>
+        <w:t>.</w:t>
+      </w:r>
+      <w:proofErr w:type="gramStart"/>
+      <w:r>
+        <w:rPr>
+          <w:rFonts w:cs="TimesNewRomanPSMT"/>
+        </w:rPr>
+        <w:t>adresse</w:t>
+      </w:r>
+      <w:proofErr w:type="spellEnd"/>
+      <w:r>
+        <w:rPr>
+          <w:rFonts w:cs="TimesNewRomanPSMT"/>
+        </w:rPr>
+        <w:t xml:space="preserve"> }</w:t>
+      </w:r>
+      <w:proofErr w:type="gramEnd"/>
+      <w:r>
+        <w:rPr>
+          <w:rFonts w:cs="TimesNewRomanPSMT"/>
+        </w:rPr>
+        <w:t xml:space="preserve">}, </w:t>
+      </w:r>
+      <w:proofErr w:type="gramStart"/>
+      <w:r>
+        <w:rPr>
+          <w:rFonts w:cs="TimesNewRomanPSMT"/>
+        </w:rPr>
+        <w:t xml:space="preserve">{{ </w:t>
+      </w:r>
+      <w:proofErr w:type="spellStart"/>
+      <w:r>
+        <w:rPr>
+          <w:rFonts w:cs="TimesNewRomanPSMT"/>
+        </w:rPr>
+        <w:t>bailleur</w:t>
+      </w:r>
+      <w:proofErr w:type="gramEnd"/>
+      <w:r>
+        <w:rPr>
+          <w:rFonts w:cs="TimesNewRomanPSMT"/>
+        </w:rPr>
+        <w:t>.code_</w:t>
+      </w:r>
+      <w:proofErr w:type="gramStart"/>
+      <w:r>
+        <w:rPr>
+          <w:rFonts w:cs="TimesNewRomanPSMT"/>
+        </w:rPr>
+        <w:t>postal</w:t>
+      </w:r>
+      <w:proofErr w:type="spellEnd"/>
+      <w:r>
+        <w:rPr>
+          <w:rFonts w:cs="TimesNewRomanPSMT"/>
+        </w:rPr>
+        <w:t xml:space="preserve"> }</w:t>
+      </w:r>
+      <w:proofErr w:type="gramEnd"/>
+      <w:r>
+        <w:rPr>
+          <w:rFonts w:cs="TimesNewRomanPSMT"/>
+        </w:rPr>
+        <w:t xml:space="preserve">} </w:t>
+      </w:r>
+      <w:proofErr w:type="gramStart"/>
+      <w:r>
+        <w:rPr>
+          <w:rFonts w:cs="TimesNewRomanPSMT"/>
+        </w:rPr>
+        <w:t xml:space="preserve">{{ </w:t>
+      </w:r>
+      <w:proofErr w:type="spellStart"/>
+      <w:r>
+        <w:rPr>
+          <w:rFonts w:cs="TimesNewRomanPSMT"/>
+        </w:rPr>
+        <w:t>bailleur</w:t>
+      </w:r>
+      <w:proofErr w:type="gramEnd"/>
+      <w:r>
+        <w:rPr>
+          <w:rFonts w:cs="TimesNewRomanPSMT"/>
+        </w:rPr>
+        <w:t>.</w:t>
+      </w:r>
+      <w:proofErr w:type="gramStart"/>
+      <w:r>
+        <w:rPr>
+          <w:rFonts w:cs="TimesNewRomanPSMT"/>
+        </w:rPr>
+        <w:t>ville</w:t>
+      </w:r>
+      <w:proofErr w:type="spellEnd"/>
+      <w:r>
+        <w:rPr>
+          <w:rFonts w:cs="TimesNewRomanPSMT"/>
+        </w:rPr>
+        <w:t xml:space="preserve"> }</w:t>
+      </w:r>
+      <w:proofErr w:type="gramEnd"/>
+      <w:r>
+        <w:rPr>
+          <w:rFonts w:cs="TimesNewRomanPSMT"/>
+        </w:rPr>
+        <w:t>}</w:t>
+      </w:r>
+    </w:p>
+    <w:p>
+      <w:pPr>
+        <w:rPr>
+          <w:rFonts w:cs="TimesNewRomanPSMT"/>
+        </w:rPr>
+      </w:pPr>
+    </w:p>
+    <w:p>
+      <w:r>
+        <w:rPr>
+          <w:b/>
+          <w:bCs/>
+        </w:rPr>
+        <w:t xml:space="preserve">Nature de programme de logements : </w:t>
+      </w:r>
+      <w:r>
+        <w:rPr>
+          <w:rFonts w:cs="TimesNewRomanPSMT"/>
+        </w:rPr>
+        <w:t xml:space="preserve">{% for lot in lots %} </w:t>
+      </w:r>
+      <w:proofErr w:type="gramStart"/>
+      <w:r>
+        <w:rPr>
+          <w:rFonts w:cs="TimesNewRomanPSMT"/>
+        </w:rPr>
+        <w:t xml:space="preserve">{{ </w:t>
+      </w:r>
+      <w:proofErr w:type="spellStart"/>
+      <w:r>
+        <w:rPr>
+          <w:rFonts w:cs="TimesNewRomanPSMT"/>
+        </w:rPr>
+        <w:t>lot</w:t>
+      </w:r>
+      <w:proofErr w:type="gramEnd"/>
+      <w:r>
+        <w:rPr>
+          <w:rFonts w:cs="TimesNewRomanPSMT"/>
+        </w:rPr>
+        <w:t>.</w:t>
+      </w:r>
+      <w:proofErr w:type="gramStart"/>
+      <w:r>
+        <w:rPr>
+          <w:rFonts w:cs="TimesNewRomanPSMT"/>
+        </w:rPr>
+        <w:t>financement</w:t>
+      </w:r>
+      <w:proofErr w:type="spellEnd"/>
+      <w:r>
+        <w:rPr>
+          <w:rFonts w:cs="TimesNewRomanPSMT"/>
+        </w:rPr>
+        <w:t xml:space="preserve"> }</w:t>
+      </w:r>
+      <w:proofErr w:type="gramEnd"/>
+      <w:r>
+        <w:rPr>
+          <w:rFonts w:cs="TimesNewRomanPSMT"/>
+        </w:rPr>
+        <w:t>}</w:t>
+      </w:r>
+      <w:r>
+        <w:rPr>
+          <w:rFonts w:cs="TimesNewRomanPSMT"/>
+        </w:rPr>
+        <w:t xml:space="preserve"> : </w:t>
+      </w:r>
+      <w:proofErr w:type="gramStart"/>
+      <w:r>
+        <w:t xml:space="preserve">{{ </w:t>
+      </w:r>
+      <w:proofErr w:type="spellStart"/>
+      <w:r>
+        <w:t>lot.get</w:t>
+      </w:r>
+      <w:proofErr w:type="gramEnd"/>
+      <w:r>
+        <w:t>_type_habitat_advanced_display</w:t>
+      </w:r>
+      <w:proofErr w:type="spellEnd"/>
+      <w:r>
+        <w:t>(</w:t>
+      </w:r>
+      <w:proofErr w:type="spellStart"/>
+      <w:proofErr w:type="gramStart"/>
+      <w:r>
+        <w:t>lot.nb</w:t>
+      </w:r>
+      <w:proofErr w:type="gramEnd"/>
+      <w:r>
+        <w:t>_logements</w:t>
+      </w:r>
+      <w:proofErr w:type="spellEnd"/>
+      <w:proofErr w:type="gramStart"/>
+      <w:r>
+        <w:t>) }}</w:t>
+      </w:r>
+      <w:bookmarkStart w:id="2" w:name="Fi4"/>
+      <w:bookmarkEnd w:id="2"/>
+      <w:r>
+        <w:rPr>
+          <w:rFonts w:cs="TimesNewRomanPSMT"/>
+        </w:rPr>
+        <w:t>{</w:t>
+      </w:r>
+      <w:proofErr w:type="gramEnd"/>
+      <w:r>
+        <w:rPr>
+          <w:rFonts w:cs="TimesNewRomanPSMT"/>
+        </w:rPr>
+        <w:t xml:space="preserve">% if not </w:t>
+      </w:r>
+      <w:proofErr w:type="spellStart"/>
+      <w:proofErr w:type="gramStart"/>
+      <w:r>
+        <w:rPr>
+          <w:rFonts w:cs="TimesNewRomanPSMT"/>
+        </w:rPr>
+        <w:t>loop.last</w:t>
+      </w:r>
+      <w:proofErr w:type="spellEnd"/>
+      <w:proofErr w:type="gramEnd"/>
+      <w:r>
+        <w:rPr>
+          <w:rFonts w:cs="TimesNewRomanPSMT"/>
+        </w:rPr>
+        <w:t xml:space="preserve"> %}, {% </w:t>
+      </w:r>
+      <w:proofErr w:type="spellStart"/>
+      <w:r>
+        <w:rPr>
+          <w:rFonts w:cs="TimesNewRomanPSMT"/>
+        </w:rPr>
+        <w:t>endif</w:t>
+      </w:r>
+      <w:proofErr w:type="spellEnd"/>
+      <w:r>
+        <w:rPr>
+          <w:rFonts w:cs="TimesNewRomanPSMT"/>
+        </w:rPr>
+        <w:t xml:space="preserve"> </w:t>
+      </w:r>
+      <w:proofErr w:type="gramStart"/>
+      <w:r>
+        <w:rPr>
+          <w:rFonts w:cs="TimesNewRomanPSMT"/>
+        </w:rPr>
+        <w:t>%}{</w:t>
+      </w:r>
+      <w:proofErr w:type="gramEnd"/>
+      <w:r>
+        <w:rPr>
+          <w:rFonts w:cs="TimesNewRomanPSMT"/>
+        </w:rPr>
+        <w:t xml:space="preserve">% </w:t>
+      </w:r>
+      <w:proofErr w:type="spellStart"/>
+      <w:r>
+        <w:rPr>
+          <w:rFonts w:cs="TimesNewRomanPSMT"/>
+        </w:rPr>
+        <w:t>endfor</w:t>
+      </w:r>
+      <w:proofErr w:type="spellEnd"/>
+      <w:r>
+        <w:rPr>
+          <w:rFonts w:cs="TimesNewRomanPSMT"/>
+        </w:rPr>
+        <w:t xml:space="preserve"> %}</w:t>
+      </w:r>
+    </w:p>
+    <w:p>
+      <w:pPr>
+        <w:rPr>
+          <w:b/>
+          <w:bCs/>
         </w:rPr>
       </w:pPr>
     </w:p>
     <w:p>
       <w:pPr>
         <w:rPr>
-          <w:rFonts w:cs="TimesNewRomanPSMT"/>
           <w:lang w:val="en-US"/>
         </w:rPr>
       </w:pPr>
@@ -843,22 +2403,75 @@
           <w:bCs/>
           <w:lang w:val="en-US"/>
         </w:rPr>
-        <w:t xml:space="preserve">Nombre de logements : </w:t>
-      </w:r>
-      <w:r>
-        <w:rPr>
-          <w:rFonts w:cs="TimesNewRomanPSMT"/>
-          <w:lang w:val="en-US"/>
-        </w:rPr>
-        <w:t>{% for lot in lots %} {{ lot.financement }} : {{lot.nb_logements}}{% if not loop.last %}, {% endif %}{% endfor %}</w:t>
-      </w:r>
-      <w:r>
-        <w:rPr>
-          <w:rFonts w:cs="TimesNewRomanPSMT"/>
+        <w:t xml:space="preserve">Nature </w:t>
+      </w:r>
+      <w:proofErr w:type="spellStart"/>
+      <w:proofErr w:type="gramStart"/>
+      <w:r>
+        <w:rPr>
+          <w:b/>
           <w:bCs/>
           <w:lang w:val="en-US"/>
         </w:rPr>
-        <w:t>.</w:t>
+        <w:t>l’opération</w:t>
+      </w:r>
+      <w:proofErr w:type="spellEnd"/>
+      <w:r>
+        <w:rPr>
+          <w:b/>
+          <w:bCs/>
+          <w:lang w:val="en-US"/>
+        </w:rPr>
+        <w:t> :</w:t>
+      </w:r>
+      <w:proofErr w:type="gramEnd"/>
+      <w:r>
+        <w:rPr>
+          <w:lang w:val="en-US"/>
+        </w:rPr>
+        <w:t xml:space="preserve">  </w:t>
+      </w:r>
+      <w:proofErr w:type="gramStart"/>
+      <w:r>
+        <w:rPr>
+          <w:lang w:val="en-US"/>
+        </w:rPr>
+        <w:t xml:space="preserve">{{ </w:t>
+      </w:r>
+      <w:proofErr w:type="spellStart"/>
+      <w:r>
+        <w:rPr>
+          <w:lang w:val="en-US"/>
+        </w:rPr>
+        <w:t>programme.get</w:t>
+      </w:r>
+      <w:proofErr w:type="gramEnd"/>
+      <w:r>
+        <w:rPr>
+          <w:lang w:val="en-US"/>
+        </w:rPr>
+        <w:t>_type_operation_advanced_</w:t>
+      </w:r>
+      <w:proofErr w:type="gramStart"/>
+      <w:r>
+        <w:rPr>
+          <w:lang w:val="en-US"/>
+        </w:rPr>
+        <w:t>display</w:t>
+      </w:r>
+      <w:proofErr w:type="spellEnd"/>
+      <w:r>
+        <w:rPr>
+          <w:lang w:val="en-US"/>
+        </w:rPr>
+        <w:t>() }</w:t>
+      </w:r>
+      <w:proofErr w:type="gramEnd"/>
+      <w:r>
+        <w:rPr>
+          <w:lang w:val="en-US"/>
+        </w:rPr>
+        <w:t>}</w:t>
       </w:r>
     </w:p>
     <w:p>
@@ -871,15 +2484,241 @@
       </w:pPr>
     </w:p>
     <w:p>
+      <w:pPr>
+        <w:rPr>
+          <w:rFonts w:cs="TimesNewRomanPSMT"/>
+          <w:lang w:val="en-US"/>
+        </w:rPr>
+      </w:pPr>
       <w:r>
         <w:rPr>
           <w:b/>
           <w:bCs/>
+          <w:lang w:val="en-US"/>
+        </w:rPr>
+        <w:t xml:space="preserve">Nombre de </w:t>
+      </w:r>
+      <w:proofErr w:type="spellStart"/>
+      <w:proofErr w:type="gramStart"/>
+      <w:r>
+        <w:rPr>
+          <w:b/>
+          <w:bCs/>
+          <w:lang w:val="en-US"/>
+        </w:rPr>
+        <w:t>logements</w:t>
+      </w:r>
+      <w:proofErr w:type="spellEnd"/>
+      <w:r>
+        <w:rPr>
+          <w:b/>
+          <w:bCs/>
+          <w:lang w:val="en-US"/>
+        </w:rPr>
+        <w:t> :</w:t>
+      </w:r>
+      <w:proofErr w:type="gramEnd"/>
+      <w:r>
+        <w:rPr>
+          <w:b/>
+          <w:bCs/>
+          <w:lang w:val="en-US"/>
+        </w:rPr>
+        <w:t xml:space="preserve"> </w:t>
+      </w:r>
+      <w:r>
+        <w:rPr>
+          <w:rFonts w:cs="TimesNewRomanPSMT"/>
+          <w:lang w:val="en-US"/>
+        </w:rPr>
+        <w:t xml:space="preserve">{% for lot in lots %} </w:t>
+      </w:r>
+      <w:proofErr w:type="gramStart"/>
+      <w:r>
+        <w:rPr>
+          <w:rFonts w:cs="TimesNewRomanPSMT"/>
+          <w:lang w:val="en-US"/>
+        </w:rPr>
+        <w:t xml:space="preserve">{{ </w:t>
+      </w:r>
+      <w:proofErr w:type="spellStart"/>
+      <w:r>
+        <w:rPr>
+          <w:rFonts w:cs="TimesNewRomanPSMT"/>
+          <w:lang w:val="en-US"/>
+        </w:rPr>
+        <w:t>lot</w:t>
+      </w:r>
+      <w:proofErr w:type="gramEnd"/>
+      <w:r>
+        <w:rPr>
+          <w:rFonts w:cs="TimesNewRomanPSMT"/>
+          <w:lang w:val="en-US"/>
+        </w:rPr>
+        <w:t>.</w:t>
+      </w:r>
+      <w:proofErr w:type="gramStart"/>
+      <w:r>
+        <w:rPr>
+          <w:rFonts w:cs="TimesNewRomanPSMT"/>
+          <w:lang w:val="en-US"/>
+        </w:rPr>
+        <w:t>financement</w:t>
+      </w:r>
+      <w:proofErr w:type="spellEnd"/>
+      <w:r>
+        <w:rPr>
+          <w:rFonts w:cs="TimesNewRomanPSMT"/>
+          <w:lang w:val="en-US"/>
+        </w:rPr>
+        <w:t xml:space="preserve"> }</w:t>
+      </w:r>
+      <w:proofErr w:type="gramEnd"/>
+      <w:r>
+        <w:rPr>
+          <w:rFonts w:cs="TimesNewRomanPSMT"/>
+          <w:lang w:val="en-US"/>
+        </w:rPr>
+        <w:t>} : {{</w:t>
+      </w:r>
+      <w:proofErr w:type="spellStart"/>
+      <w:proofErr w:type="gramStart"/>
+      <w:r>
+        <w:rPr>
+          <w:rFonts w:cs="TimesNewRomanPSMT"/>
+          <w:lang w:val="en-US"/>
+        </w:rPr>
+        <w:t>lot.nb</w:t>
+      </w:r>
+      <w:proofErr w:type="gramEnd"/>
+      <w:r>
+        <w:rPr>
+          <w:rFonts w:cs="TimesNewRomanPSMT"/>
+          <w:lang w:val="en-US"/>
+        </w:rPr>
+        <w:t>_logements</w:t>
+      </w:r>
+      <w:proofErr w:type="spellEnd"/>
+      <w:proofErr w:type="gramStart"/>
+      <w:r>
+        <w:rPr>
+          <w:rFonts w:cs="TimesNewRomanPSMT"/>
+          <w:lang w:val="en-US"/>
+        </w:rPr>
+        <w:t>}}{</w:t>
+      </w:r>
+      <w:proofErr w:type="gramEnd"/>
+      <w:r>
+        <w:rPr>
+          <w:rFonts w:cs="TimesNewRomanPSMT"/>
+          <w:lang w:val="en-US"/>
+        </w:rPr>
+        <w:t xml:space="preserve">% if not </w:t>
+      </w:r>
+      <w:proofErr w:type="spellStart"/>
+      <w:proofErr w:type="gramStart"/>
+      <w:r>
+        <w:rPr>
+          <w:rFonts w:cs="TimesNewRomanPSMT"/>
+          <w:lang w:val="en-US"/>
+        </w:rPr>
+        <w:t>loop.last</w:t>
+      </w:r>
+      <w:proofErr w:type="spellEnd"/>
+      <w:proofErr w:type="gramEnd"/>
+      <w:r>
+        <w:rPr>
+          <w:rFonts w:cs="TimesNewRomanPSMT"/>
+          <w:lang w:val="en-US"/>
+        </w:rPr>
+        <w:t xml:space="preserve"> %}</w:t>
+      </w:r>
+      <w:proofErr w:type="gramStart"/>
+      <w:r>
+        <w:rPr>
+          <w:rFonts w:cs="TimesNewRomanPSMT"/>
+          <w:lang w:val="en-US"/>
+        </w:rPr>
+        <w:t>, {%</w:t>
+      </w:r>
+      <w:proofErr w:type="gramEnd"/>
+      <w:r>
+        <w:rPr>
+          <w:rFonts w:cs="TimesNewRomanPSMT"/>
+          <w:lang w:val="en-US"/>
+        </w:rPr>
+        <w:t xml:space="preserve"> endif </w:t>
+      </w:r>
+      <w:proofErr w:type="gramStart"/>
+      <w:r>
+        <w:rPr>
+          <w:rFonts w:cs="TimesNewRomanPSMT"/>
+          <w:lang w:val="en-US"/>
+        </w:rPr>
+        <w:t>%}{</w:t>
+      </w:r>
+      <w:proofErr w:type="gramEnd"/>
+      <w:r>
+        <w:rPr>
+          <w:rFonts w:cs="TimesNewRomanPSMT"/>
+          <w:lang w:val="en-US"/>
+        </w:rPr>
+        <w:t xml:space="preserve">% </w:t>
+      </w:r>
+      <w:proofErr w:type="spellStart"/>
+      <w:proofErr w:type="gramStart"/>
+      <w:r>
+        <w:rPr>
+          <w:rFonts w:cs="TimesNewRomanPSMT"/>
+          <w:lang w:val="en-US"/>
+        </w:rPr>
+        <w:t>endfor</w:t>
+      </w:r>
+      <w:proofErr w:type="spellEnd"/>
+      <w:r>
+        <w:rPr>
+          <w:rFonts w:cs="TimesNewRomanPSMT"/>
+          <w:lang w:val="en-US"/>
+        </w:rPr>
+        <w:t xml:space="preserve"> %}</w:t>
+      </w:r>
+      <w:proofErr w:type="gramEnd"/>
+      <w:r>
+        <w:rPr>
+          <w:rFonts w:cs="TimesNewRomanPSMT"/>
+          <w:bCs/>
+          <w:lang w:val="en-US"/>
+        </w:rPr>
+        <w:t>.</w:t>
+      </w:r>
+    </w:p>
+    <w:p>
+      <w:pPr>
+        <w:rPr>
+          <w:b/>
+          <w:bCs/>
+          <w:lang w:val="en-US"/>
+        </w:rPr>
+      </w:pPr>
+    </w:p>
+    <w:p>
+      <w:r>
+        <w:rPr>
+          <w:b/>
+          <w:bCs/>
         </w:rPr>
         <w:t xml:space="preserve">Surface utile totale : </w:t>
       </w:r>
       <w:r>
-        <w:t>{{su_totale|f}}</w:t>
+        <w:t>{{</w:t>
+      </w:r>
+      <w:proofErr w:type="spellStart"/>
+      <w:r>
+        <w:t>su_totale|f</w:t>
+      </w:r>
+      <w:proofErr w:type="spellEnd"/>
+      <w:r>
+        <w:t>}}</w:t>
       </w:r>
     </w:p>
     <w:p/>
@@ -894,19 +2733,193 @@
           <w:b/>
           <w:bCs/>
         </w:rPr>
-        <w:t>{% if programme.is_foyer or programme.is_residence %}Redevance{% else %}Loyer{% endif %} maximum mensuel :</w:t>
-      </w:r>
-      <w:r>
-        <w:rPr>
-          <w:rFonts w:cs="TimesNewRomanPSMT"/>
-        </w:rPr>
-        <w:t xml:space="preserve"> {% for lot in lots %} {{ lot.financement }} : {{lot._get_loyer_par_metre_carre()}}</w:t>
-      </w:r>
-      <w:r>
-        <w:rPr>
-          <w:rFonts w:cs="TimesNewRomanPSMT"/>
+        <w:t xml:space="preserve">{% if </w:t>
+      </w:r>
+      <w:proofErr w:type="spellStart"/>
+      <w:r>
+        <w:rPr>
+          <w:b/>
           <w:bCs/>
         </w:rPr>
+        <w:t>programme.is_foyer</w:t>
+      </w:r>
+      <w:proofErr w:type="spellEnd"/>
+      <w:r>
+        <w:rPr>
+          <w:b/>
+          <w:bCs/>
+        </w:rPr>
+        <w:t xml:space="preserve"> or </w:t>
+      </w:r>
+      <w:proofErr w:type="spellStart"/>
+      <w:r>
+        <w:rPr>
+          <w:b/>
+          <w:bCs/>
+        </w:rPr>
+        <w:t>programme.is_residence</w:t>
+      </w:r>
+      <w:proofErr w:type="spellEnd"/>
+      <w:r>
+        <w:rPr>
+          <w:b/>
+          <w:bCs/>
+        </w:rPr>
+        <w:t xml:space="preserve"> </w:t>
+      </w:r>
+      <w:proofErr w:type="gramStart"/>
+      <w:r>
+        <w:rPr>
+          <w:b/>
+          <w:bCs/>
+        </w:rPr>
+        <w:t>%}Redevance</w:t>
+      </w:r>
+      <w:proofErr w:type="gramEnd"/>
+      <w:r>
+        <w:rPr>
+          <w:b/>
+          <w:bCs/>
+        </w:rPr>
+        <w:t xml:space="preserve">{% </w:t>
+      </w:r>
+      <w:proofErr w:type="spellStart"/>
+      <w:r>
+        <w:rPr>
+          <w:b/>
+          <w:bCs/>
+        </w:rPr>
+        <w:t>else</w:t>
+      </w:r>
+      <w:proofErr w:type="spellEnd"/>
+      <w:r>
+        <w:rPr>
+          <w:b/>
+          <w:bCs/>
+        </w:rPr>
+        <w:t xml:space="preserve"> </w:t>
+      </w:r>
+      <w:proofErr w:type="gramStart"/>
+      <w:r>
+        <w:rPr>
+          <w:b/>
+          <w:bCs/>
+        </w:rPr>
+        <w:t>%}Loyer</w:t>
+      </w:r>
+      <w:proofErr w:type="gramEnd"/>
+      <w:r>
+        <w:rPr>
+          <w:b/>
+          <w:bCs/>
+        </w:rPr>
+        <w:t xml:space="preserve">{% </w:t>
+      </w:r>
+      <w:proofErr w:type="spellStart"/>
+      <w:r>
+        <w:rPr>
+          <w:b/>
+          <w:bCs/>
+        </w:rPr>
+        <w:t>endif</w:t>
+      </w:r>
+      <w:proofErr w:type="spellEnd"/>
+      <w:r>
+        <w:rPr>
+          <w:b/>
+          <w:bCs/>
+        </w:rPr>
+        <w:t xml:space="preserve"> %} maximum mensuel :</w:t>
+      </w:r>
+      <w:r>
+        <w:rPr>
+          <w:rFonts w:cs="TimesNewRomanPSMT"/>
+        </w:rPr>
+        <w:t xml:space="preserve"> {% for lot in lots %} </w:t>
+      </w:r>
+      <w:proofErr w:type="gramStart"/>
+      <w:r>
+        <w:rPr>
+          <w:rFonts w:cs="TimesNewRomanPSMT"/>
+        </w:rPr>
+        <w:t xml:space="preserve">{{ </w:t>
+      </w:r>
+      <w:proofErr w:type="spellStart"/>
+      <w:r>
+        <w:rPr>
+          <w:rFonts w:cs="TimesNewRomanPSMT"/>
+        </w:rPr>
+        <w:t>lot</w:t>
+      </w:r>
+      <w:proofErr w:type="gramEnd"/>
+      <w:r>
+        <w:rPr>
+          <w:rFonts w:cs="TimesNewRomanPSMT"/>
+        </w:rPr>
+        <w:t>.</w:t>
+      </w:r>
+      <w:proofErr w:type="gramStart"/>
+      <w:r>
+        <w:rPr>
+          <w:rFonts w:cs="TimesNewRomanPSMT"/>
+        </w:rPr>
+        <w:t>financement</w:t>
+      </w:r>
+      <w:proofErr w:type="spellEnd"/>
+      <w:r>
+        <w:rPr>
+          <w:rFonts w:cs="TimesNewRomanPSMT"/>
+        </w:rPr>
+        <w:t xml:space="preserve"> }</w:t>
+      </w:r>
+      <w:proofErr w:type="gramEnd"/>
+      <w:r>
+        <w:rPr>
+          <w:rFonts w:cs="TimesNewRomanPSMT"/>
+        </w:rPr>
+        <w:t>} : {{</w:t>
+      </w:r>
+      <w:proofErr w:type="gramStart"/>
+      <w:r>
+        <w:rPr>
+          <w:rFonts w:cs="TimesNewRomanPSMT"/>
+        </w:rPr>
+        <w:t>lot._</w:t>
+      </w:r>
+      <w:proofErr w:type="spellStart"/>
+      <w:proofErr w:type="gramEnd"/>
+      <w:r>
+        <w:rPr>
+          <w:rFonts w:cs="TimesNewRomanPSMT"/>
+        </w:rPr>
+        <w:t>get_loyer_par_metre_</w:t>
+      </w:r>
+      <w:proofErr w:type="gramStart"/>
+      <w:r>
+        <w:rPr>
+          <w:rFonts w:cs="TimesNewRomanPSMT"/>
+        </w:rPr>
+        <w:t>carre</w:t>
+      </w:r>
+      <w:proofErr w:type="spellEnd"/>
+      <w:r>
+        <w:rPr>
+          <w:rFonts w:cs="TimesNewRomanPSMT"/>
+        </w:rPr>
+        <w:t>(</w:t>
+      </w:r>
+      <w:proofErr w:type="gramEnd"/>
+      <w:r>
+        <w:rPr>
+          <w:rFonts w:cs="TimesNewRomanPSMT"/>
+        </w:rPr>
+        <w:t>)}}</w:t>
+      </w:r>
+      <w:r>
+        <w:rPr>
+          <w:rFonts w:cs="TimesNewRomanPSMT"/>
+          <w:bCs/>
+        </w:rPr>
         <w:t xml:space="preserve"> € le mètre carré par mois</w:t>
       </w:r>
       <w:r>
@@ -919,7 +2932,65 @@
         <w:rPr>
           <w:rFonts w:cs="TimesNewRomanPSMT"/>
         </w:rPr>
-        <w:t>{% if not loop.last %}, {% endif %}{% endfor %}</w:t>
+        <w:t xml:space="preserve">{% if not </w:t>
+      </w:r>
+      <w:proofErr w:type="spellStart"/>
+      <w:proofErr w:type="gramStart"/>
+      <w:r>
+        <w:rPr>
+          <w:rFonts w:cs="TimesNewRomanPSMT"/>
+        </w:rPr>
+        <w:t>loop.last</w:t>
+      </w:r>
+      <w:proofErr w:type="spellEnd"/>
+      <w:proofErr w:type="gramEnd"/>
+      <w:r>
+        <w:rPr>
+          <w:rFonts w:cs="TimesNewRomanPSMT"/>
+        </w:rPr>
+        <w:t xml:space="preserve"> %}, {% </w:t>
+      </w:r>
+      <w:proofErr w:type="spellStart"/>
+      <w:r>
+        <w:rPr>
+          <w:rFonts w:cs="TimesNewRomanPSMT"/>
+        </w:rPr>
+        <w:t>endif</w:t>
+      </w:r>
+      <w:proofErr w:type="spellEnd"/>
+      <w:r>
+        <w:rPr>
+          <w:rFonts w:cs="TimesNewRomanPSMT"/>
+        </w:rPr>
+        <w:t xml:space="preserve"> </w:t>
+      </w:r>
+      <w:proofErr w:type="gramStart"/>
+      <w:r>
+        <w:rPr>
+          <w:rFonts w:cs="TimesNewRomanPSMT"/>
+        </w:rPr>
+        <w:t>%}{</w:t>
+      </w:r>
+      <w:proofErr w:type="gramEnd"/>
+      <w:r>
+        <w:rPr>
+          <w:rFonts w:cs="TimesNewRomanPSMT"/>
+        </w:rPr>
+        <w:t xml:space="preserve">% </w:t>
+      </w:r>
+      <w:proofErr w:type="spellStart"/>
+      <w:r>
+        <w:rPr>
+          <w:rFonts w:cs="TimesNewRomanPSMT"/>
+        </w:rPr>
+        <w:t>endfor</w:t>
+      </w:r>
+      <w:proofErr w:type="spellEnd"/>
+      <w:r>
+        <w:rPr>
+          <w:rFonts w:cs="TimesNewRomanPSMT"/>
+        </w:rPr>
+        <w:t xml:space="preserve"> %}</w:t>
       </w:r>
       <w:r>
         <w:rPr>
@@ -1021,7 +3092,45 @@
               <w:rPr>
                 <w:lang w:val="en-US"/>
               </w:rPr>
-              <w:t>{%tr for k,v in nb_logements_par_type.items() %}</w:t>
+              <w:t xml:space="preserve">{%tr for </w:t>
+            </w:r>
+            <w:proofErr w:type="spellStart"/>
+            <w:proofErr w:type="gramStart"/>
+            <w:r>
+              <w:rPr>
+                <w:lang w:val="en-US"/>
+              </w:rPr>
+              <w:t>k,v</w:t>
+            </w:r>
+            <w:proofErr w:type="spellEnd"/>
+            <w:proofErr w:type="gramEnd"/>
+            <w:r>
+              <w:rPr>
+                <w:lang w:val="en-US"/>
+              </w:rPr>
+              <w:t xml:space="preserve"> in </w:t>
+            </w:r>
+            <w:proofErr w:type="spellStart"/>
+            <w:r>
+              <w:rPr>
+                <w:lang w:val="en-US"/>
+              </w:rPr>
+              <w:t>nb_logements_par_</w:t>
+            </w:r>
+            <w:proofErr w:type="gramStart"/>
+            <w:r>
+              <w:rPr>
+                <w:lang w:val="en-US"/>
+              </w:rPr>
+              <w:t>type.items</w:t>
+            </w:r>
+            <w:proofErr w:type="spellEnd"/>
+            <w:proofErr w:type="gramEnd"/>
+            <w:r>
+              <w:rPr>
+                <w:lang w:val="en-US"/>
+              </w:rPr>
+              <w:t>() %}</w:t>
             </w:r>
           </w:p>
         </w:tc>
@@ -1077,7 +3186,15 @@
               </w:rPr>
             </w:pPr>
             <w:r>
-              <w:t>{%tr endfor %}</w:t>
+              <w:t xml:space="preserve">{%tr </w:t>
+            </w:r>
+            <w:proofErr w:type="spellStart"/>
+            <w:r>
+              <w:t>endfor</w:t>
+            </w:r>
+            <w:proofErr w:type="spellEnd"/>
+            <w:r>
+              <w:t xml:space="preserve"> %}</w:t>
             </w:r>
           </w:p>
         </w:tc>

</xml_diff>

<commit_message>
fix : ajout condition convention.adresse operation sur FicheCAF-template.docx (#2141)
Ajout d'une condition pour inclure le fait que si l'adresse de la convention est différente de l'adresse du programme alors on privilégie l'adresse de la convention.
</commit_message>
<xml_diff>
--- a/documents/FicheCAF-template.docx
+++ b/documents/FicheCAF-template.docx
@@ -17,7 +17,71 @@
           <w:sz w:val="28"/>
           <w:szCs w:val="28"/>
         </w:rPr>
-        <w:t>{% if convention.is_resiliation -%} Résiliation de la convention n° {{ convention.parent.numero }}</w:t>
+        <w:t xml:space="preserve">{% if </w:t>
+      </w:r>
+      <w:proofErr w:type="spellStart"/>
+      <w:r>
+        <w:rPr>
+          <w:b/>
+          <w:sz w:val="28"/>
+          <w:szCs w:val="28"/>
+        </w:rPr>
+        <w:t>convention.is_resiliation</w:t>
+      </w:r>
+      <w:proofErr w:type="spellEnd"/>
+      <w:r>
+        <w:rPr>
+          <w:b/>
+          <w:sz w:val="28"/>
+          <w:szCs w:val="28"/>
+        </w:rPr>
+        <w:t xml:space="preserve"> -%} Résiliation de la convention n° </w:t>
+      </w:r>
+      <w:proofErr w:type="gramStart"/>
+      <w:r>
+        <w:rPr>
+          <w:b/>
+          <w:sz w:val="28"/>
+          <w:szCs w:val="28"/>
+        </w:rPr>
+        <w:t xml:space="preserve">{{ </w:t>
+      </w:r>
+      <w:proofErr w:type="spellStart"/>
+      <w:r>
+        <w:rPr>
+          <w:b/>
+          <w:sz w:val="28"/>
+          <w:szCs w:val="28"/>
+        </w:rPr>
+        <w:t>convention</w:t>
+      </w:r>
+      <w:proofErr w:type="gramEnd"/>
+      <w:r>
+        <w:rPr>
+          <w:b/>
+          <w:sz w:val="28"/>
+          <w:szCs w:val="28"/>
+        </w:rPr>
+        <w:t>.</w:t>
+      </w:r>
+      <w:proofErr w:type="gramStart"/>
+      <w:r>
+        <w:rPr>
+          <w:b/>
+          <w:sz w:val="28"/>
+          <w:szCs w:val="28"/>
+        </w:rPr>
+        <w:t>parent.numero</w:t>
+      </w:r>
+      <w:proofErr w:type="spellEnd"/>
+      <w:proofErr w:type="gramEnd"/>
+      <w:r>
+        <w:rPr>
+          <w:b/>
+          <w:sz w:val="28"/>
+          <w:szCs w:val="28"/>
+        </w:rPr>
+        <w:t xml:space="preserve"> }}</w:t>
       </w:r>
     </w:p>
     <w:p>
@@ -34,7 +98,89 @@
           <w:sz w:val="28"/>
           <w:szCs w:val="28"/>
         </w:rPr>
-        <w:t>{% elif convention.is_denonciation -%} Dénonciation à la convention n° {{ convention.parent.numero }}</w:t>
+        <w:t xml:space="preserve">{% </w:t>
+      </w:r>
+      <w:proofErr w:type="spellStart"/>
+      <w:r>
+        <w:rPr>
+          <w:b/>
+          <w:sz w:val="28"/>
+          <w:szCs w:val="28"/>
+        </w:rPr>
+        <w:t>elif</w:t>
+      </w:r>
+      <w:proofErr w:type="spellEnd"/>
+      <w:r>
+        <w:rPr>
+          <w:b/>
+          <w:sz w:val="28"/>
+          <w:szCs w:val="28"/>
+        </w:rPr>
+        <w:t xml:space="preserve"> </w:t>
+      </w:r>
+      <w:proofErr w:type="spellStart"/>
+      <w:r>
+        <w:rPr>
+          <w:b/>
+          <w:sz w:val="28"/>
+          <w:szCs w:val="28"/>
+        </w:rPr>
+        <w:t>convention.is_denonciation</w:t>
+      </w:r>
+      <w:proofErr w:type="spellEnd"/>
+      <w:r>
+        <w:rPr>
+          <w:b/>
+          <w:sz w:val="28"/>
+          <w:szCs w:val="28"/>
+        </w:rPr>
+        <w:t xml:space="preserve"> -%} Dénonciation à la convention n° </w:t>
+      </w:r>
+      <w:proofErr w:type="gramStart"/>
+      <w:r>
+        <w:rPr>
+          <w:b/>
+          <w:sz w:val="28"/>
+          <w:szCs w:val="28"/>
+        </w:rPr>
+        <w:t xml:space="preserve">{{ </w:t>
+      </w:r>
+      <w:proofErr w:type="spellStart"/>
+      <w:r>
+        <w:rPr>
+          <w:b/>
+          <w:sz w:val="28"/>
+          <w:szCs w:val="28"/>
+        </w:rPr>
+        <w:t>convention</w:t>
+      </w:r>
+      <w:proofErr w:type="gramEnd"/>
+      <w:r>
+        <w:rPr>
+          <w:b/>
+          <w:sz w:val="28"/>
+          <w:szCs w:val="28"/>
+        </w:rPr>
+        <w:t>.</w:t>
+      </w:r>
+      <w:proofErr w:type="gramStart"/>
+      <w:r>
+        <w:rPr>
+          <w:b/>
+          <w:sz w:val="28"/>
+          <w:szCs w:val="28"/>
+        </w:rPr>
+        <w:t>parent.numero</w:t>
+      </w:r>
+      <w:proofErr w:type="spellEnd"/>
+      <w:proofErr w:type="gramEnd"/>
+      <w:r>
+        <w:rPr>
+          <w:b/>
+          <w:sz w:val="28"/>
+          <w:szCs w:val="28"/>
+        </w:rPr>
+        <w:t xml:space="preserve"> }}</w:t>
       </w:r>
     </w:p>
     <w:p>
@@ -51,7 +197,61 @@
           <w:sz w:val="28"/>
           <w:szCs w:val="28"/>
         </w:rPr>
-        <w:t>{% elif convention.is_avenant() -%}</w:t>
+        <w:t xml:space="preserve">{% </w:t>
+      </w:r>
+      <w:proofErr w:type="spellStart"/>
+      <w:r>
+        <w:rPr>
+          <w:b/>
+          <w:sz w:val="28"/>
+          <w:szCs w:val="28"/>
+        </w:rPr>
+        <w:t>elif</w:t>
+      </w:r>
+      <w:proofErr w:type="spellEnd"/>
+      <w:r>
+        <w:rPr>
+          <w:b/>
+          <w:sz w:val="28"/>
+          <w:szCs w:val="28"/>
+        </w:rPr>
+        <w:t xml:space="preserve"> </w:t>
+      </w:r>
+      <w:proofErr w:type="spellStart"/>
+      <w:r>
+        <w:rPr>
+          <w:b/>
+          <w:sz w:val="28"/>
+          <w:szCs w:val="28"/>
+        </w:rPr>
+        <w:t>convention.is_</w:t>
+      </w:r>
+      <w:proofErr w:type="gramStart"/>
+      <w:r>
+        <w:rPr>
+          <w:b/>
+          <w:sz w:val="28"/>
+          <w:szCs w:val="28"/>
+        </w:rPr>
+        <w:t>avenant</w:t>
+      </w:r>
+      <w:proofErr w:type="spellEnd"/>
+      <w:r>
+        <w:rPr>
+          <w:b/>
+          <w:sz w:val="28"/>
+          <w:szCs w:val="28"/>
+        </w:rPr>
+        <w:t>(</w:t>
+      </w:r>
+      <w:proofErr w:type="gramEnd"/>
+      <w:r>
+        <w:rPr>
+          <w:b/>
+          <w:sz w:val="28"/>
+          <w:szCs w:val="28"/>
+        </w:rPr>
+        <w:t>) -%}</w:t>
       </w:r>
     </w:p>
     <w:p>
@@ -68,7 +268,73 @@
           <w:sz w:val="28"/>
           <w:szCs w:val="28"/>
         </w:rPr>
-        <w:t>Avenant n° {{convention.numero}} à la convention n° {{ convention.parent.numero }}</w:t>
+        <w:t>Avenant n° {{</w:t>
+      </w:r>
+      <w:proofErr w:type="spellStart"/>
+      <w:proofErr w:type="gramStart"/>
+      <w:r>
+        <w:rPr>
+          <w:b/>
+          <w:sz w:val="28"/>
+          <w:szCs w:val="28"/>
+        </w:rPr>
+        <w:t>convention.numero</w:t>
+      </w:r>
+      <w:proofErr w:type="spellEnd"/>
+      <w:proofErr w:type="gramEnd"/>
+      <w:r>
+        <w:rPr>
+          <w:b/>
+          <w:sz w:val="28"/>
+          <w:szCs w:val="28"/>
+        </w:rPr>
+        <w:t xml:space="preserve">}} à la convention n° </w:t>
+      </w:r>
+      <w:proofErr w:type="gramStart"/>
+      <w:r>
+        <w:rPr>
+          <w:b/>
+          <w:sz w:val="28"/>
+          <w:szCs w:val="28"/>
+        </w:rPr>
+        <w:t xml:space="preserve">{{ </w:t>
+      </w:r>
+      <w:proofErr w:type="spellStart"/>
+      <w:r>
+        <w:rPr>
+          <w:b/>
+          <w:sz w:val="28"/>
+          <w:szCs w:val="28"/>
+        </w:rPr>
+        <w:t>convention</w:t>
+      </w:r>
+      <w:proofErr w:type="gramEnd"/>
+      <w:r>
+        <w:rPr>
+          <w:b/>
+          <w:sz w:val="28"/>
+          <w:szCs w:val="28"/>
+        </w:rPr>
+        <w:t>.</w:t>
+      </w:r>
+      <w:proofErr w:type="gramStart"/>
+      <w:r>
+        <w:rPr>
+          <w:b/>
+          <w:sz w:val="28"/>
+          <w:szCs w:val="28"/>
+        </w:rPr>
+        <w:t>parent.numero</w:t>
+      </w:r>
+      <w:proofErr w:type="spellEnd"/>
+      <w:proofErr w:type="gramEnd"/>
+      <w:r>
+        <w:rPr>
+          <w:b/>
+          <w:sz w:val="28"/>
+          <w:szCs w:val="28"/>
+        </w:rPr>
+        <w:t xml:space="preserve"> }}</w:t>
       </w:r>
     </w:p>
     <w:p>
@@ -85,7 +351,25 @@
           <w:sz w:val="28"/>
           <w:szCs w:val="28"/>
         </w:rPr>
-        <w:t>{%- else -%}</w:t>
+        <w:t xml:space="preserve">{%- </w:t>
+      </w:r>
+      <w:proofErr w:type="spellStart"/>
+      <w:r>
+        <w:rPr>
+          <w:b/>
+          <w:sz w:val="28"/>
+          <w:szCs w:val="28"/>
+        </w:rPr>
+        <w:t>else</w:t>
+      </w:r>
+      <w:proofErr w:type="spellEnd"/>
+      <w:r>
+        <w:rPr>
+          <w:b/>
+          <w:sz w:val="28"/>
+          <w:szCs w:val="28"/>
+        </w:rPr>
+        <w:t xml:space="preserve"> -%}</w:t>
       </w:r>
     </w:p>
     <w:p>
@@ -102,7 +386,43 @@
           <w:sz w:val="28"/>
           <w:szCs w:val="28"/>
         </w:rPr>
-        <w:t>Convention n° {{ convention.numero}}</w:t>
+        <w:t xml:space="preserve">Convention n° </w:t>
+      </w:r>
+      <w:proofErr w:type="gramStart"/>
+      <w:r>
+        <w:rPr>
+          <w:b/>
+          <w:sz w:val="28"/>
+          <w:szCs w:val="28"/>
+        </w:rPr>
+        <w:t xml:space="preserve">{{ </w:t>
+      </w:r>
+      <w:proofErr w:type="spellStart"/>
+      <w:r>
+        <w:rPr>
+          <w:b/>
+          <w:sz w:val="28"/>
+          <w:szCs w:val="28"/>
+        </w:rPr>
+        <w:t>convention</w:t>
+      </w:r>
+      <w:proofErr w:type="gramEnd"/>
+      <w:r>
+        <w:rPr>
+          <w:b/>
+          <w:sz w:val="28"/>
+          <w:szCs w:val="28"/>
+        </w:rPr>
+        <w:t>.numero</w:t>
+      </w:r>
+      <w:proofErr w:type="spellEnd"/>
+      <w:r>
+        <w:rPr>
+          <w:b/>
+          <w:sz w:val="28"/>
+          <w:szCs w:val="28"/>
+        </w:rPr>
+        <w:t>}}</w:t>
       </w:r>
     </w:p>
     <w:p>
@@ -119,7 +439,25 @@
           <w:sz w:val="28"/>
           <w:szCs w:val="28"/>
         </w:rPr>
-        <w:t>{%- endif %}</w:t>
+        <w:t xml:space="preserve">{%- </w:t>
+      </w:r>
+      <w:proofErr w:type="spellStart"/>
+      <w:r>
+        <w:rPr>
+          <w:b/>
+          <w:sz w:val="28"/>
+          <w:szCs w:val="28"/>
+        </w:rPr>
+        <w:t>endif</w:t>
+      </w:r>
+      <w:proofErr w:type="spellEnd"/>
+      <w:r>
+        <w:rPr>
+          <w:b/>
+          <w:sz w:val="28"/>
+          <w:szCs w:val="28"/>
+        </w:rPr>
+        <w:t xml:space="preserve"> %}</w:t>
       </w:r>
     </w:p>
     <w:p>
@@ -136,7 +474,61 @@
           <w:sz w:val="28"/>
           <w:szCs w:val="28"/>
         </w:rPr>
-        <w:t xml:space="preserve">{% if  convention.date_resiliation  %} </w:t>
+        <w:t xml:space="preserve">{% </w:t>
+      </w:r>
+      <w:proofErr w:type="gramStart"/>
+      <w:r>
+        <w:rPr>
+          <w:b/>
+          <w:sz w:val="28"/>
+          <w:szCs w:val="28"/>
+        </w:rPr>
+        <w:t xml:space="preserve">if  </w:t>
+      </w:r>
+      <w:proofErr w:type="spellStart"/>
+      <w:r>
+        <w:rPr>
+          <w:b/>
+          <w:sz w:val="28"/>
+          <w:szCs w:val="28"/>
+        </w:rPr>
+        <w:t>convention</w:t>
+      </w:r>
+      <w:proofErr w:type="gramEnd"/>
+      <w:r>
+        <w:rPr>
+          <w:b/>
+          <w:sz w:val="28"/>
+          <w:szCs w:val="28"/>
+        </w:rPr>
+        <w:t>.date_</w:t>
+      </w:r>
+      <w:proofErr w:type="gramStart"/>
+      <w:r>
+        <w:rPr>
+          <w:b/>
+          <w:sz w:val="28"/>
+          <w:szCs w:val="28"/>
+        </w:rPr>
+        <w:t>resiliation</w:t>
+      </w:r>
+      <w:proofErr w:type="spellEnd"/>
+      <w:r>
+        <w:rPr>
+          <w:b/>
+          <w:sz w:val="28"/>
+          <w:szCs w:val="28"/>
+        </w:rPr>
+        <w:t xml:space="preserve">  %</w:t>
+      </w:r>
+      <w:proofErr w:type="gramEnd"/>
+      <w:r>
+        <w:rPr>
+          <w:b/>
+          <w:sz w:val="28"/>
+          <w:szCs w:val="28"/>
+        </w:rPr>
+        <w:t xml:space="preserve">} </w:t>
       </w:r>
     </w:p>
     <w:tbl>
@@ -184,7 +576,35 @@
                 <w:sz w:val="28"/>
                 <w:szCs w:val="28"/>
               </w:rPr>
-              <w:t xml:space="preserve">La convention et ses avenants sont résiliés à partir du {{convention.date_resiliation|d}} </w:t>
+              <w:t>La convention et ses avenants sont résiliés à partir du {{</w:t>
+            </w:r>
+            <w:proofErr w:type="spellStart"/>
+            <w:proofErr w:type="gramStart"/>
+            <w:r>
+              <w:rPr>
+                <w:b/>
+                <w:sz w:val="28"/>
+                <w:szCs w:val="28"/>
+              </w:rPr>
+              <w:t>convention.date</w:t>
+            </w:r>
+            <w:proofErr w:type="gramEnd"/>
+            <w:r>
+              <w:rPr>
+                <w:b/>
+                <w:sz w:val="28"/>
+                <w:szCs w:val="28"/>
+              </w:rPr>
+              <w:t>_resiliation|d</w:t>
+            </w:r>
+            <w:proofErr w:type="spellEnd"/>
+            <w:r>
+              <w:rPr>
+                <w:b/>
+                <w:sz w:val="28"/>
+                <w:szCs w:val="28"/>
+              </w:rPr>
+              <w:t xml:space="preserve">}} </w:t>
             </w:r>
           </w:p>
         </w:tc>
@@ -204,7 +624,71 @@
           <w:sz w:val="28"/>
           <w:szCs w:val="28"/>
         </w:rPr>
-        <w:t xml:space="preserve">{% elif  convention.date_denonciation  %} </w:t>
+        <w:t xml:space="preserve">{% </w:t>
+      </w:r>
+      <w:proofErr w:type="spellStart"/>
+      <w:proofErr w:type="gramStart"/>
+      <w:r>
+        <w:rPr>
+          <w:b/>
+          <w:sz w:val="28"/>
+          <w:szCs w:val="28"/>
+        </w:rPr>
+        <w:t>elif</w:t>
+      </w:r>
+      <w:proofErr w:type="spellEnd"/>
+      <w:r>
+        <w:rPr>
+          <w:b/>
+          <w:sz w:val="28"/>
+          <w:szCs w:val="28"/>
+        </w:rPr>
+        <w:t xml:space="preserve">  </w:t>
+      </w:r>
+      <w:proofErr w:type="spellStart"/>
+      <w:r>
+        <w:rPr>
+          <w:b/>
+          <w:sz w:val="28"/>
+          <w:szCs w:val="28"/>
+        </w:rPr>
+        <w:t>convention</w:t>
+      </w:r>
+      <w:proofErr w:type="gramEnd"/>
+      <w:r>
+        <w:rPr>
+          <w:b/>
+          <w:sz w:val="28"/>
+          <w:szCs w:val="28"/>
+        </w:rPr>
+        <w:t>.date_</w:t>
+      </w:r>
+      <w:proofErr w:type="gramStart"/>
+      <w:r>
+        <w:rPr>
+          <w:b/>
+          <w:sz w:val="28"/>
+          <w:szCs w:val="28"/>
+        </w:rPr>
+        <w:t>denonciation</w:t>
+      </w:r>
+      <w:proofErr w:type="spellEnd"/>
+      <w:r>
+        <w:rPr>
+          <w:b/>
+          <w:sz w:val="28"/>
+          <w:szCs w:val="28"/>
+        </w:rPr>
+        <w:t xml:space="preserve">  %</w:t>
+      </w:r>
+      <w:proofErr w:type="gramEnd"/>
+      <w:r>
+        <w:rPr>
+          <w:b/>
+          <w:sz w:val="28"/>
+          <w:szCs w:val="28"/>
+        </w:rPr>
+        <w:t xml:space="preserve">} </w:t>
       </w:r>
     </w:p>
     <w:tbl>
@@ -252,7 +736,35 @@
                 <w:sz w:val="28"/>
                 <w:szCs w:val="28"/>
               </w:rPr>
-              <w:t xml:space="preserve">La convention et ses avenants sont dénoncés à partir du {{convention.date_denonciation|d}} </w:t>
+              <w:t>La convention et ses avenants sont dénoncés à partir du {{</w:t>
+            </w:r>
+            <w:proofErr w:type="spellStart"/>
+            <w:proofErr w:type="gramStart"/>
+            <w:r>
+              <w:rPr>
+                <w:b/>
+                <w:sz w:val="28"/>
+                <w:szCs w:val="28"/>
+              </w:rPr>
+              <w:t>convention.date</w:t>
+            </w:r>
+            <w:proofErr w:type="gramEnd"/>
+            <w:r>
+              <w:rPr>
+                <w:b/>
+                <w:sz w:val="28"/>
+                <w:szCs w:val="28"/>
+              </w:rPr>
+              <w:t>_denonciation|d</w:t>
+            </w:r>
+            <w:proofErr w:type="spellEnd"/>
+            <w:r>
+              <w:rPr>
+                <w:b/>
+                <w:sz w:val="28"/>
+                <w:szCs w:val="28"/>
+              </w:rPr>
+              <w:t xml:space="preserve">}} </w:t>
             </w:r>
           </w:p>
         </w:tc>
@@ -272,7 +784,25 @@
           <w:sz w:val="28"/>
           <w:szCs w:val="28"/>
         </w:rPr>
-        <w:t>{% endif %}</w:t>
+        <w:t xml:space="preserve">{% </w:t>
+      </w:r>
+      <w:proofErr w:type="spellStart"/>
+      <w:r>
+        <w:rPr>
+          <w:b/>
+          <w:sz w:val="28"/>
+          <w:szCs w:val="28"/>
+        </w:rPr>
+        <w:t>endif</w:t>
+      </w:r>
+      <w:proofErr w:type="spellEnd"/>
+      <w:r>
+        <w:rPr>
+          <w:b/>
+          <w:sz w:val="28"/>
+          <w:szCs w:val="28"/>
+        </w:rPr>
+        <w:t xml:space="preserve"> %}</w:t>
       </w:r>
     </w:p>
     <w:p>
@@ -285,6 +815,11 @@
       <w:bookmarkEnd w:id="0"/>
     </w:p>
     <w:p>
+      <w:pPr>
+        <w:rPr>
+          <w:rFonts w:cs="TimesNewRomanPSMT"/>
+        </w:rPr>
+      </w:pPr>
       <w:r>
         <w:rPr>
           <w:rFonts w:cs="TimesNewRomanPSMT"/>
@@ -297,46 +832,35 @@
         <w:rPr>
           <w:rFonts w:cs="TimesNewRomanPSMT"/>
         </w:rPr>
-        <w:t xml:space="preserve"> {{ programme.nom }}</w:t>
-      </w:r>
-    </w:p>
-    <w:p>
-      <w:pPr>
-        <w:rPr>
-          <w:rFonts w:cs="TimesNewRomanPSMT"/>
-        </w:rPr>
-      </w:pPr>
-    </w:p>
-    <w:p>
-      <w:r>
-        <w:rPr>
-          <w:rFonts w:cs="TimesNewRomanPSMT"/>
-          <w:b/>
-          <w:bCs/>
-        </w:rPr>
-        <w:t xml:space="preserve">Adresse(s) de l’opération : </w:t>
-      </w:r>
-      <w:r>
-        <w:rPr>
-          <w:rFonts w:cs="TimesNewRomanPSMT"/>
-        </w:rPr>
-        <w:t xml:space="preserve">{{ programme.adresse|inline_text_multiline }}, </w:t>
-      </w:r>
-      <w:bookmarkStart w:id="1" w:name="CodePostal2"/>
-      <w:bookmarkEnd w:id="1"/>
-      <w:r>
-        <w:rPr>
-          <w:rFonts w:cs="TimesNewRomanPSMT"/>
-        </w:rPr>
-        <w:t xml:space="preserve">{{ programme.code_postal }} </w:t>
-      </w:r>
-      <w:bookmarkStart w:id="2" w:name="Ville2"/>
-      <w:bookmarkEnd w:id="2"/>
-      <w:r>
-        <w:rPr>
-          <w:rFonts w:cs="TimesNewRomanPSMT"/>
-        </w:rPr>
-        <w:t>{{ programme.ville }}</w:t>
+        <w:t xml:space="preserve"> </w:t>
+      </w:r>
+      <w:proofErr w:type="gramStart"/>
+      <w:r>
+        <w:rPr>
+          <w:rFonts w:cs="TimesNewRomanPSMT"/>
+        </w:rPr>
+        <w:t xml:space="preserve">{{ </w:t>
+      </w:r>
+      <w:proofErr w:type="spellStart"/>
+      <w:r>
+        <w:rPr>
+          <w:rFonts w:cs="TimesNewRomanPSMT"/>
+        </w:rPr>
+        <w:t>programme.nom</w:t>
+      </w:r>
+      <w:proofErr w:type="spellEnd"/>
+      <w:proofErr w:type="gramEnd"/>
+      <w:r>
+        <w:rPr>
+          <w:rFonts w:cs="TimesNewRomanPSMT"/>
+        </w:rPr>
+        <w:t xml:space="preserve"> }</w:t>
+      </w:r>
+      <w:r>
+        <w:rPr>
+          <w:rFonts w:cs="TimesNewRomanPSMT"/>
+        </w:rPr>
+        <w:t>}</w:t>
       </w:r>
     </w:p>
     <w:p>
@@ -355,10 +879,145 @@
       <w:r>
         <w:rPr>
           <w:rFonts w:cs="TimesNewRomanPSMT"/>
+        </w:rPr>
+        <w:t xml:space="preserve">{% if </w:t>
+      </w:r>
+      <w:proofErr w:type="spellStart"/>
+      <w:proofErr w:type="gramStart"/>
+      <w:r>
+        <w:rPr>
+          <w:rFonts w:cs="TimesNewRomanPSMT"/>
+        </w:rPr>
+        <w:t>convention.adresse</w:t>
+      </w:r>
+      <w:proofErr w:type="spellEnd"/>
+      <w:proofErr w:type="gramEnd"/>
+      <w:r>
+        <w:rPr>
+          <w:rFonts w:cs="TimesNewRomanPSMT"/>
+        </w:rPr>
+        <w:t xml:space="preserve"> %}</w:t>
+      </w:r>
+      <w:r>
+        <w:rPr>
+          <w:rFonts w:cs="TimesNewRomanPSMT"/>
           <w:b/>
           <w:bCs/>
         </w:rPr>
-        <w:t>Financement</w:t>
+        <w:br/>
+        <w:t xml:space="preserve">Adresse(s) de l’opération : </w:t>
+      </w:r>
+      <w:proofErr w:type="gramStart"/>
+      <w:r>
+        <w:rPr>
+          <w:rFonts w:cs="TimesNewRomanPSMT"/>
+        </w:rPr>
+        <w:t xml:space="preserve">{{ </w:t>
+      </w:r>
+      <w:proofErr w:type="spellStart"/>
+      <w:r>
+        <w:rPr>
+          <w:rFonts w:cs="TimesNewRomanPSMT"/>
+        </w:rPr>
+        <w:t>convention</w:t>
+      </w:r>
+      <w:proofErr w:type="gramEnd"/>
+      <w:r>
+        <w:rPr>
+          <w:rFonts w:cs="TimesNewRomanPSMT"/>
+        </w:rPr>
+        <w:t>.adresse|inline_text_</w:t>
+      </w:r>
+      <w:proofErr w:type="gramStart"/>
+      <w:r>
+        <w:rPr>
+          <w:rFonts w:cs="TimesNewRomanPSMT"/>
+        </w:rPr>
+        <w:t>multiline</w:t>
+      </w:r>
+      <w:proofErr w:type="spellEnd"/>
+      <w:r>
+        <w:rPr>
+          <w:rFonts w:cs="TimesNewRomanPSMT"/>
+        </w:rPr>
+        <w:t xml:space="preserve"> }</w:t>
+      </w:r>
+      <w:proofErr w:type="gramEnd"/>
+      <w:r>
+        <w:rPr>
+          <w:rFonts w:cs="TimesNewRomanPSMT"/>
+        </w:rPr>
+        <w:t xml:space="preserve">}, </w:t>
+      </w:r>
+      <w:proofErr w:type="gramStart"/>
+      <w:r>
+        <w:rPr>
+          <w:rFonts w:cs="TimesNewRomanPSMT"/>
+        </w:rPr>
+        <w:t xml:space="preserve">{{ </w:t>
+      </w:r>
+      <w:proofErr w:type="spellStart"/>
+      <w:r>
+        <w:rPr>
+          <w:rFonts w:cs="TimesNewRomanPSMT"/>
+        </w:rPr>
+        <w:t>programme</w:t>
+      </w:r>
+      <w:proofErr w:type="gramEnd"/>
+      <w:r>
+        <w:rPr>
+          <w:rFonts w:cs="TimesNewRomanPSMT"/>
+        </w:rPr>
+        <w:t>.code_</w:t>
+      </w:r>
+      <w:proofErr w:type="gramStart"/>
+      <w:r>
+        <w:rPr>
+          <w:rFonts w:cs="TimesNewRomanPSMT"/>
+        </w:rPr>
+        <w:t>postal</w:t>
+      </w:r>
+      <w:proofErr w:type="spellEnd"/>
+      <w:r>
+        <w:rPr>
+          <w:rFonts w:cs="TimesNewRomanPSMT"/>
+        </w:rPr>
+        <w:t xml:space="preserve"> }</w:t>
+      </w:r>
+      <w:proofErr w:type="gramEnd"/>
+      <w:r>
+        <w:rPr>
+          <w:rFonts w:cs="TimesNewRomanPSMT"/>
+        </w:rPr>
+        <w:t xml:space="preserve">} </w:t>
+      </w:r>
+      <w:proofErr w:type="gramStart"/>
+      <w:r>
+        <w:rPr>
+          <w:rFonts w:cs="TimesNewRomanPSMT"/>
+        </w:rPr>
+        <w:t xml:space="preserve">{{ </w:t>
+      </w:r>
+      <w:proofErr w:type="spellStart"/>
+      <w:r>
+        <w:rPr>
+          <w:rFonts w:cs="TimesNewRomanPSMT"/>
+        </w:rPr>
+        <w:t>programme</w:t>
+      </w:r>
+      <w:proofErr w:type="gramEnd"/>
+      <w:r>
+        <w:rPr>
+          <w:rFonts w:cs="TimesNewRomanPSMT"/>
+        </w:rPr>
+        <w:t>.ville</w:t>
+      </w:r>
+      <w:proofErr w:type="spellEnd"/>
+      <w:r>
+        <w:rPr>
+          <w:rFonts w:cs="TimesNewRomanPSMT"/>
+        </w:rPr>
+        <w:t xml:space="preserve"> }}</w:t>
       </w:r>
       <w:r>
         <w:rPr>
@@ -366,13 +1025,27 @@
           <w:b/>
           <w:bCs/>
         </w:rPr>
-        <w:t>{{</w:t>
-      </w:r>
-      <w:r>
-        <w:rPr>
-          <w:rFonts w:cs="TimesNewRomanPSMT"/>
-        </w:rPr>
-        <w:t xml:space="preserve"> </w:t>
+        <w:br/>
+      </w:r>
+      <w:r>
+        <w:rPr>
+          <w:rFonts w:cs="TimesNewRomanPSMT"/>
+        </w:rPr>
+        <w:t xml:space="preserve">{% </w:t>
+      </w:r>
+      <w:proofErr w:type="spellStart"/>
+      <w:r>
+        <w:rPr>
+          <w:rFonts w:cs="TimesNewRomanPSMT"/>
+        </w:rPr>
+        <w:t>else</w:t>
+      </w:r>
+      <w:proofErr w:type="spellEnd"/>
+      <w:r>
+        <w:rPr>
+          <w:rFonts w:cs="TimesNewRomanPSMT"/>
+        </w:rPr>
+        <w:t xml:space="preserve"> %}</w:t>
       </w:r>
       <w:r>
         <w:rPr>
@@ -380,64 +1053,141 @@
           <w:b/>
           <w:bCs/>
         </w:rPr>
-        <w:t>convention.get_financements</w:t>
-      </w:r>
-      <w:r>
-        <w:rPr>
-          <w:rFonts w:cs="TimesNewRomanPSMT"/>
-          <w:b/>
-          <w:bCs/>
-        </w:rPr>
-        <w:t>|length</w:t>
-      </w:r>
-      <w:r>
-        <w:rPr>
-          <w:rFonts w:cs="TimesNewRomanPSMT"/>
-          <w:b/>
-          <w:bCs/>
-        </w:rPr>
-        <w:t>|pl</w:t>
-      </w:r>
-      <w:r>
-        <w:rPr>
-          <w:b/>
-          <w:bCs/>
+        <w:br/>
+        <w:t xml:space="preserve">Adresse(s) de l’opération : </w:t>
+      </w:r>
+      <w:proofErr w:type="gramStart"/>
+      <w:r>
+        <w:rPr>
+          <w:rFonts w:cs="TimesNewRomanPSMT"/>
+        </w:rPr>
+        <w:t xml:space="preserve">{{ </w:t>
+      </w:r>
+      <w:proofErr w:type="spellStart"/>
+      <w:r>
+        <w:rPr>
+          <w:rFonts w:cs="TimesNewRomanPSMT"/>
+        </w:rPr>
+        <w:t>programme</w:t>
+      </w:r>
+      <w:proofErr w:type="gramEnd"/>
+      <w:r>
+        <w:rPr>
+          <w:rFonts w:cs="TimesNewRomanPSMT"/>
+        </w:rPr>
+        <w:t>.adresse|inline_text_</w:t>
+      </w:r>
+      <w:proofErr w:type="gramStart"/>
+      <w:r>
+        <w:rPr>
+          <w:rFonts w:cs="TimesNewRomanPSMT"/>
+        </w:rPr>
+        <w:t>multiline</w:t>
+      </w:r>
+      <w:proofErr w:type="spellEnd"/>
+      <w:r>
+        <w:rPr>
+          <w:rFonts w:cs="TimesNewRomanPSMT"/>
+        </w:rPr>
+        <w:t xml:space="preserve"> }</w:t>
+      </w:r>
+      <w:proofErr w:type="gramEnd"/>
+      <w:r>
+        <w:rPr>
+          <w:rFonts w:cs="TimesNewRomanPSMT"/>
+        </w:rPr>
+        <w:t xml:space="preserve">}, </w:t>
+      </w:r>
+      <w:proofErr w:type="gramStart"/>
+      <w:r>
+        <w:rPr>
+          <w:rFonts w:cs="TimesNewRomanPSMT"/>
+        </w:rPr>
+        <w:t xml:space="preserve">{{ </w:t>
+      </w:r>
+      <w:proofErr w:type="spellStart"/>
+      <w:r>
+        <w:rPr>
+          <w:rFonts w:cs="TimesNewRomanPSMT"/>
+        </w:rPr>
+        <w:t>programme</w:t>
+      </w:r>
+      <w:proofErr w:type="gramEnd"/>
+      <w:r>
+        <w:rPr>
+          <w:rFonts w:cs="TimesNewRomanPSMT"/>
+        </w:rPr>
+        <w:t>.code_</w:t>
+      </w:r>
+      <w:proofErr w:type="gramStart"/>
+      <w:r>
+        <w:rPr>
+          <w:rFonts w:cs="TimesNewRomanPSMT"/>
+        </w:rPr>
+        <w:t>postal</w:t>
+      </w:r>
+      <w:proofErr w:type="spellEnd"/>
+      <w:r>
+        <w:rPr>
+          <w:rFonts w:cs="TimesNewRomanPSMT"/>
+        </w:rPr>
+        <w:t xml:space="preserve"> }</w:t>
+      </w:r>
+      <w:proofErr w:type="gramEnd"/>
+      <w:r>
+        <w:rPr>
+          <w:rFonts w:cs="TimesNewRomanPSMT"/>
+        </w:rPr>
+        <w:t xml:space="preserve">} </w:t>
+      </w:r>
+      <w:proofErr w:type="gramStart"/>
+      <w:r>
+        <w:rPr>
+          <w:rFonts w:cs="TimesNewRomanPSMT"/>
+        </w:rPr>
+        <w:t xml:space="preserve">{{ </w:t>
+      </w:r>
+      <w:proofErr w:type="spellStart"/>
+      <w:r>
+        <w:rPr>
+          <w:rFonts w:cs="TimesNewRomanPSMT"/>
+        </w:rPr>
+        <w:t>programme</w:t>
+      </w:r>
+      <w:proofErr w:type="gramEnd"/>
+      <w:r>
+        <w:rPr>
+          <w:rFonts w:cs="TimesNewRomanPSMT"/>
+        </w:rPr>
+        <w:t>.ville</w:t>
+      </w:r>
+      <w:proofErr w:type="spellEnd"/>
+      <w:r>
+        <w:rPr>
+          <w:rFonts w:cs="TimesNewRomanPSMT"/>
         </w:rPr>
         <w:t xml:space="preserve"> }}</w:t>
       </w:r>
       <w:r>
         <w:rPr>
           <w:rFonts w:cs="TimesNewRomanPSMT"/>
-          <w:b/>
-          <w:bCs/>
-        </w:rPr>
-        <w:t> :</w:t>
-      </w:r>
-      <w:r>
-        <w:rPr>
-          <w:rFonts w:cs="TimesNewRomanPSMT"/>
-        </w:rPr>
-        <w:t xml:space="preserve"> {{ </w:t>
-      </w:r>
-      <w:r>
-        <w:rPr>
-          <w:rFonts w:cs="TimesNewRomanPSMT"/>
-        </w:rPr>
-        <w:t>convention.</w:t>
-      </w:r>
-      <w:r>
-        <w:rPr>
-          <w:rFonts w:cs="TimesNewRomanPSMT"/>
-        </w:rPr>
-        <w:t>get_financement_display</w:t>
-      </w:r>
-    </w:p>
-    <w:p>
-      <w:r>
-        <w:rPr>
-          <w:rFonts w:cs="TimesNewRomanPSMT"/>
-        </w:rPr>
-        <w:t xml:space="preserve"> }}</w:t>
+        </w:rPr>
+        <w:br/>
+        <w:t xml:space="preserve">{% </w:t>
+      </w:r>
+      <w:proofErr w:type="spellStart"/>
+      <w:r>
+        <w:rPr>
+          <w:rFonts w:cs="TimesNewRomanPSMT"/>
+        </w:rPr>
+        <w:t>endif</w:t>
+      </w:r>
+      <w:proofErr w:type="spellEnd"/>
+      <w:r>
+        <w:rPr>
+          <w:rFonts w:cs="TimesNewRomanPSMT"/>
+        </w:rPr>
+        <w:t xml:space="preserve"> %}</w:t>
       </w:r>
     </w:p>
     <w:p>
@@ -453,19 +1203,137 @@
           <w:rFonts w:cs="TimesNewRomanPSMT"/>
         </w:rPr>
       </w:pPr>
+      <w:proofErr w:type="gramStart"/>
       <w:r>
         <w:rPr>
           <w:rFonts w:cs="TimesNewRomanPSMT"/>
           <w:b/>
           <w:bCs/>
         </w:rPr>
-        <w:t xml:space="preserve">Date d’expiration de la convention APL : </w:t>
-      </w:r>
-      <w:r>
-        <w:rPr>
-          <w:rFonts w:cs="TimesNewRomanPSMT"/>
-        </w:rPr>
-        <w:t>{{ convention.date_fin_conventionnement|d }}</w:t>
+        <w:t>Financement</w:t>
+      </w:r>
+      <w:r>
+        <w:rPr>
+          <w:rFonts w:cs="TimesNewRomanPSMT"/>
+          <w:b/>
+          <w:bCs/>
+        </w:rPr>
+        <w:t>{{</w:t>
+      </w:r>
+      <w:r>
+        <w:rPr>
+          <w:rFonts w:cs="TimesNewRomanPSMT"/>
+        </w:rPr>
+        <w:t xml:space="preserve"> </w:t>
+      </w:r>
+      <w:proofErr w:type="spellStart"/>
+      <w:r>
+        <w:rPr>
+          <w:rFonts w:cs="TimesNewRomanPSMT"/>
+          <w:b/>
+          <w:bCs/>
+        </w:rPr>
+        <w:t>convention.get</w:t>
+      </w:r>
+      <w:proofErr w:type="gramEnd"/>
+      <w:r>
+        <w:rPr>
+          <w:rFonts w:cs="TimesNewRomanPSMT"/>
+          <w:b/>
+          <w:bCs/>
+        </w:rPr>
+        <w:t>_financements</w:t>
+      </w:r>
+      <w:r>
+        <w:rPr>
+          <w:rFonts w:cs="TimesNewRomanPSMT"/>
+          <w:b/>
+          <w:bCs/>
+        </w:rPr>
+        <w:t>|length</w:t>
+      </w:r>
+      <w:r>
+        <w:rPr>
+          <w:rFonts w:cs="TimesNewRomanPSMT"/>
+          <w:b/>
+          <w:bCs/>
+        </w:rPr>
+        <w:t>|</w:t>
+      </w:r>
+      <w:proofErr w:type="gramStart"/>
+      <w:r>
+        <w:rPr>
+          <w:rFonts w:cs="TimesNewRomanPSMT"/>
+          <w:b/>
+          <w:bCs/>
+        </w:rPr>
+        <w:t>pl</w:t>
+      </w:r>
+      <w:proofErr w:type="spellEnd"/>
+      <w:r>
+        <w:rPr>
+          <w:b/>
+          <w:bCs/>
+        </w:rPr>
+        <w:t xml:space="preserve"> }</w:t>
+      </w:r>
+      <w:proofErr w:type="gramEnd"/>
+      <w:r>
+        <w:rPr>
+          <w:b/>
+          <w:bCs/>
+        </w:rPr>
+        <w:t>}</w:t>
+      </w:r>
+      <w:r>
+        <w:rPr>
+          <w:rFonts w:cs="TimesNewRomanPSMT"/>
+          <w:b/>
+          <w:bCs/>
+        </w:rPr>
+        <w:t> :</w:t>
+      </w:r>
+      <w:r>
+        <w:rPr>
+          <w:rFonts w:cs="TimesNewRomanPSMT"/>
+        </w:rPr>
+        <w:t xml:space="preserve"> </w:t>
+      </w:r>
+      <w:proofErr w:type="gramStart"/>
+      <w:r>
+        <w:rPr>
+          <w:rFonts w:cs="TimesNewRomanPSMT"/>
+        </w:rPr>
+        <w:t xml:space="preserve">{{ </w:t>
+      </w:r>
+      <w:proofErr w:type="spellStart"/>
+      <w:r>
+        <w:rPr>
+          <w:rFonts w:cs="TimesNewRomanPSMT"/>
+        </w:rPr>
+        <w:t>convention.</w:t>
+      </w:r>
+      <w:r>
+        <w:rPr>
+          <w:rFonts w:cs="TimesNewRomanPSMT"/>
+        </w:rPr>
+        <w:t>get</w:t>
+      </w:r>
+      <w:proofErr w:type="gramEnd"/>
+      <w:r>
+        <w:rPr>
+          <w:rFonts w:cs="TimesNewRomanPSMT"/>
+        </w:rPr>
+        <w:t>_financement_display</w:t>
+      </w:r>
+      <w:proofErr w:type="spellEnd"/>
+    </w:p>
+    <w:p>
+      <w:r>
+        <w:rPr>
+          <w:rFonts w:cs="TimesNewRomanPSMT"/>
+        </w:rPr>
+        <w:t xml:space="preserve"> }}</w:t>
       </w:r>
     </w:p>
     <w:p>
@@ -487,43 +1355,49 @@
           <w:b/>
           <w:bCs/>
         </w:rPr>
-        <w:t xml:space="preserve">Type de la convention : </w:t>
-      </w:r>
-      <w:r>
-        <w:rPr>
-          <w:rFonts w:cs="TimesNewRomanPSMT"/>
-        </w:rPr>
-        <w:t>{{ convention.</w:t>
-      </w:r>
-      <w:r>
-        <w:rPr>
-          <w:rFonts w:cs="TimesNewRomanPSMT"/>
-        </w:rPr>
-        <w:t>programme.</w:t>
-      </w:r>
-      <w:r>
-        <w:rPr>
-          <w:rFonts w:cs="TimesNewRomanPSMT"/>
-        </w:rPr>
-        <w:t>get_</w:t>
-      </w:r>
-      <w:r>
-        <w:rPr>
-          <w:rFonts w:cs="TimesNewRomanPSMT"/>
-        </w:rPr>
-        <w:t>nature_logement</w:t>
-      </w:r>
-      <w:r>
-        <w:rPr>
-          <w:rFonts w:cs="TimesNewRomanPSMT"/>
-        </w:rPr>
-        <w:t>_display()</w:t>
-      </w:r>
-      <w:r>
-        <w:rPr>
-          <w:rFonts w:cs="TimesNewRomanPSMT"/>
-        </w:rPr>
-        <w:t xml:space="preserve"> }}</w:t>
+        <w:t xml:space="preserve">Date d’expiration de la convention APL : </w:t>
+      </w:r>
+      <w:proofErr w:type="gramStart"/>
+      <w:r>
+        <w:rPr>
+          <w:rFonts w:cs="TimesNewRomanPSMT"/>
+        </w:rPr>
+        <w:t xml:space="preserve">{{ </w:t>
+      </w:r>
+      <w:proofErr w:type="spellStart"/>
+      <w:r>
+        <w:rPr>
+          <w:rFonts w:cs="TimesNewRomanPSMT"/>
+        </w:rPr>
+        <w:t>convention</w:t>
+      </w:r>
+      <w:proofErr w:type="gramEnd"/>
+      <w:r>
+        <w:rPr>
+          <w:rFonts w:cs="TimesNewRomanPSMT"/>
+        </w:rPr>
+        <w:t>.date_fin_conventionnement|</w:t>
+      </w:r>
+      <w:proofErr w:type="gramStart"/>
+      <w:r>
+        <w:rPr>
+          <w:rFonts w:cs="TimesNewRomanPSMT"/>
+        </w:rPr>
+        <w:t>d</w:t>
+      </w:r>
+      <w:proofErr w:type="spellEnd"/>
+      <w:r>
+        <w:rPr>
+          <w:rFonts w:cs="TimesNewRomanPSMT"/>
+        </w:rPr>
+        <w:t xml:space="preserve"> }</w:t>
+      </w:r>
+      <w:proofErr w:type="gramEnd"/>
+      <w:r>
+        <w:rPr>
+          <w:rFonts w:cs="TimesNewRomanPSMT"/>
+        </w:rPr>
+        <w:t>}</w:t>
       </w:r>
     </w:p>
     <w:p>
@@ -542,298 +1416,984 @@
       <w:r>
         <w:rPr>
           <w:rFonts w:cs="TimesNewRomanPSMT"/>
-        </w:rPr>
-        <w:t>{% if convention.programme.is_residence %}</w:t>
-      </w:r>
-      <w:r>
-        <w:rPr>
-          <w:rFonts w:cs="TimesNewRomanPSMT"/>
           <w:b/>
           <w:bCs/>
         </w:rPr>
-        <w:t xml:space="preserve">Détail </w:t>
-      </w:r>
-      <w:r>
-        <w:rPr>
-          <w:rFonts w:cs="TimesNewRomanPSMT"/>
-          <w:b/>
-          <w:bCs/>
-        </w:rPr>
-        <w:t xml:space="preserve">du type de résidence </w:t>
-      </w:r>
-      <w:r>
-        <w:rPr>
-          <w:rFonts w:cs="TimesNewRomanPSMT"/>
-          <w:b/>
-          <w:bCs/>
-        </w:rPr>
-        <w:t xml:space="preserve">: </w:t>
-      </w:r>
-      <w:r>
-        <w:rPr>
-          <w:rFonts w:cs="TimesNewRomanPSMT"/>
-        </w:rPr>
-        <w:t>{</w:t>
-      </w:r>
-      <w:r>
-        <w:rPr>
-          <w:rFonts w:cs="TimesNewRomanPSMT"/>
-        </w:rPr>
-        <w:t>{ residence</w:t>
-      </w:r>
-      <w:r>
-        <w:rPr>
-          <w:rFonts w:cs="TimesNewRomanPSMT"/>
-        </w:rPr>
-        <w:t>_attributions</w:t>
-      </w:r>
-      <w:r>
-        <w:rPr>
-          <w:rFonts w:cs="TimesNewRomanPSMT"/>
-        </w:rPr>
-        <w:t xml:space="preserve"> }}</w:t>
-      </w:r>
-      <w:r>
-        <w:rPr>
-          <w:rFonts w:cs="TimesNewRomanPSMT"/>
-        </w:rPr>
-        <w:t>{% endif %}{% if convention.programme.is_foyer %}</w:t>
-      </w:r>
-      <w:r>
-        <w:rPr>
-          <w:rFonts w:cs="TimesNewRomanPSMT"/>
-          <w:b/>
-          <w:bCs/>
-        </w:rPr>
-        <w:t>Détail</w:t>
-      </w:r>
-      <w:r>
-        <w:rPr>
-          <w:rFonts w:cs="TimesNewRomanPSMT"/>
-          <w:b/>
-          <w:bCs/>
-        </w:rPr>
-        <w:t xml:space="preserve"> du type de foyer </w:t>
-      </w:r>
-      <w:r>
-        <w:rPr>
-          <w:rFonts w:cs="TimesNewRomanPSMT"/>
-          <w:b/>
-          <w:bCs/>
-        </w:rPr>
-        <w:t xml:space="preserve">: </w:t>
-      </w:r>
+        <w:t xml:space="preserve">Type de la convention : </w:t>
+      </w:r>
+      <w:proofErr w:type="gramStart"/>
       <w:r>
         <w:rPr>
           <w:rFonts w:cs="TimesNewRomanPSMT"/>
         </w:rPr>
         <w:t xml:space="preserve">{{ </w:t>
       </w:r>
-      <w:r>
-        <w:rPr>
-          <w:rFonts w:cs="TimesNewRomanPSMT"/>
-        </w:rPr>
-        <w:t>foyer_</w:t>
-      </w:r>
-      <w:r>
-        <w:rPr>
-          <w:rFonts w:cs="TimesNewRomanPSMT"/>
-        </w:rPr>
-        <w:t>attribution</w:t>
-      </w:r>
-      <w:r>
-        <w:rPr>
-          <w:rFonts w:cs="TimesNewRomanPSMT"/>
-        </w:rPr>
-        <w:t>s</w:t>
-      </w:r>
-      <w:r>
-        <w:rPr>
-          <w:rFonts w:cs="TimesNewRomanPSMT"/>
-        </w:rPr>
-        <w:t xml:space="preserve"> }}</w:t>
-      </w:r>
-      <w:r>
-        <w:rPr>
-          <w:rFonts w:cs="TimesNewRomanPSMT"/>
-        </w:rPr>
-        <w:t>{% endif %}</w:t>
+      <w:proofErr w:type="spellStart"/>
+      <w:r>
+        <w:rPr>
+          <w:rFonts w:cs="TimesNewRomanPSMT"/>
+        </w:rPr>
+        <w:t>convention.</w:t>
+      </w:r>
+      <w:r>
+        <w:rPr>
+          <w:rFonts w:cs="TimesNewRomanPSMT"/>
+        </w:rPr>
+        <w:t>programme.</w:t>
+      </w:r>
+      <w:r>
+        <w:rPr>
+          <w:rFonts w:cs="TimesNewRomanPSMT"/>
+        </w:rPr>
+        <w:t>get</w:t>
+      </w:r>
+      <w:proofErr w:type="gramEnd"/>
+      <w:r>
+        <w:rPr>
+          <w:rFonts w:cs="TimesNewRomanPSMT"/>
+        </w:rPr>
+        <w:t>_</w:t>
+      </w:r>
+      <w:r>
+        <w:rPr>
+          <w:rFonts w:cs="TimesNewRomanPSMT"/>
+        </w:rPr>
+        <w:t>nature_logement</w:t>
+      </w:r>
+      <w:r>
+        <w:rPr>
+          <w:rFonts w:cs="TimesNewRomanPSMT"/>
+        </w:rPr>
+        <w:t>_</w:t>
+      </w:r>
+      <w:proofErr w:type="gramStart"/>
+      <w:r>
+        <w:rPr>
+          <w:rFonts w:cs="TimesNewRomanPSMT"/>
+        </w:rPr>
+        <w:t>display</w:t>
+      </w:r>
+      <w:proofErr w:type="spellEnd"/>
+      <w:r>
+        <w:rPr>
+          <w:rFonts w:cs="TimesNewRomanPSMT"/>
+        </w:rPr>
+        <w:t>()</w:t>
+      </w:r>
+      <w:r>
+        <w:rPr>
+          <w:rFonts w:cs="TimesNewRomanPSMT"/>
+        </w:rPr>
+        <w:t xml:space="preserve"> }</w:t>
+      </w:r>
+      <w:proofErr w:type="gramEnd"/>
+      <w:r>
+        <w:rPr>
+          <w:rFonts w:cs="TimesNewRomanPSMT"/>
+        </w:rPr>
+        <w:t>}</w:t>
       </w:r>
     </w:p>
     <w:p>
       <w:pPr>
         <w:rPr>
           <w:rFonts w:cs="TimesNewRomanPSMT"/>
-        </w:rPr>
-      </w:pPr>
-    </w:p>
-    <w:p>
-      <w:r>
-        <w:rPr>
-          <w:rFonts w:cs="TimesNewRomanPSMT"/>
-          <w:b/>
-          <w:bCs/>
-        </w:rPr>
-        <w:t xml:space="preserve">Date de signature de la convention APL : </w:t>
-      </w:r>
-      <w:r>
-        <w:rPr>
-          <w:rFonts w:cs="TimesNewRomanPSMT"/>
-        </w:rPr>
-        <w:t>{{ convention</w:t>
-      </w:r>
-      <w:r>
-        <w:t xml:space="preserve"> </w:t>
-      </w:r>
-      <w:r>
-        <w:rPr>
-          <w:rFonts w:cs="TimesNewRomanPSMT"/>
-        </w:rPr>
-        <w:t>.televersement_convention_signee_le|d }}</w:t>
-      </w:r>
-    </w:p>
-    <w:p>
-      <w:pPr>
-        <w:rPr>
-          <w:rFonts w:cs="TimesNewRomanPSMT"/>
-        </w:rPr>
-      </w:pPr>
-    </w:p>
-    <w:p>
-      <w:r>
-        <w:rPr>
-          <w:rFonts w:cs="TimesNewRomanPSMT"/>
-          <w:b/>
-          <w:bCs/>
-        </w:rPr>
-        <w:lastRenderedPageBreak/>
-        <w:t xml:space="preserve">Coordonnées du propriétaire : </w:t>
-      </w:r>
-      <w:r>
-        <w:rPr>
-          <w:rFonts w:cs="TimesNewRomanPSMT"/>
-        </w:rPr>
-        <w:t>{{ bailleur.nom|upper }}</w:t>
-      </w:r>
-      <w:bookmarkStart w:id="3" w:name="NomProgramme1"/>
-      <w:bookmarkEnd w:id="3"/>
-      <w:r>
-        <w:rPr>
-          <w:rFonts w:cs="TimesNewRomanPSMT"/>
-        </w:rPr>
-        <w:t>, {{ bailleur.adresse }}, {{ bailleur.code_postal }} {{ bailleur.ville }}</w:t>
-      </w:r>
-    </w:p>
-    <w:p>
-      <w:pPr>
-        <w:rPr>
-          <w:rFonts w:cs="TimesNewRomanPSMT"/>
-        </w:rPr>
-      </w:pPr>
-    </w:p>
-    <w:p>
-      <w:r>
-        <w:rPr>
-          <w:rFonts w:cs="TimesNewRomanPSMT"/>
-          <w:b/>
-          <w:bCs/>
-        </w:rPr>
-        <w:t xml:space="preserve">Coordonnées du gestionnaire : </w:t>
-      </w:r>
-      <w:r>
-        <w:rPr>
-          <w:rFonts w:cs="TimesNewRomanPSMT"/>
-        </w:rPr>
-        <w:t>{{ bailleur.nom|upper }}, {{ bailleur.adresse }}, {{ bailleur.code_postal }} {{ bailleur.ville }}</w:t>
-      </w:r>
-    </w:p>
-    <w:p>
-      <w:pPr>
-        <w:rPr>
-          <w:rFonts w:cs="TimesNewRomanPSMT"/>
-        </w:rPr>
-      </w:pPr>
-    </w:p>
-    <w:p>
-      <w:r>
-        <w:rPr>
-          <w:b/>
-          <w:bCs/>
-        </w:rPr>
-        <w:t xml:space="preserve">Nature de programme de logements : </w:t>
-      </w:r>
-      <w:r>
-        <w:rPr>
-          <w:rFonts w:cs="TimesNewRomanPSMT"/>
-        </w:rPr>
-        <w:t xml:space="preserve">{% for lot in lots %} </w:t>
-      </w:r>
-      <w:r>
-        <w:rPr>
-          <w:rFonts w:cs="TimesNewRomanPSMT"/>
-        </w:rPr>
-        <w:t>{{ lot.financement }}</w:t>
-      </w:r>
-      <w:r>
-        <w:rPr>
-          <w:rFonts w:cs="TimesNewRomanPSMT"/>
-        </w:rPr>
-        <w:t xml:space="preserve"> : </w:t>
-      </w:r>
-      <w:r>
-        <w:t>{{ lot.get_type_habitat_advanced_display(lot.nb_logements) }}</w:t>
-      </w:r>
-      <w:bookmarkStart w:id="4" w:name="Fi4"/>
-      <w:bookmarkEnd w:id="4"/>
-      <w:r>
-        <w:rPr>
-          <w:rFonts w:cs="TimesNewRomanPSMT"/>
-        </w:rPr>
-        <w:t>{% if not loop.last %}, {% endif %}{% endfor %}</w:t>
-      </w:r>
-    </w:p>
-    <w:p>
-      <w:pPr>
-        <w:rPr>
-          <w:b/>
-          <w:bCs/>
         </w:rPr>
       </w:pPr>
     </w:p>
     <w:p>
       <w:pPr>
         <w:rPr>
-          <w:lang w:val="en-US"/>
+          <w:rFonts w:cs="TimesNewRomanPSMT"/>
         </w:rPr>
       </w:pPr>
       <w:r>
         <w:rPr>
+          <w:rFonts w:cs="TimesNewRomanPSMT"/>
+        </w:rPr>
+        <w:t xml:space="preserve">{% if </w:t>
+      </w:r>
+      <w:proofErr w:type="spellStart"/>
+      <w:r>
+        <w:rPr>
+          <w:rFonts w:cs="TimesNewRomanPSMT"/>
+        </w:rPr>
+        <w:t>convention.programme.is_residence</w:t>
+      </w:r>
+      <w:proofErr w:type="spellEnd"/>
+      <w:r>
+        <w:rPr>
+          <w:rFonts w:cs="TimesNewRomanPSMT"/>
+        </w:rPr>
+        <w:t xml:space="preserve"> </w:t>
+      </w:r>
+      <w:proofErr w:type="gramStart"/>
+      <w:r>
+        <w:rPr>
+          <w:rFonts w:cs="TimesNewRomanPSMT"/>
+        </w:rPr>
+        <w:t>%}</w:t>
+      </w:r>
+      <w:r>
+        <w:rPr>
+          <w:rFonts w:cs="TimesNewRomanPSMT"/>
           <w:b/>
           <w:bCs/>
-          <w:lang w:val="en-US"/>
-        </w:rPr>
-        <w:t>Nature l’opération :</w:t>
-      </w:r>
-      <w:r>
-        <w:rPr>
-          <w:lang w:val="en-US"/>
-        </w:rPr>
-        <w:t xml:space="preserve">  {{ programme.get_type_operation_advanced_display() }}</w:t>
+        </w:rPr>
+        <w:t>Détail</w:t>
+      </w:r>
+      <w:proofErr w:type="gramEnd"/>
+      <w:r>
+        <w:rPr>
+          <w:rFonts w:cs="TimesNewRomanPSMT"/>
+          <w:b/>
+          <w:bCs/>
+        </w:rPr>
+        <w:t xml:space="preserve"> </w:t>
+      </w:r>
+      <w:r>
+        <w:rPr>
+          <w:rFonts w:cs="TimesNewRomanPSMT"/>
+          <w:b/>
+          <w:bCs/>
+        </w:rPr>
+        <w:t xml:space="preserve">du type de résidence </w:t>
+      </w:r>
+      <w:r>
+        <w:rPr>
+          <w:rFonts w:cs="TimesNewRomanPSMT"/>
+          <w:b/>
+          <w:bCs/>
+        </w:rPr>
+        <w:t xml:space="preserve">: </w:t>
+      </w:r>
+      <w:proofErr w:type="gramStart"/>
+      <w:r>
+        <w:rPr>
+          <w:rFonts w:cs="TimesNewRomanPSMT"/>
+        </w:rPr>
+        <w:t>{</w:t>
+      </w:r>
+      <w:r>
+        <w:rPr>
+          <w:rFonts w:cs="TimesNewRomanPSMT"/>
+        </w:rPr>
+        <w:t xml:space="preserve">{ </w:t>
+      </w:r>
+      <w:proofErr w:type="spellStart"/>
+      <w:r>
+        <w:rPr>
+          <w:rFonts w:cs="TimesNewRomanPSMT"/>
+        </w:rPr>
+        <w:t>residence</w:t>
+      </w:r>
+      <w:proofErr w:type="gramEnd"/>
+      <w:r>
+        <w:rPr>
+          <w:rFonts w:cs="TimesNewRomanPSMT"/>
+        </w:rPr>
+        <w:t>_</w:t>
+      </w:r>
+      <w:proofErr w:type="gramStart"/>
+      <w:r>
+        <w:rPr>
+          <w:rFonts w:cs="TimesNewRomanPSMT"/>
+        </w:rPr>
+        <w:t>attributions</w:t>
+      </w:r>
+      <w:proofErr w:type="spellEnd"/>
+      <w:r>
+        <w:rPr>
+          <w:rFonts w:cs="TimesNewRomanPSMT"/>
+        </w:rPr>
+        <w:t xml:space="preserve"> }}</w:t>
+      </w:r>
+      <w:r>
+        <w:rPr>
+          <w:rFonts w:cs="TimesNewRomanPSMT"/>
+        </w:rPr>
+        <w:t>{</w:t>
+      </w:r>
+      <w:proofErr w:type="gramEnd"/>
+      <w:r>
+        <w:rPr>
+          <w:rFonts w:cs="TimesNewRomanPSMT"/>
+        </w:rPr>
+        <w:t xml:space="preserve">% </w:t>
+      </w:r>
+      <w:proofErr w:type="spellStart"/>
+      <w:r>
+        <w:rPr>
+          <w:rFonts w:cs="TimesNewRomanPSMT"/>
+        </w:rPr>
+        <w:t>endif</w:t>
+      </w:r>
+      <w:proofErr w:type="spellEnd"/>
+      <w:r>
+        <w:rPr>
+          <w:rFonts w:cs="TimesNewRomanPSMT"/>
+        </w:rPr>
+        <w:t xml:space="preserve"> </w:t>
+      </w:r>
+      <w:proofErr w:type="gramStart"/>
+      <w:r>
+        <w:rPr>
+          <w:rFonts w:cs="TimesNewRomanPSMT"/>
+        </w:rPr>
+        <w:t>%}{</w:t>
+      </w:r>
+      <w:proofErr w:type="gramEnd"/>
+      <w:r>
+        <w:rPr>
+          <w:rFonts w:cs="TimesNewRomanPSMT"/>
+        </w:rPr>
+        <w:t xml:space="preserve">% if </w:t>
+      </w:r>
+      <w:proofErr w:type="spellStart"/>
+      <w:r>
+        <w:rPr>
+          <w:rFonts w:cs="TimesNewRomanPSMT"/>
+        </w:rPr>
+        <w:t>convention.programme.is_foyer</w:t>
+      </w:r>
+      <w:proofErr w:type="spellEnd"/>
+      <w:r>
+        <w:rPr>
+          <w:rFonts w:cs="TimesNewRomanPSMT"/>
+        </w:rPr>
+        <w:t xml:space="preserve"> </w:t>
+      </w:r>
+      <w:proofErr w:type="gramStart"/>
+      <w:r>
+        <w:rPr>
+          <w:rFonts w:cs="TimesNewRomanPSMT"/>
+        </w:rPr>
+        <w:t>%}</w:t>
+      </w:r>
+      <w:r>
+        <w:rPr>
+          <w:rFonts w:cs="TimesNewRomanPSMT"/>
+          <w:b/>
+          <w:bCs/>
+        </w:rPr>
+        <w:t>Détail</w:t>
+      </w:r>
+      <w:proofErr w:type="gramEnd"/>
+      <w:r>
+        <w:rPr>
+          <w:rFonts w:cs="TimesNewRomanPSMT"/>
+          <w:b/>
+          <w:bCs/>
+        </w:rPr>
+        <w:t xml:space="preserve"> du type de foyer </w:t>
+      </w:r>
+      <w:r>
+        <w:rPr>
+          <w:rFonts w:cs="TimesNewRomanPSMT"/>
+          <w:b/>
+          <w:bCs/>
+        </w:rPr>
+        <w:t xml:space="preserve">: </w:t>
+      </w:r>
+      <w:proofErr w:type="gramStart"/>
+      <w:r>
+        <w:rPr>
+          <w:rFonts w:cs="TimesNewRomanPSMT"/>
+        </w:rPr>
+        <w:t xml:space="preserve">{{ </w:t>
+      </w:r>
+      <w:proofErr w:type="spellStart"/>
+      <w:r>
+        <w:rPr>
+          <w:rFonts w:cs="TimesNewRomanPSMT"/>
+        </w:rPr>
+        <w:t>foyer</w:t>
+      </w:r>
+      <w:proofErr w:type="gramEnd"/>
+      <w:r>
+        <w:rPr>
+          <w:rFonts w:cs="TimesNewRomanPSMT"/>
+        </w:rPr>
+        <w:t>_</w:t>
+      </w:r>
+      <w:proofErr w:type="gramStart"/>
+      <w:r>
+        <w:rPr>
+          <w:rFonts w:cs="TimesNewRomanPSMT"/>
+        </w:rPr>
+        <w:t>attribution</w:t>
+      </w:r>
+      <w:r>
+        <w:rPr>
+          <w:rFonts w:cs="TimesNewRomanPSMT"/>
+        </w:rPr>
+        <w:t>s</w:t>
+      </w:r>
+      <w:proofErr w:type="spellEnd"/>
+      <w:r>
+        <w:rPr>
+          <w:rFonts w:cs="TimesNewRomanPSMT"/>
+        </w:rPr>
+        <w:t xml:space="preserve"> }}</w:t>
+      </w:r>
+      <w:r>
+        <w:rPr>
+          <w:rFonts w:cs="TimesNewRomanPSMT"/>
+        </w:rPr>
+        <w:t>{</w:t>
+      </w:r>
+      <w:proofErr w:type="gramEnd"/>
+      <w:r>
+        <w:rPr>
+          <w:rFonts w:cs="TimesNewRomanPSMT"/>
+        </w:rPr>
+        <w:t xml:space="preserve">% </w:t>
+      </w:r>
+      <w:proofErr w:type="spellStart"/>
+      <w:r>
+        <w:rPr>
+          <w:rFonts w:cs="TimesNewRomanPSMT"/>
+        </w:rPr>
+        <w:t>endif</w:t>
+      </w:r>
+      <w:proofErr w:type="spellEnd"/>
+      <w:r>
+        <w:rPr>
+          <w:rFonts w:cs="TimesNewRomanPSMT"/>
+        </w:rPr>
+        <w:t xml:space="preserve"> %}</w:t>
       </w:r>
     </w:p>
     <w:p>
       <w:pPr>
         <w:rPr>
+          <w:rFonts w:cs="TimesNewRomanPSMT"/>
+        </w:rPr>
+      </w:pPr>
+    </w:p>
+    <w:p>
+      <w:r>
+        <w:rPr>
+          <w:rFonts w:cs="TimesNewRomanPSMT"/>
           <w:b/>
           <w:bCs/>
-          <w:lang w:val="en-US"/>
+        </w:rPr>
+        <w:t xml:space="preserve">Date de signature de la convention APL : </w:t>
+      </w:r>
+      <w:proofErr w:type="gramStart"/>
+      <w:r>
+        <w:rPr>
+          <w:rFonts w:cs="TimesNewRomanPSMT"/>
+        </w:rPr>
+        <w:t>{{ convention</w:t>
+      </w:r>
+      <w:r>
+        <w:t xml:space="preserve"> </w:t>
+      </w:r>
+      <w:r>
+        <w:rPr>
+          <w:rFonts w:cs="TimesNewRomanPSMT"/>
+        </w:rPr>
+        <w:t>.</w:t>
+      </w:r>
+      <w:proofErr w:type="spellStart"/>
+      <w:r>
+        <w:rPr>
+          <w:rFonts w:cs="TimesNewRomanPSMT"/>
+        </w:rPr>
+        <w:t>televersement</w:t>
+      </w:r>
+      <w:proofErr w:type="gramEnd"/>
+      <w:r>
+        <w:rPr>
+          <w:rFonts w:cs="TimesNewRomanPSMT"/>
+        </w:rPr>
+        <w:t>_convention_signee_le|</w:t>
+      </w:r>
+      <w:proofErr w:type="gramStart"/>
+      <w:r>
+        <w:rPr>
+          <w:rFonts w:cs="TimesNewRomanPSMT"/>
+        </w:rPr>
+        <w:t>d</w:t>
+      </w:r>
+      <w:proofErr w:type="spellEnd"/>
+      <w:r>
+        <w:rPr>
+          <w:rFonts w:cs="TimesNewRomanPSMT"/>
+        </w:rPr>
+        <w:t xml:space="preserve"> }</w:t>
+      </w:r>
+      <w:proofErr w:type="gramEnd"/>
+      <w:r>
+        <w:rPr>
+          <w:rFonts w:cs="TimesNewRomanPSMT"/>
+        </w:rPr>
+        <w:t>}</w:t>
+      </w:r>
+    </w:p>
+    <w:p>
+      <w:pPr>
+        <w:rPr>
+          <w:rFonts w:cs="TimesNewRomanPSMT"/>
+        </w:rPr>
+      </w:pPr>
+    </w:p>
+    <w:p>
+      <w:r>
+        <w:rPr>
+          <w:rFonts w:cs="TimesNewRomanPSMT"/>
+          <w:b/>
+          <w:bCs/>
+        </w:rPr>
+        <w:t xml:space="preserve">Coordonnées du propriétaire : </w:t>
+      </w:r>
+      <w:proofErr w:type="gramStart"/>
+      <w:r>
+        <w:rPr>
+          <w:rFonts w:cs="TimesNewRomanPSMT"/>
+        </w:rPr>
+        <w:t xml:space="preserve">{{ </w:t>
+      </w:r>
+      <w:proofErr w:type="spellStart"/>
+      <w:r>
+        <w:rPr>
+          <w:rFonts w:cs="TimesNewRomanPSMT"/>
+        </w:rPr>
+        <w:t>bailleur.nom</w:t>
+      </w:r>
+      <w:proofErr w:type="gramEnd"/>
+      <w:r>
+        <w:rPr>
+          <w:rFonts w:cs="TimesNewRomanPSMT"/>
+        </w:rPr>
+        <w:t>|</w:t>
+      </w:r>
+      <w:proofErr w:type="gramStart"/>
+      <w:r>
+        <w:rPr>
+          <w:rFonts w:cs="TimesNewRomanPSMT"/>
+        </w:rPr>
+        <w:t>upper</w:t>
+      </w:r>
+      <w:proofErr w:type="spellEnd"/>
+      <w:r>
+        <w:rPr>
+          <w:rFonts w:cs="TimesNewRomanPSMT"/>
+        </w:rPr>
+        <w:t xml:space="preserve"> }</w:t>
+      </w:r>
+      <w:proofErr w:type="gramEnd"/>
+      <w:r>
+        <w:rPr>
+          <w:rFonts w:cs="TimesNewRomanPSMT"/>
+        </w:rPr>
+        <w:t>}</w:t>
+      </w:r>
+      <w:bookmarkStart w:id="1" w:name="NomProgramme1"/>
+      <w:bookmarkEnd w:id="1"/>
+      <w:r>
+        <w:rPr>
+          <w:rFonts w:cs="TimesNewRomanPSMT"/>
+        </w:rPr>
+        <w:t xml:space="preserve">, </w:t>
+      </w:r>
+      <w:proofErr w:type="gramStart"/>
+      <w:r>
+        <w:rPr>
+          <w:rFonts w:cs="TimesNewRomanPSMT"/>
+        </w:rPr>
+        <w:t xml:space="preserve">{{ </w:t>
+      </w:r>
+      <w:proofErr w:type="spellStart"/>
+      <w:r>
+        <w:rPr>
+          <w:rFonts w:cs="TimesNewRomanPSMT"/>
+        </w:rPr>
+        <w:t>bailleur</w:t>
+      </w:r>
+      <w:proofErr w:type="gramEnd"/>
+      <w:r>
+        <w:rPr>
+          <w:rFonts w:cs="TimesNewRomanPSMT"/>
+        </w:rPr>
+        <w:t>.</w:t>
+      </w:r>
+      <w:proofErr w:type="gramStart"/>
+      <w:r>
+        <w:rPr>
+          <w:rFonts w:cs="TimesNewRomanPSMT"/>
+        </w:rPr>
+        <w:t>adresse</w:t>
+      </w:r>
+      <w:proofErr w:type="spellEnd"/>
+      <w:r>
+        <w:rPr>
+          <w:rFonts w:cs="TimesNewRomanPSMT"/>
+        </w:rPr>
+        <w:t xml:space="preserve"> }</w:t>
+      </w:r>
+      <w:proofErr w:type="gramEnd"/>
+      <w:r>
+        <w:rPr>
+          <w:rFonts w:cs="TimesNewRomanPSMT"/>
+        </w:rPr>
+        <w:t xml:space="preserve">}, </w:t>
+      </w:r>
+      <w:proofErr w:type="gramStart"/>
+      <w:r>
+        <w:rPr>
+          <w:rFonts w:cs="TimesNewRomanPSMT"/>
+        </w:rPr>
+        <w:t xml:space="preserve">{{ </w:t>
+      </w:r>
+      <w:proofErr w:type="spellStart"/>
+      <w:r>
+        <w:rPr>
+          <w:rFonts w:cs="TimesNewRomanPSMT"/>
+        </w:rPr>
+        <w:t>bailleur</w:t>
+      </w:r>
+      <w:proofErr w:type="gramEnd"/>
+      <w:r>
+        <w:rPr>
+          <w:rFonts w:cs="TimesNewRomanPSMT"/>
+        </w:rPr>
+        <w:t>.code_</w:t>
+      </w:r>
+      <w:proofErr w:type="gramStart"/>
+      <w:r>
+        <w:rPr>
+          <w:rFonts w:cs="TimesNewRomanPSMT"/>
+        </w:rPr>
+        <w:t>postal</w:t>
+      </w:r>
+      <w:proofErr w:type="spellEnd"/>
+      <w:r>
+        <w:rPr>
+          <w:rFonts w:cs="TimesNewRomanPSMT"/>
+        </w:rPr>
+        <w:t xml:space="preserve"> }</w:t>
+      </w:r>
+      <w:proofErr w:type="gramEnd"/>
+      <w:r>
+        <w:rPr>
+          <w:rFonts w:cs="TimesNewRomanPSMT"/>
+        </w:rPr>
+        <w:t xml:space="preserve">} </w:t>
+      </w:r>
+      <w:proofErr w:type="gramStart"/>
+      <w:r>
+        <w:rPr>
+          <w:rFonts w:cs="TimesNewRomanPSMT"/>
+        </w:rPr>
+        <w:t xml:space="preserve">{{ </w:t>
+      </w:r>
+      <w:proofErr w:type="spellStart"/>
+      <w:r>
+        <w:rPr>
+          <w:rFonts w:cs="TimesNewRomanPSMT"/>
+        </w:rPr>
+        <w:t>bailleur</w:t>
+      </w:r>
+      <w:proofErr w:type="gramEnd"/>
+      <w:r>
+        <w:rPr>
+          <w:rFonts w:cs="TimesNewRomanPSMT"/>
+        </w:rPr>
+        <w:t>.</w:t>
+      </w:r>
+      <w:proofErr w:type="gramStart"/>
+      <w:r>
+        <w:rPr>
+          <w:rFonts w:cs="TimesNewRomanPSMT"/>
+        </w:rPr>
+        <w:t>ville</w:t>
+      </w:r>
+      <w:proofErr w:type="spellEnd"/>
+      <w:r>
+        <w:rPr>
+          <w:rFonts w:cs="TimesNewRomanPSMT"/>
+        </w:rPr>
+        <w:t xml:space="preserve"> }</w:t>
+      </w:r>
+      <w:proofErr w:type="gramEnd"/>
+      <w:r>
+        <w:rPr>
+          <w:rFonts w:cs="TimesNewRomanPSMT"/>
+        </w:rPr>
+        <w:t>}</w:t>
+      </w:r>
+    </w:p>
+    <w:p>
+      <w:pPr>
+        <w:rPr>
+          <w:rFonts w:cs="TimesNewRomanPSMT"/>
+        </w:rPr>
+      </w:pPr>
+    </w:p>
+    <w:p>
+      <w:r>
+        <w:rPr>
+          <w:rFonts w:cs="TimesNewRomanPSMT"/>
+          <w:b/>
+          <w:bCs/>
+        </w:rPr>
+        <w:t xml:space="preserve">Coordonnées du gestionnaire : </w:t>
+      </w:r>
+      <w:proofErr w:type="gramStart"/>
+      <w:r>
+        <w:rPr>
+          <w:rFonts w:cs="TimesNewRomanPSMT"/>
+        </w:rPr>
+        <w:t xml:space="preserve">{{ </w:t>
+      </w:r>
+      <w:proofErr w:type="spellStart"/>
+      <w:r>
+        <w:rPr>
+          <w:rFonts w:cs="TimesNewRomanPSMT"/>
+        </w:rPr>
+        <w:t>bailleur.nom</w:t>
+      </w:r>
+      <w:proofErr w:type="gramEnd"/>
+      <w:r>
+        <w:rPr>
+          <w:rFonts w:cs="TimesNewRomanPSMT"/>
+        </w:rPr>
+        <w:t>|</w:t>
+      </w:r>
+      <w:proofErr w:type="gramStart"/>
+      <w:r>
+        <w:rPr>
+          <w:rFonts w:cs="TimesNewRomanPSMT"/>
+        </w:rPr>
+        <w:t>upper</w:t>
+      </w:r>
+      <w:proofErr w:type="spellEnd"/>
+      <w:r>
+        <w:rPr>
+          <w:rFonts w:cs="TimesNewRomanPSMT"/>
+        </w:rPr>
+        <w:t xml:space="preserve"> }</w:t>
+      </w:r>
+      <w:proofErr w:type="gramEnd"/>
+      <w:r>
+        <w:rPr>
+          <w:rFonts w:cs="TimesNewRomanPSMT"/>
+        </w:rPr>
+        <w:t xml:space="preserve">}, </w:t>
+      </w:r>
+      <w:proofErr w:type="gramStart"/>
+      <w:r>
+        <w:rPr>
+          <w:rFonts w:cs="TimesNewRomanPSMT"/>
+        </w:rPr>
+        <w:t xml:space="preserve">{{ </w:t>
+      </w:r>
+      <w:proofErr w:type="spellStart"/>
+      <w:r>
+        <w:rPr>
+          <w:rFonts w:cs="TimesNewRomanPSMT"/>
+        </w:rPr>
+        <w:t>bailleur</w:t>
+      </w:r>
+      <w:proofErr w:type="gramEnd"/>
+      <w:r>
+        <w:rPr>
+          <w:rFonts w:cs="TimesNewRomanPSMT"/>
+        </w:rPr>
+        <w:t>.</w:t>
+      </w:r>
+      <w:proofErr w:type="gramStart"/>
+      <w:r>
+        <w:rPr>
+          <w:rFonts w:cs="TimesNewRomanPSMT"/>
+        </w:rPr>
+        <w:t>adresse</w:t>
+      </w:r>
+      <w:proofErr w:type="spellEnd"/>
+      <w:r>
+        <w:rPr>
+          <w:rFonts w:cs="TimesNewRomanPSMT"/>
+        </w:rPr>
+        <w:t xml:space="preserve"> }</w:t>
+      </w:r>
+      <w:proofErr w:type="gramEnd"/>
+      <w:r>
+        <w:rPr>
+          <w:rFonts w:cs="TimesNewRomanPSMT"/>
+        </w:rPr>
+        <w:t xml:space="preserve">}, </w:t>
+      </w:r>
+      <w:proofErr w:type="gramStart"/>
+      <w:r>
+        <w:rPr>
+          <w:rFonts w:cs="TimesNewRomanPSMT"/>
+        </w:rPr>
+        <w:t xml:space="preserve">{{ </w:t>
+      </w:r>
+      <w:proofErr w:type="spellStart"/>
+      <w:r>
+        <w:rPr>
+          <w:rFonts w:cs="TimesNewRomanPSMT"/>
+        </w:rPr>
+        <w:t>bailleur</w:t>
+      </w:r>
+      <w:proofErr w:type="gramEnd"/>
+      <w:r>
+        <w:rPr>
+          <w:rFonts w:cs="TimesNewRomanPSMT"/>
+        </w:rPr>
+        <w:t>.code_</w:t>
+      </w:r>
+      <w:proofErr w:type="gramStart"/>
+      <w:r>
+        <w:rPr>
+          <w:rFonts w:cs="TimesNewRomanPSMT"/>
+        </w:rPr>
+        <w:t>postal</w:t>
+      </w:r>
+      <w:proofErr w:type="spellEnd"/>
+      <w:r>
+        <w:rPr>
+          <w:rFonts w:cs="TimesNewRomanPSMT"/>
+        </w:rPr>
+        <w:t xml:space="preserve"> }</w:t>
+      </w:r>
+      <w:proofErr w:type="gramEnd"/>
+      <w:r>
+        <w:rPr>
+          <w:rFonts w:cs="TimesNewRomanPSMT"/>
+        </w:rPr>
+        <w:t xml:space="preserve">} </w:t>
+      </w:r>
+      <w:proofErr w:type="gramStart"/>
+      <w:r>
+        <w:rPr>
+          <w:rFonts w:cs="TimesNewRomanPSMT"/>
+        </w:rPr>
+        <w:t xml:space="preserve">{{ </w:t>
+      </w:r>
+      <w:proofErr w:type="spellStart"/>
+      <w:r>
+        <w:rPr>
+          <w:rFonts w:cs="TimesNewRomanPSMT"/>
+        </w:rPr>
+        <w:t>bailleur</w:t>
+      </w:r>
+      <w:proofErr w:type="gramEnd"/>
+      <w:r>
+        <w:rPr>
+          <w:rFonts w:cs="TimesNewRomanPSMT"/>
+        </w:rPr>
+        <w:t>.</w:t>
+      </w:r>
+      <w:proofErr w:type="gramStart"/>
+      <w:r>
+        <w:rPr>
+          <w:rFonts w:cs="TimesNewRomanPSMT"/>
+        </w:rPr>
+        <w:t>ville</w:t>
+      </w:r>
+      <w:proofErr w:type="spellEnd"/>
+      <w:r>
+        <w:rPr>
+          <w:rFonts w:cs="TimesNewRomanPSMT"/>
+        </w:rPr>
+        <w:t xml:space="preserve"> }</w:t>
+      </w:r>
+      <w:proofErr w:type="gramEnd"/>
+      <w:r>
+        <w:rPr>
+          <w:rFonts w:cs="TimesNewRomanPSMT"/>
+        </w:rPr>
+        <w:t>}</w:t>
+      </w:r>
+    </w:p>
+    <w:p>
+      <w:pPr>
+        <w:rPr>
+          <w:rFonts w:cs="TimesNewRomanPSMT"/>
+        </w:rPr>
+      </w:pPr>
+    </w:p>
+    <w:p>
+      <w:r>
+        <w:rPr>
+          <w:b/>
+          <w:bCs/>
+        </w:rPr>
+        <w:t xml:space="preserve">Nature de programme de logements : </w:t>
+      </w:r>
+      <w:r>
+        <w:rPr>
+          <w:rFonts w:cs="TimesNewRomanPSMT"/>
+        </w:rPr>
+        <w:t xml:space="preserve">{% for lot in lots %} </w:t>
+      </w:r>
+      <w:proofErr w:type="gramStart"/>
+      <w:r>
+        <w:rPr>
+          <w:rFonts w:cs="TimesNewRomanPSMT"/>
+        </w:rPr>
+        <w:t xml:space="preserve">{{ </w:t>
+      </w:r>
+      <w:proofErr w:type="spellStart"/>
+      <w:r>
+        <w:rPr>
+          <w:rFonts w:cs="TimesNewRomanPSMT"/>
+        </w:rPr>
+        <w:t>lot</w:t>
+      </w:r>
+      <w:proofErr w:type="gramEnd"/>
+      <w:r>
+        <w:rPr>
+          <w:rFonts w:cs="TimesNewRomanPSMT"/>
+        </w:rPr>
+        <w:t>.</w:t>
+      </w:r>
+      <w:proofErr w:type="gramStart"/>
+      <w:r>
+        <w:rPr>
+          <w:rFonts w:cs="TimesNewRomanPSMT"/>
+        </w:rPr>
+        <w:t>financement</w:t>
+      </w:r>
+      <w:proofErr w:type="spellEnd"/>
+      <w:r>
+        <w:rPr>
+          <w:rFonts w:cs="TimesNewRomanPSMT"/>
+        </w:rPr>
+        <w:t xml:space="preserve"> }</w:t>
+      </w:r>
+      <w:proofErr w:type="gramEnd"/>
+      <w:r>
+        <w:rPr>
+          <w:rFonts w:cs="TimesNewRomanPSMT"/>
+        </w:rPr>
+        <w:t>}</w:t>
+      </w:r>
+      <w:r>
+        <w:rPr>
+          <w:rFonts w:cs="TimesNewRomanPSMT"/>
+        </w:rPr>
+        <w:t xml:space="preserve"> : </w:t>
+      </w:r>
+      <w:proofErr w:type="gramStart"/>
+      <w:r>
+        <w:t xml:space="preserve">{{ </w:t>
+      </w:r>
+      <w:proofErr w:type="spellStart"/>
+      <w:r>
+        <w:t>lot.get</w:t>
+      </w:r>
+      <w:proofErr w:type="gramEnd"/>
+      <w:r>
+        <w:t>_type_habitat_advanced_display</w:t>
+      </w:r>
+      <w:proofErr w:type="spellEnd"/>
+      <w:r>
+        <w:t>(</w:t>
+      </w:r>
+      <w:proofErr w:type="spellStart"/>
+      <w:proofErr w:type="gramStart"/>
+      <w:r>
+        <w:t>lot.nb</w:t>
+      </w:r>
+      <w:proofErr w:type="gramEnd"/>
+      <w:r>
+        <w:t>_logements</w:t>
+      </w:r>
+      <w:proofErr w:type="spellEnd"/>
+      <w:proofErr w:type="gramStart"/>
+      <w:r>
+        <w:t>) }}</w:t>
+      </w:r>
+      <w:bookmarkStart w:id="2" w:name="Fi4"/>
+      <w:bookmarkEnd w:id="2"/>
+      <w:r>
+        <w:rPr>
+          <w:rFonts w:cs="TimesNewRomanPSMT"/>
+        </w:rPr>
+        <w:t>{</w:t>
+      </w:r>
+      <w:proofErr w:type="gramEnd"/>
+      <w:r>
+        <w:rPr>
+          <w:rFonts w:cs="TimesNewRomanPSMT"/>
+        </w:rPr>
+        <w:t xml:space="preserve">% if not </w:t>
+      </w:r>
+      <w:proofErr w:type="spellStart"/>
+      <w:proofErr w:type="gramStart"/>
+      <w:r>
+        <w:rPr>
+          <w:rFonts w:cs="TimesNewRomanPSMT"/>
+        </w:rPr>
+        <w:t>loop.last</w:t>
+      </w:r>
+      <w:proofErr w:type="spellEnd"/>
+      <w:proofErr w:type="gramEnd"/>
+      <w:r>
+        <w:rPr>
+          <w:rFonts w:cs="TimesNewRomanPSMT"/>
+        </w:rPr>
+        <w:t xml:space="preserve"> %}, {% </w:t>
+      </w:r>
+      <w:proofErr w:type="spellStart"/>
+      <w:r>
+        <w:rPr>
+          <w:rFonts w:cs="TimesNewRomanPSMT"/>
+        </w:rPr>
+        <w:t>endif</w:t>
+      </w:r>
+      <w:proofErr w:type="spellEnd"/>
+      <w:r>
+        <w:rPr>
+          <w:rFonts w:cs="TimesNewRomanPSMT"/>
+        </w:rPr>
+        <w:t xml:space="preserve"> </w:t>
+      </w:r>
+      <w:proofErr w:type="gramStart"/>
+      <w:r>
+        <w:rPr>
+          <w:rFonts w:cs="TimesNewRomanPSMT"/>
+        </w:rPr>
+        <w:t>%}{</w:t>
+      </w:r>
+      <w:proofErr w:type="gramEnd"/>
+      <w:r>
+        <w:rPr>
+          <w:rFonts w:cs="TimesNewRomanPSMT"/>
+        </w:rPr>
+        <w:t xml:space="preserve">% </w:t>
+      </w:r>
+      <w:proofErr w:type="spellStart"/>
+      <w:r>
+        <w:rPr>
+          <w:rFonts w:cs="TimesNewRomanPSMT"/>
+        </w:rPr>
+        <w:t>endfor</w:t>
+      </w:r>
+      <w:proofErr w:type="spellEnd"/>
+      <w:r>
+        <w:rPr>
+          <w:rFonts w:cs="TimesNewRomanPSMT"/>
+        </w:rPr>
+        <w:t xml:space="preserve"> %}</w:t>
+      </w:r>
+    </w:p>
+    <w:p>
+      <w:pPr>
+        <w:rPr>
+          <w:b/>
+          <w:bCs/>
         </w:rPr>
       </w:pPr>
     </w:p>
     <w:p>
       <w:pPr>
         <w:rPr>
-          <w:rFonts w:cs="TimesNewRomanPSMT"/>
           <w:lang w:val="en-US"/>
         </w:rPr>
       </w:pPr>
@@ -843,22 +2403,75 @@
           <w:bCs/>
           <w:lang w:val="en-US"/>
         </w:rPr>
-        <w:t xml:space="preserve">Nombre de logements : </w:t>
-      </w:r>
-      <w:r>
-        <w:rPr>
-          <w:rFonts w:cs="TimesNewRomanPSMT"/>
-          <w:lang w:val="en-US"/>
-        </w:rPr>
-        <w:t>{% for lot in lots %} {{ lot.financement }} : {{lot.nb_logements}}{% if not loop.last %}, {% endif %}{% endfor %}</w:t>
-      </w:r>
-      <w:r>
-        <w:rPr>
-          <w:rFonts w:cs="TimesNewRomanPSMT"/>
+        <w:t xml:space="preserve">Nature </w:t>
+      </w:r>
+      <w:proofErr w:type="spellStart"/>
+      <w:proofErr w:type="gramStart"/>
+      <w:r>
+        <w:rPr>
+          <w:b/>
           <w:bCs/>
           <w:lang w:val="en-US"/>
         </w:rPr>
-        <w:t>.</w:t>
+        <w:t>l’opération</w:t>
+      </w:r>
+      <w:proofErr w:type="spellEnd"/>
+      <w:r>
+        <w:rPr>
+          <w:b/>
+          <w:bCs/>
+          <w:lang w:val="en-US"/>
+        </w:rPr>
+        <w:t> :</w:t>
+      </w:r>
+      <w:proofErr w:type="gramEnd"/>
+      <w:r>
+        <w:rPr>
+          <w:lang w:val="en-US"/>
+        </w:rPr>
+        <w:t xml:space="preserve">  </w:t>
+      </w:r>
+      <w:proofErr w:type="gramStart"/>
+      <w:r>
+        <w:rPr>
+          <w:lang w:val="en-US"/>
+        </w:rPr>
+        <w:t xml:space="preserve">{{ </w:t>
+      </w:r>
+      <w:proofErr w:type="spellStart"/>
+      <w:r>
+        <w:rPr>
+          <w:lang w:val="en-US"/>
+        </w:rPr>
+        <w:t>programme.get</w:t>
+      </w:r>
+      <w:proofErr w:type="gramEnd"/>
+      <w:r>
+        <w:rPr>
+          <w:lang w:val="en-US"/>
+        </w:rPr>
+        <w:t>_type_operation_advanced_</w:t>
+      </w:r>
+      <w:proofErr w:type="gramStart"/>
+      <w:r>
+        <w:rPr>
+          <w:lang w:val="en-US"/>
+        </w:rPr>
+        <w:t>display</w:t>
+      </w:r>
+      <w:proofErr w:type="spellEnd"/>
+      <w:r>
+        <w:rPr>
+          <w:lang w:val="en-US"/>
+        </w:rPr>
+        <w:t>() }</w:t>
+      </w:r>
+      <w:proofErr w:type="gramEnd"/>
+      <w:r>
+        <w:rPr>
+          <w:lang w:val="en-US"/>
+        </w:rPr>
+        <w:t>}</w:t>
       </w:r>
     </w:p>
     <w:p>
@@ -871,15 +2484,241 @@
       </w:pPr>
     </w:p>
     <w:p>
+      <w:pPr>
+        <w:rPr>
+          <w:rFonts w:cs="TimesNewRomanPSMT"/>
+          <w:lang w:val="en-US"/>
+        </w:rPr>
+      </w:pPr>
       <w:r>
         <w:rPr>
           <w:b/>
           <w:bCs/>
+          <w:lang w:val="en-US"/>
+        </w:rPr>
+        <w:t xml:space="preserve">Nombre de </w:t>
+      </w:r>
+      <w:proofErr w:type="spellStart"/>
+      <w:proofErr w:type="gramStart"/>
+      <w:r>
+        <w:rPr>
+          <w:b/>
+          <w:bCs/>
+          <w:lang w:val="en-US"/>
+        </w:rPr>
+        <w:t>logements</w:t>
+      </w:r>
+      <w:proofErr w:type="spellEnd"/>
+      <w:r>
+        <w:rPr>
+          <w:b/>
+          <w:bCs/>
+          <w:lang w:val="en-US"/>
+        </w:rPr>
+        <w:t> :</w:t>
+      </w:r>
+      <w:proofErr w:type="gramEnd"/>
+      <w:r>
+        <w:rPr>
+          <w:b/>
+          <w:bCs/>
+          <w:lang w:val="en-US"/>
+        </w:rPr>
+        <w:t xml:space="preserve"> </w:t>
+      </w:r>
+      <w:r>
+        <w:rPr>
+          <w:rFonts w:cs="TimesNewRomanPSMT"/>
+          <w:lang w:val="en-US"/>
+        </w:rPr>
+        <w:t xml:space="preserve">{% for lot in lots %} </w:t>
+      </w:r>
+      <w:proofErr w:type="gramStart"/>
+      <w:r>
+        <w:rPr>
+          <w:rFonts w:cs="TimesNewRomanPSMT"/>
+          <w:lang w:val="en-US"/>
+        </w:rPr>
+        <w:t xml:space="preserve">{{ </w:t>
+      </w:r>
+      <w:proofErr w:type="spellStart"/>
+      <w:r>
+        <w:rPr>
+          <w:rFonts w:cs="TimesNewRomanPSMT"/>
+          <w:lang w:val="en-US"/>
+        </w:rPr>
+        <w:t>lot</w:t>
+      </w:r>
+      <w:proofErr w:type="gramEnd"/>
+      <w:r>
+        <w:rPr>
+          <w:rFonts w:cs="TimesNewRomanPSMT"/>
+          <w:lang w:val="en-US"/>
+        </w:rPr>
+        <w:t>.</w:t>
+      </w:r>
+      <w:proofErr w:type="gramStart"/>
+      <w:r>
+        <w:rPr>
+          <w:rFonts w:cs="TimesNewRomanPSMT"/>
+          <w:lang w:val="en-US"/>
+        </w:rPr>
+        <w:t>financement</w:t>
+      </w:r>
+      <w:proofErr w:type="spellEnd"/>
+      <w:r>
+        <w:rPr>
+          <w:rFonts w:cs="TimesNewRomanPSMT"/>
+          <w:lang w:val="en-US"/>
+        </w:rPr>
+        <w:t xml:space="preserve"> }</w:t>
+      </w:r>
+      <w:proofErr w:type="gramEnd"/>
+      <w:r>
+        <w:rPr>
+          <w:rFonts w:cs="TimesNewRomanPSMT"/>
+          <w:lang w:val="en-US"/>
+        </w:rPr>
+        <w:t>} : {{</w:t>
+      </w:r>
+      <w:proofErr w:type="spellStart"/>
+      <w:proofErr w:type="gramStart"/>
+      <w:r>
+        <w:rPr>
+          <w:rFonts w:cs="TimesNewRomanPSMT"/>
+          <w:lang w:val="en-US"/>
+        </w:rPr>
+        <w:t>lot.nb</w:t>
+      </w:r>
+      <w:proofErr w:type="gramEnd"/>
+      <w:r>
+        <w:rPr>
+          <w:rFonts w:cs="TimesNewRomanPSMT"/>
+          <w:lang w:val="en-US"/>
+        </w:rPr>
+        <w:t>_logements</w:t>
+      </w:r>
+      <w:proofErr w:type="spellEnd"/>
+      <w:proofErr w:type="gramStart"/>
+      <w:r>
+        <w:rPr>
+          <w:rFonts w:cs="TimesNewRomanPSMT"/>
+          <w:lang w:val="en-US"/>
+        </w:rPr>
+        <w:t>}}{</w:t>
+      </w:r>
+      <w:proofErr w:type="gramEnd"/>
+      <w:r>
+        <w:rPr>
+          <w:rFonts w:cs="TimesNewRomanPSMT"/>
+          <w:lang w:val="en-US"/>
+        </w:rPr>
+        <w:t xml:space="preserve">% if not </w:t>
+      </w:r>
+      <w:proofErr w:type="spellStart"/>
+      <w:proofErr w:type="gramStart"/>
+      <w:r>
+        <w:rPr>
+          <w:rFonts w:cs="TimesNewRomanPSMT"/>
+          <w:lang w:val="en-US"/>
+        </w:rPr>
+        <w:t>loop.last</w:t>
+      </w:r>
+      <w:proofErr w:type="spellEnd"/>
+      <w:proofErr w:type="gramEnd"/>
+      <w:r>
+        <w:rPr>
+          <w:rFonts w:cs="TimesNewRomanPSMT"/>
+          <w:lang w:val="en-US"/>
+        </w:rPr>
+        <w:t xml:space="preserve"> %}</w:t>
+      </w:r>
+      <w:proofErr w:type="gramStart"/>
+      <w:r>
+        <w:rPr>
+          <w:rFonts w:cs="TimesNewRomanPSMT"/>
+          <w:lang w:val="en-US"/>
+        </w:rPr>
+        <w:t>, {%</w:t>
+      </w:r>
+      <w:proofErr w:type="gramEnd"/>
+      <w:r>
+        <w:rPr>
+          <w:rFonts w:cs="TimesNewRomanPSMT"/>
+          <w:lang w:val="en-US"/>
+        </w:rPr>
+        <w:t xml:space="preserve"> endif </w:t>
+      </w:r>
+      <w:proofErr w:type="gramStart"/>
+      <w:r>
+        <w:rPr>
+          <w:rFonts w:cs="TimesNewRomanPSMT"/>
+          <w:lang w:val="en-US"/>
+        </w:rPr>
+        <w:t>%}{</w:t>
+      </w:r>
+      <w:proofErr w:type="gramEnd"/>
+      <w:r>
+        <w:rPr>
+          <w:rFonts w:cs="TimesNewRomanPSMT"/>
+          <w:lang w:val="en-US"/>
+        </w:rPr>
+        <w:t xml:space="preserve">% </w:t>
+      </w:r>
+      <w:proofErr w:type="spellStart"/>
+      <w:proofErr w:type="gramStart"/>
+      <w:r>
+        <w:rPr>
+          <w:rFonts w:cs="TimesNewRomanPSMT"/>
+          <w:lang w:val="en-US"/>
+        </w:rPr>
+        <w:t>endfor</w:t>
+      </w:r>
+      <w:proofErr w:type="spellEnd"/>
+      <w:r>
+        <w:rPr>
+          <w:rFonts w:cs="TimesNewRomanPSMT"/>
+          <w:lang w:val="en-US"/>
+        </w:rPr>
+        <w:t xml:space="preserve"> %}</w:t>
+      </w:r>
+      <w:proofErr w:type="gramEnd"/>
+      <w:r>
+        <w:rPr>
+          <w:rFonts w:cs="TimesNewRomanPSMT"/>
+          <w:bCs/>
+          <w:lang w:val="en-US"/>
+        </w:rPr>
+        <w:t>.</w:t>
+      </w:r>
+    </w:p>
+    <w:p>
+      <w:pPr>
+        <w:rPr>
+          <w:b/>
+          <w:bCs/>
+          <w:lang w:val="en-US"/>
+        </w:rPr>
+      </w:pPr>
+    </w:p>
+    <w:p>
+      <w:r>
+        <w:rPr>
+          <w:b/>
+          <w:bCs/>
         </w:rPr>
         <w:t xml:space="preserve">Surface utile totale : </w:t>
       </w:r>
       <w:r>
-        <w:t>{{su_totale|f}}</w:t>
+        <w:t>{{</w:t>
+      </w:r>
+      <w:proofErr w:type="spellStart"/>
+      <w:r>
+        <w:t>su_totale|f</w:t>
+      </w:r>
+      <w:proofErr w:type="spellEnd"/>
+      <w:r>
+        <w:t>}}</w:t>
       </w:r>
     </w:p>
     <w:p/>
@@ -894,19 +2733,193 @@
           <w:b/>
           <w:bCs/>
         </w:rPr>
-        <w:t>{% if programme.is_foyer or programme.is_residence %}Redevance{% else %}Loyer{% endif %} maximum mensuel :</w:t>
-      </w:r>
-      <w:r>
-        <w:rPr>
-          <w:rFonts w:cs="TimesNewRomanPSMT"/>
-        </w:rPr>
-        <w:t xml:space="preserve"> {% for lot in lots %} {{ lot.financement }} : {{lot._get_loyer_par_metre_carre()}}</w:t>
-      </w:r>
-      <w:r>
-        <w:rPr>
-          <w:rFonts w:cs="TimesNewRomanPSMT"/>
+        <w:t xml:space="preserve">{% if </w:t>
+      </w:r>
+      <w:proofErr w:type="spellStart"/>
+      <w:r>
+        <w:rPr>
+          <w:b/>
           <w:bCs/>
         </w:rPr>
+        <w:t>programme.is_foyer</w:t>
+      </w:r>
+      <w:proofErr w:type="spellEnd"/>
+      <w:r>
+        <w:rPr>
+          <w:b/>
+          <w:bCs/>
+        </w:rPr>
+        <w:t xml:space="preserve"> or </w:t>
+      </w:r>
+      <w:proofErr w:type="spellStart"/>
+      <w:r>
+        <w:rPr>
+          <w:b/>
+          <w:bCs/>
+        </w:rPr>
+        <w:t>programme.is_residence</w:t>
+      </w:r>
+      <w:proofErr w:type="spellEnd"/>
+      <w:r>
+        <w:rPr>
+          <w:b/>
+          <w:bCs/>
+        </w:rPr>
+        <w:t xml:space="preserve"> </w:t>
+      </w:r>
+      <w:proofErr w:type="gramStart"/>
+      <w:r>
+        <w:rPr>
+          <w:b/>
+          <w:bCs/>
+        </w:rPr>
+        <w:t>%}Redevance</w:t>
+      </w:r>
+      <w:proofErr w:type="gramEnd"/>
+      <w:r>
+        <w:rPr>
+          <w:b/>
+          <w:bCs/>
+        </w:rPr>
+        <w:t xml:space="preserve">{% </w:t>
+      </w:r>
+      <w:proofErr w:type="spellStart"/>
+      <w:r>
+        <w:rPr>
+          <w:b/>
+          <w:bCs/>
+        </w:rPr>
+        <w:t>else</w:t>
+      </w:r>
+      <w:proofErr w:type="spellEnd"/>
+      <w:r>
+        <w:rPr>
+          <w:b/>
+          <w:bCs/>
+        </w:rPr>
+        <w:t xml:space="preserve"> </w:t>
+      </w:r>
+      <w:proofErr w:type="gramStart"/>
+      <w:r>
+        <w:rPr>
+          <w:b/>
+          <w:bCs/>
+        </w:rPr>
+        <w:t>%}Loyer</w:t>
+      </w:r>
+      <w:proofErr w:type="gramEnd"/>
+      <w:r>
+        <w:rPr>
+          <w:b/>
+          <w:bCs/>
+        </w:rPr>
+        <w:t xml:space="preserve">{% </w:t>
+      </w:r>
+      <w:proofErr w:type="spellStart"/>
+      <w:r>
+        <w:rPr>
+          <w:b/>
+          <w:bCs/>
+        </w:rPr>
+        <w:t>endif</w:t>
+      </w:r>
+      <w:proofErr w:type="spellEnd"/>
+      <w:r>
+        <w:rPr>
+          <w:b/>
+          <w:bCs/>
+        </w:rPr>
+        <w:t xml:space="preserve"> %} maximum mensuel :</w:t>
+      </w:r>
+      <w:r>
+        <w:rPr>
+          <w:rFonts w:cs="TimesNewRomanPSMT"/>
+        </w:rPr>
+        <w:t xml:space="preserve"> {% for lot in lots %} </w:t>
+      </w:r>
+      <w:proofErr w:type="gramStart"/>
+      <w:r>
+        <w:rPr>
+          <w:rFonts w:cs="TimesNewRomanPSMT"/>
+        </w:rPr>
+        <w:t xml:space="preserve">{{ </w:t>
+      </w:r>
+      <w:proofErr w:type="spellStart"/>
+      <w:r>
+        <w:rPr>
+          <w:rFonts w:cs="TimesNewRomanPSMT"/>
+        </w:rPr>
+        <w:t>lot</w:t>
+      </w:r>
+      <w:proofErr w:type="gramEnd"/>
+      <w:r>
+        <w:rPr>
+          <w:rFonts w:cs="TimesNewRomanPSMT"/>
+        </w:rPr>
+        <w:t>.</w:t>
+      </w:r>
+      <w:proofErr w:type="gramStart"/>
+      <w:r>
+        <w:rPr>
+          <w:rFonts w:cs="TimesNewRomanPSMT"/>
+        </w:rPr>
+        <w:t>financement</w:t>
+      </w:r>
+      <w:proofErr w:type="spellEnd"/>
+      <w:r>
+        <w:rPr>
+          <w:rFonts w:cs="TimesNewRomanPSMT"/>
+        </w:rPr>
+        <w:t xml:space="preserve"> }</w:t>
+      </w:r>
+      <w:proofErr w:type="gramEnd"/>
+      <w:r>
+        <w:rPr>
+          <w:rFonts w:cs="TimesNewRomanPSMT"/>
+        </w:rPr>
+        <w:t>} : {{</w:t>
+      </w:r>
+      <w:proofErr w:type="gramStart"/>
+      <w:r>
+        <w:rPr>
+          <w:rFonts w:cs="TimesNewRomanPSMT"/>
+        </w:rPr>
+        <w:t>lot._</w:t>
+      </w:r>
+      <w:proofErr w:type="spellStart"/>
+      <w:proofErr w:type="gramEnd"/>
+      <w:r>
+        <w:rPr>
+          <w:rFonts w:cs="TimesNewRomanPSMT"/>
+        </w:rPr>
+        <w:t>get_loyer_par_metre_</w:t>
+      </w:r>
+      <w:proofErr w:type="gramStart"/>
+      <w:r>
+        <w:rPr>
+          <w:rFonts w:cs="TimesNewRomanPSMT"/>
+        </w:rPr>
+        <w:t>carre</w:t>
+      </w:r>
+      <w:proofErr w:type="spellEnd"/>
+      <w:r>
+        <w:rPr>
+          <w:rFonts w:cs="TimesNewRomanPSMT"/>
+        </w:rPr>
+        <w:t>(</w:t>
+      </w:r>
+      <w:proofErr w:type="gramEnd"/>
+      <w:r>
+        <w:rPr>
+          <w:rFonts w:cs="TimesNewRomanPSMT"/>
+        </w:rPr>
+        <w:t>)}}</w:t>
+      </w:r>
+      <w:r>
+        <w:rPr>
+          <w:rFonts w:cs="TimesNewRomanPSMT"/>
+          <w:bCs/>
+        </w:rPr>
         <w:t xml:space="preserve"> € le mètre carré par mois</w:t>
       </w:r>
       <w:r>
@@ -919,7 +2932,65 @@
         <w:rPr>
           <w:rFonts w:cs="TimesNewRomanPSMT"/>
         </w:rPr>
-        <w:t>{% if not loop.last %}, {% endif %}{% endfor %}</w:t>
+        <w:t xml:space="preserve">{% if not </w:t>
+      </w:r>
+      <w:proofErr w:type="spellStart"/>
+      <w:proofErr w:type="gramStart"/>
+      <w:r>
+        <w:rPr>
+          <w:rFonts w:cs="TimesNewRomanPSMT"/>
+        </w:rPr>
+        <w:t>loop.last</w:t>
+      </w:r>
+      <w:proofErr w:type="spellEnd"/>
+      <w:proofErr w:type="gramEnd"/>
+      <w:r>
+        <w:rPr>
+          <w:rFonts w:cs="TimesNewRomanPSMT"/>
+        </w:rPr>
+        <w:t xml:space="preserve"> %}, {% </w:t>
+      </w:r>
+      <w:proofErr w:type="spellStart"/>
+      <w:r>
+        <w:rPr>
+          <w:rFonts w:cs="TimesNewRomanPSMT"/>
+        </w:rPr>
+        <w:t>endif</w:t>
+      </w:r>
+      <w:proofErr w:type="spellEnd"/>
+      <w:r>
+        <w:rPr>
+          <w:rFonts w:cs="TimesNewRomanPSMT"/>
+        </w:rPr>
+        <w:t xml:space="preserve"> </w:t>
+      </w:r>
+      <w:proofErr w:type="gramStart"/>
+      <w:r>
+        <w:rPr>
+          <w:rFonts w:cs="TimesNewRomanPSMT"/>
+        </w:rPr>
+        <w:t>%}{</w:t>
+      </w:r>
+      <w:proofErr w:type="gramEnd"/>
+      <w:r>
+        <w:rPr>
+          <w:rFonts w:cs="TimesNewRomanPSMT"/>
+        </w:rPr>
+        <w:t xml:space="preserve">% </w:t>
+      </w:r>
+      <w:proofErr w:type="spellStart"/>
+      <w:r>
+        <w:rPr>
+          <w:rFonts w:cs="TimesNewRomanPSMT"/>
+        </w:rPr>
+        <w:t>endfor</w:t>
+      </w:r>
+      <w:proofErr w:type="spellEnd"/>
+      <w:r>
+        <w:rPr>
+          <w:rFonts w:cs="TimesNewRomanPSMT"/>
+        </w:rPr>
+        <w:t xml:space="preserve"> %}</w:t>
       </w:r>
       <w:r>
         <w:rPr>
@@ -1021,7 +3092,45 @@
               <w:rPr>
                 <w:lang w:val="en-US"/>
               </w:rPr>
-              <w:t>{%tr for k,v in nb_logements_par_type.items() %}</w:t>
+              <w:t xml:space="preserve">{%tr for </w:t>
+            </w:r>
+            <w:proofErr w:type="spellStart"/>
+            <w:proofErr w:type="gramStart"/>
+            <w:r>
+              <w:rPr>
+                <w:lang w:val="en-US"/>
+              </w:rPr>
+              <w:t>k,v</w:t>
+            </w:r>
+            <w:proofErr w:type="spellEnd"/>
+            <w:proofErr w:type="gramEnd"/>
+            <w:r>
+              <w:rPr>
+                <w:lang w:val="en-US"/>
+              </w:rPr>
+              <w:t xml:space="preserve"> in </w:t>
+            </w:r>
+            <w:proofErr w:type="spellStart"/>
+            <w:r>
+              <w:rPr>
+                <w:lang w:val="en-US"/>
+              </w:rPr>
+              <w:t>nb_logements_par_</w:t>
+            </w:r>
+            <w:proofErr w:type="gramStart"/>
+            <w:r>
+              <w:rPr>
+                <w:lang w:val="en-US"/>
+              </w:rPr>
+              <w:t>type.items</w:t>
+            </w:r>
+            <w:proofErr w:type="spellEnd"/>
+            <w:proofErr w:type="gramEnd"/>
+            <w:r>
+              <w:rPr>
+                <w:lang w:val="en-US"/>
+              </w:rPr>
+              <w:t>() %}</w:t>
             </w:r>
           </w:p>
         </w:tc>
@@ -1077,7 +3186,15 @@
               </w:rPr>
             </w:pPr>
             <w:r>
-              <w:t>{%tr endfor %}</w:t>
+              <w:t xml:space="preserve">{%tr </w:t>
+            </w:r>
+            <w:proofErr w:type="spellStart"/>
+            <w:r>
+              <w:t>endfor</w:t>
+            </w:r>
+            <w:proofErr w:type="spellEnd"/>
+            <w:r>
+              <w:t xml:space="preserve"> %}</w:t>
             </w:r>
           </w:p>
         </w:tc>

</xml_diff>

<commit_message>
supprimer loyer_m2 de la fonction fiche_caf_doc et corriger le nom du gestionnaire dans le template FicheCAF.
</commit_message>
<xml_diff>
--- a/documents/FicheCAF-template.docx
+++ b/documents/FicheCAF-template.docx
@@ -2033,6 +2033,11 @@
       </w:pPr>
     </w:p>
     <w:p>
+      <w:pPr>
+        <w:rPr>
+          <w:rFonts w:cs="TimesNewRomanPSMT"/>
+        </w:rPr>
+      </w:pPr>
       <w:r>
         <w:rPr>
           <w:rFonts w:cs="TimesNewRomanPSMT"/>
@@ -2053,14 +2058,14 @@
         <w:rPr>
           <w:rFonts w:cs="TimesNewRomanPSMT"/>
         </w:rPr>
-        <w:t>bailleur.nom</w:t>
-      </w:r>
-      <w:proofErr w:type="gramEnd"/>
-      <w:r>
-        <w:rPr>
-          <w:rFonts w:cs="TimesNewRomanPSMT"/>
-        </w:rPr>
-        <w:t>|</w:t>
+        <w:t>convention</w:t>
+      </w:r>
+      <w:proofErr w:type="gramEnd"/>
+      <w:r>
+        <w:rPr>
+          <w:rFonts w:cs="TimesNewRomanPSMT"/>
+        </w:rPr>
+        <w:t>.gestionnaire|</w:t>
       </w:r>
       <w:proofErr w:type="gramStart"/>
       <w:r>
@@ -2081,133 +2086,41 @@
         <w:rPr>
           <w:rFonts w:cs="TimesNewRomanPSMT"/>
         </w:rPr>
-        <w:t xml:space="preserve">}, </w:t>
-      </w:r>
-      <w:proofErr w:type="gramStart"/>
-      <w:r>
-        <w:rPr>
-          <w:rFonts w:cs="TimesNewRomanPSMT"/>
-        </w:rPr>
-        <w:t xml:space="preserve">{{ </w:t>
+        <w:t>}</w:t>
+      </w:r>
+      <w:r>
+        <w:rPr>
+          <w:rFonts w:cs="TimesNewRomanPSMT"/>
+        </w:rPr>
+        <w:t>, {{</w:t>
       </w:r>
       <w:proofErr w:type="spellStart"/>
-      <w:r>
-        <w:rPr>
-          <w:rFonts w:cs="TimesNewRomanPSMT"/>
-        </w:rPr>
-        <w:t>bailleur</w:t>
-      </w:r>
-      <w:proofErr w:type="gramEnd"/>
-      <w:r>
-        <w:rPr>
-          <w:rFonts w:cs="TimesNewRomanPSMT"/>
-        </w:rPr>
-        <w:t>.</w:t>
-      </w:r>
-      <w:proofErr w:type="gramStart"/>
-      <w:r>
-        <w:rPr>
-          <w:rFonts w:cs="TimesNewRomanPSMT"/>
-        </w:rPr>
-        <w:t>adresse</w:t>
+      <w:proofErr w:type="gramStart"/>
+      <w:r>
+        <w:rPr>
+          <w:rFonts w:cs="TimesNewRomanPSMT"/>
+        </w:rPr>
+        <w:t>convention.gestionnaire</w:t>
+      </w:r>
+      <w:proofErr w:type="gramEnd"/>
+      <w:r>
+        <w:rPr>
+          <w:rFonts w:cs="TimesNewRomanPSMT"/>
+        </w:rPr>
+        <w:t>_bloc_info_complementaire</w:t>
+      </w:r>
+      <w:r>
+        <w:rPr>
+          <w:rFonts w:cs="TimesNewRomanPSMT"/>
+        </w:rPr>
+        <w:t>|upper</w:t>
       </w:r>
       <w:proofErr w:type="spellEnd"/>
       <w:r>
         <w:rPr>
           <w:rFonts w:cs="TimesNewRomanPSMT"/>
         </w:rPr>
-        <w:t xml:space="preserve"> }</w:t>
-      </w:r>
-      <w:proofErr w:type="gramEnd"/>
-      <w:r>
-        <w:rPr>
-          <w:rFonts w:cs="TimesNewRomanPSMT"/>
-        </w:rPr>
-        <w:t xml:space="preserve">}, </w:t>
-      </w:r>
-      <w:proofErr w:type="gramStart"/>
-      <w:r>
-        <w:rPr>
-          <w:rFonts w:cs="TimesNewRomanPSMT"/>
-        </w:rPr>
-        <w:t xml:space="preserve">{{ </w:t>
-      </w:r>
-      <w:proofErr w:type="spellStart"/>
-      <w:r>
-        <w:rPr>
-          <w:rFonts w:cs="TimesNewRomanPSMT"/>
-        </w:rPr>
-        <w:t>bailleur</w:t>
-      </w:r>
-      <w:proofErr w:type="gramEnd"/>
-      <w:r>
-        <w:rPr>
-          <w:rFonts w:cs="TimesNewRomanPSMT"/>
-        </w:rPr>
-        <w:t>.code_</w:t>
-      </w:r>
-      <w:proofErr w:type="gramStart"/>
-      <w:r>
-        <w:rPr>
-          <w:rFonts w:cs="TimesNewRomanPSMT"/>
-        </w:rPr>
-        <w:t>postal</w:t>
-      </w:r>
-      <w:proofErr w:type="spellEnd"/>
-      <w:r>
-        <w:rPr>
-          <w:rFonts w:cs="TimesNewRomanPSMT"/>
-        </w:rPr>
-        <w:t xml:space="preserve"> }</w:t>
-      </w:r>
-      <w:proofErr w:type="gramEnd"/>
-      <w:r>
-        <w:rPr>
-          <w:rFonts w:cs="TimesNewRomanPSMT"/>
-        </w:rPr>
-        <w:t xml:space="preserve">} </w:t>
-      </w:r>
-      <w:proofErr w:type="gramStart"/>
-      <w:r>
-        <w:rPr>
-          <w:rFonts w:cs="TimesNewRomanPSMT"/>
-        </w:rPr>
-        <w:t xml:space="preserve">{{ </w:t>
-      </w:r>
-      <w:proofErr w:type="spellStart"/>
-      <w:r>
-        <w:rPr>
-          <w:rFonts w:cs="TimesNewRomanPSMT"/>
-        </w:rPr>
-        <w:t>bailleur</w:t>
-      </w:r>
-      <w:proofErr w:type="gramEnd"/>
-      <w:r>
-        <w:rPr>
-          <w:rFonts w:cs="TimesNewRomanPSMT"/>
-        </w:rPr>
-        <w:t>.</w:t>
-      </w:r>
-      <w:proofErr w:type="gramStart"/>
-      <w:r>
-        <w:rPr>
-          <w:rFonts w:cs="TimesNewRomanPSMT"/>
-        </w:rPr>
-        <w:t>ville</w:t>
-      </w:r>
-      <w:proofErr w:type="spellEnd"/>
-      <w:r>
-        <w:rPr>
-          <w:rFonts w:cs="TimesNewRomanPSMT"/>
-        </w:rPr>
-        <w:t xml:space="preserve"> }</w:t>
-      </w:r>
-      <w:proofErr w:type="gramEnd"/>
-      <w:r>
-        <w:rPr>
-          <w:rFonts w:cs="TimesNewRomanPSMT"/>
-        </w:rPr>
-        <w:t>}</w:t>
+        <w:t>}}</w:t>
       </w:r>
     </w:p>
     <w:p>
@@ -2719,285 +2632,6 @@
       <w:proofErr w:type="spellEnd"/>
       <w:r>
         <w:t>}}</w:t>
-      </w:r>
-    </w:p>
-    <w:p/>
-    <w:p>
-      <w:pPr>
-        <w:rPr>
-          <w:rFonts w:cs="TimesNewRomanPSMT"/>
-        </w:rPr>
-      </w:pPr>
-      <w:r>
-        <w:rPr>
-          <w:b/>
-          <w:bCs/>
-        </w:rPr>
-        <w:t xml:space="preserve">{% if </w:t>
-      </w:r>
-      <w:proofErr w:type="spellStart"/>
-      <w:r>
-        <w:rPr>
-          <w:b/>
-          <w:bCs/>
-        </w:rPr>
-        <w:t>programme.is_foyer</w:t>
-      </w:r>
-      <w:proofErr w:type="spellEnd"/>
-      <w:r>
-        <w:rPr>
-          <w:b/>
-          <w:bCs/>
-        </w:rPr>
-        <w:t xml:space="preserve"> or </w:t>
-      </w:r>
-      <w:proofErr w:type="spellStart"/>
-      <w:r>
-        <w:rPr>
-          <w:b/>
-          <w:bCs/>
-        </w:rPr>
-        <w:t>programme.is_residence</w:t>
-      </w:r>
-      <w:proofErr w:type="spellEnd"/>
-      <w:r>
-        <w:rPr>
-          <w:b/>
-          <w:bCs/>
-        </w:rPr>
-        <w:t xml:space="preserve"> </w:t>
-      </w:r>
-      <w:proofErr w:type="gramStart"/>
-      <w:r>
-        <w:rPr>
-          <w:b/>
-          <w:bCs/>
-        </w:rPr>
-        <w:t>%}Redevance</w:t>
-      </w:r>
-      <w:proofErr w:type="gramEnd"/>
-      <w:r>
-        <w:rPr>
-          <w:b/>
-          <w:bCs/>
-        </w:rPr>
-        <w:t xml:space="preserve">{% </w:t>
-      </w:r>
-      <w:proofErr w:type="spellStart"/>
-      <w:r>
-        <w:rPr>
-          <w:b/>
-          <w:bCs/>
-        </w:rPr>
-        <w:t>else</w:t>
-      </w:r>
-      <w:proofErr w:type="spellEnd"/>
-      <w:r>
-        <w:rPr>
-          <w:b/>
-          <w:bCs/>
-        </w:rPr>
-        <w:t xml:space="preserve"> </w:t>
-      </w:r>
-      <w:proofErr w:type="gramStart"/>
-      <w:r>
-        <w:rPr>
-          <w:b/>
-          <w:bCs/>
-        </w:rPr>
-        <w:t>%}Loyer</w:t>
-      </w:r>
-      <w:proofErr w:type="gramEnd"/>
-      <w:r>
-        <w:rPr>
-          <w:b/>
-          <w:bCs/>
-        </w:rPr>
-        <w:t xml:space="preserve">{% </w:t>
-      </w:r>
-      <w:proofErr w:type="spellStart"/>
-      <w:r>
-        <w:rPr>
-          <w:b/>
-          <w:bCs/>
-        </w:rPr>
-        <w:t>endif</w:t>
-      </w:r>
-      <w:proofErr w:type="spellEnd"/>
-      <w:r>
-        <w:rPr>
-          <w:b/>
-          <w:bCs/>
-        </w:rPr>
-        <w:t xml:space="preserve"> %} maximum mensuel :</w:t>
-      </w:r>
-      <w:r>
-        <w:rPr>
-          <w:rFonts w:cs="TimesNewRomanPSMT"/>
-        </w:rPr>
-        <w:t xml:space="preserve"> {% for lot in lots %} </w:t>
-      </w:r>
-      <w:proofErr w:type="gramStart"/>
-      <w:r>
-        <w:rPr>
-          <w:rFonts w:cs="TimesNewRomanPSMT"/>
-        </w:rPr>
-        <w:t xml:space="preserve">{{ </w:t>
-      </w:r>
-      <w:proofErr w:type="spellStart"/>
-      <w:r>
-        <w:rPr>
-          <w:rFonts w:cs="TimesNewRomanPSMT"/>
-        </w:rPr>
-        <w:t>lot</w:t>
-      </w:r>
-      <w:proofErr w:type="gramEnd"/>
-      <w:r>
-        <w:rPr>
-          <w:rFonts w:cs="TimesNewRomanPSMT"/>
-        </w:rPr>
-        <w:t>.</w:t>
-      </w:r>
-      <w:proofErr w:type="gramStart"/>
-      <w:r>
-        <w:rPr>
-          <w:rFonts w:cs="TimesNewRomanPSMT"/>
-        </w:rPr>
-        <w:t>financement</w:t>
-      </w:r>
-      <w:proofErr w:type="spellEnd"/>
-      <w:r>
-        <w:rPr>
-          <w:rFonts w:cs="TimesNewRomanPSMT"/>
-        </w:rPr>
-        <w:t xml:space="preserve"> }</w:t>
-      </w:r>
-      <w:proofErr w:type="gramEnd"/>
-      <w:r>
-        <w:rPr>
-          <w:rFonts w:cs="TimesNewRomanPSMT"/>
-        </w:rPr>
-        <w:t>} : {{</w:t>
-      </w:r>
-      <w:proofErr w:type="gramStart"/>
-      <w:r>
-        <w:rPr>
-          <w:rFonts w:cs="TimesNewRomanPSMT"/>
-        </w:rPr>
-        <w:t>lot._</w:t>
-      </w:r>
-      <w:proofErr w:type="spellStart"/>
-      <w:proofErr w:type="gramEnd"/>
-      <w:r>
-        <w:rPr>
-          <w:rFonts w:cs="TimesNewRomanPSMT"/>
-        </w:rPr>
-        <w:t>get_loyer_par_metre_</w:t>
-      </w:r>
-      <w:proofErr w:type="gramStart"/>
-      <w:r>
-        <w:rPr>
-          <w:rFonts w:cs="TimesNewRomanPSMT"/>
-        </w:rPr>
-        <w:t>carre</w:t>
-      </w:r>
-      <w:proofErr w:type="spellEnd"/>
-      <w:r>
-        <w:rPr>
-          <w:rFonts w:cs="TimesNewRomanPSMT"/>
-        </w:rPr>
-        <w:t>(</w:t>
-      </w:r>
-      <w:proofErr w:type="gramEnd"/>
-      <w:r>
-        <w:rPr>
-          <w:rFonts w:cs="TimesNewRomanPSMT"/>
-        </w:rPr>
-        <w:t>)}}</w:t>
-      </w:r>
-      <w:r>
-        <w:rPr>
-          <w:rFonts w:cs="TimesNewRomanPSMT"/>
-          <w:bCs/>
-        </w:rPr>
-        <w:t xml:space="preserve"> € le mètre carré par mois</w:t>
-      </w:r>
-      <w:r>
-        <w:rPr>
-          <w:rFonts w:cs="TimesNewRomanPSMT"/>
-        </w:rPr>
-        <w:t xml:space="preserve"> </w:t>
-      </w:r>
-      <w:r>
-        <w:rPr>
-          <w:rFonts w:cs="TimesNewRomanPSMT"/>
-        </w:rPr>
-        <w:t xml:space="preserve">{% if not </w:t>
-      </w:r>
-      <w:proofErr w:type="spellStart"/>
-      <w:proofErr w:type="gramStart"/>
-      <w:r>
-        <w:rPr>
-          <w:rFonts w:cs="TimesNewRomanPSMT"/>
-        </w:rPr>
-        <w:t>loop.last</w:t>
-      </w:r>
-      <w:proofErr w:type="spellEnd"/>
-      <w:proofErr w:type="gramEnd"/>
-      <w:r>
-        <w:rPr>
-          <w:rFonts w:cs="TimesNewRomanPSMT"/>
-        </w:rPr>
-        <w:t xml:space="preserve"> %}, {% </w:t>
-      </w:r>
-      <w:proofErr w:type="spellStart"/>
-      <w:r>
-        <w:rPr>
-          <w:rFonts w:cs="TimesNewRomanPSMT"/>
-        </w:rPr>
-        <w:t>endif</w:t>
-      </w:r>
-      <w:proofErr w:type="spellEnd"/>
-      <w:r>
-        <w:rPr>
-          <w:rFonts w:cs="TimesNewRomanPSMT"/>
-        </w:rPr>
-        <w:t xml:space="preserve"> </w:t>
-      </w:r>
-      <w:proofErr w:type="gramStart"/>
-      <w:r>
-        <w:rPr>
-          <w:rFonts w:cs="TimesNewRomanPSMT"/>
-        </w:rPr>
-        <w:t>%}{</w:t>
-      </w:r>
-      <w:proofErr w:type="gramEnd"/>
-      <w:r>
-        <w:rPr>
-          <w:rFonts w:cs="TimesNewRomanPSMT"/>
-        </w:rPr>
-        <w:t xml:space="preserve">% </w:t>
-      </w:r>
-      <w:proofErr w:type="spellStart"/>
-      <w:r>
-        <w:rPr>
-          <w:rFonts w:cs="TimesNewRomanPSMT"/>
-        </w:rPr>
-        <w:t>endfor</w:t>
-      </w:r>
-      <w:proofErr w:type="spellEnd"/>
-      <w:r>
-        <w:rPr>
-          <w:rFonts w:cs="TimesNewRomanPSMT"/>
-        </w:rPr>
-        <w:t xml:space="preserve"> %}</w:t>
-      </w:r>
-      <w:r>
-        <w:rPr>
-          <w:rFonts w:cs="TimesNewRomanPSMT"/>
-          <w:bCs/>
-        </w:rPr>
-        <w:t>.</w:t>
       </w:r>
     </w:p>
     <w:p/>
@@ -4933,6 +4567,7 @@
   <w:style w:type="character" w:default="1" w:styleId="Policepardfaut">
     <w:name w:val="Default Paragraph Font"/>
     <w:uiPriority w:val="1"/>
+    <w:semiHidden/>
     <w:unhideWhenUsed/>
   </w:style>
   <w:style w:type="table" w:default="1" w:styleId="TableauNormal">

</xml_diff>

<commit_message>
supprimer loyer_m2 de la fonction fiche_caf_doc et corriger le nom du gestionnaire dans le template FicheCAF. (#2163)
* supprimer loyer_m2 de la fonction fiche_caf_doc et corriger le nom du gestionnaire dans le template FicheCAF.

* corriger le test pour la fiche caf
</commit_message>
<xml_diff>
--- a/documents/FicheCAF-template.docx
+++ b/documents/FicheCAF-template.docx
@@ -2033,6 +2033,11 @@
       </w:pPr>
     </w:p>
     <w:p>
+      <w:pPr>
+        <w:rPr>
+          <w:rFonts w:cs="TimesNewRomanPSMT"/>
+        </w:rPr>
+      </w:pPr>
       <w:r>
         <w:rPr>
           <w:rFonts w:cs="TimesNewRomanPSMT"/>
@@ -2053,14 +2058,14 @@
         <w:rPr>
           <w:rFonts w:cs="TimesNewRomanPSMT"/>
         </w:rPr>
-        <w:t>bailleur.nom</w:t>
-      </w:r>
-      <w:proofErr w:type="gramEnd"/>
-      <w:r>
-        <w:rPr>
-          <w:rFonts w:cs="TimesNewRomanPSMT"/>
-        </w:rPr>
-        <w:t>|</w:t>
+        <w:t>convention</w:t>
+      </w:r>
+      <w:proofErr w:type="gramEnd"/>
+      <w:r>
+        <w:rPr>
+          <w:rFonts w:cs="TimesNewRomanPSMT"/>
+        </w:rPr>
+        <w:t>.gestionnaire|</w:t>
       </w:r>
       <w:proofErr w:type="gramStart"/>
       <w:r>
@@ -2081,133 +2086,41 @@
         <w:rPr>
           <w:rFonts w:cs="TimesNewRomanPSMT"/>
         </w:rPr>
-        <w:t xml:space="preserve">}, </w:t>
-      </w:r>
-      <w:proofErr w:type="gramStart"/>
-      <w:r>
-        <w:rPr>
-          <w:rFonts w:cs="TimesNewRomanPSMT"/>
-        </w:rPr>
-        <w:t xml:space="preserve">{{ </w:t>
+        <w:t>}</w:t>
+      </w:r>
+      <w:r>
+        <w:rPr>
+          <w:rFonts w:cs="TimesNewRomanPSMT"/>
+        </w:rPr>
+        <w:t>, {{</w:t>
       </w:r>
       <w:proofErr w:type="spellStart"/>
-      <w:r>
-        <w:rPr>
-          <w:rFonts w:cs="TimesNewRomanPSMT"/>
-        </w:rPr>
-        <w:t>bailleur</w:t>
-      </w:r>
-      <w:proofErr w:type="gramEnd"/>
-      <w:r>
-        <w:rPr>
-          <w:rFonts w:cs="TimesNewRomanPSMT"/>
-        </w:rPr>
-        <w:t>.</w:t>
-      </w:r>
-      <w:proofErr w:type="gramStart"/>
-      <w:r>
-        <w:rPr>
-          <w:rFonts w:cs="TimesNewRomanPSMT"/>
-        </w:rPr>
-        <w:t>adresse</w:t>
+      <w:proofErr w:type="gramStart"/>
+      <w:r>
+        <w:rPr>
+          <w:rFonts w:cs="TimesNewRomanPSMT"/>
+        </w:rPr>
+        <w:t>convention.gestionnaire</w:t>
+      </w:r>
+      <w:proofErr w:type="gramEnd"/>
+      <w:r>
+        <w:rPr>
+          <w:rFonts w:cs="TimesNewRomanPSMT"/>
+        </w:rPr>
+        <w:t>_bloc_info_complementaire</w:t>
+      </w:r>
+      <w:r>
+        <w:rPr>
+          <w:rFonts w:cs="TimesNewRomanPSMT"/>
+        </w:rPr>
+        <w:t>|upper</w:t>
       </w:r>
       <w:proofErr w:type="spellEnd"/>
       <w:r>
         <w:rPr>
           <w:rFonts w:cs="TimesNewRomanPSMT"/>
         </w:rPr>
-        <w:t xml:space="preserve"> }</w:t>
-      </w:r>
-      <w:proofErr w:type="gramEnd"/>
-      <w:r>
-        <w:rPr>
-          <w:rFonts w:cs="TimesNewRomanPSMT"/>
-        </w:rPr>
-        <w:t xml:space="preserve">}, </w:t>
-      </w:r>
-      <w:proofErr w:type="gramStart"/>
-      <w:r>
-        <w:rPr>
-          <w:rFonts w:cs="TimesNewRomanPSMT"/>
-        </w:rPr>
-        <w:t xml:space="preserve">{{ </w:t>
-      </w:r>
-      <w:proofErr w:type="spellStart"/>
-      <w:r>
-        <w:rPr>
-          <w:rFonts w:cs="TimesNewRomanPSMT"/>
-        </w:rPr>
-        <w:t>bailleur</w:t>
-      </w:r>
-      <w:proofErr w:type="gramEnd"/>
-      <w:r>
-        <w:rPr>
-          <w:rFonts w:cs="TimesNewRomanPSMT"/>
-        </w:rPr>
-        <w:t>.code_</w:t>
-      </w:r>
-      <w:proofErr w:type="gramStart"/>
-      <w:r>
-        <w:rPr>
-          <w:rFonts w:cs="TimesNewRomanPSMT"/>
-        </w:rPr>
-        <w:t>postal</w:t>
-      </w:r>
-      <w:proofErr w:type="spellEnd"/>
-      <w:r>
-        <w:rPr>
-          <w:rFonts w:cs="TimesNewRomanPSMT"/>
-        </w:rPr>
-        <w:t xml:space="preserve"> }</w:t>
-      </w:r>
-      <w:proofErr w:type="gramEnd"/>
-      <w:r>
-        <w:rPr>
-          <w:rFonts w:cs="TimesNewRomanPSMT"/>
-        </w:rPr>
-        <w:t xml:space="preserve">} </w:t>
-      </w:r>
-      <w:proofErr w:type="gramStart"/>
-      <w:r>
-        <w:rPr>
-          <w:rFonts w:cs="TimesNewRomanPSMT"/>
-        </w:rPr>
-        <w:t xml:space="preserve">{{ </w:t>
-      </w:r>
-      <w:proofErr w:type="spellStart"/>
-      <w:r>
-        <w:rPr>
-          <w:rFonts w:cs="TimesNewRomanPSMT"/>
-        </w:rPr>
-        <w:t>bailleur</w:t>
-      </w:r>
-      <w:proofErr w:type="gramEnd"/>
-      <w:r>
-        <w:rPr>
-          <w:rFonts w:cs="TimesNewRomanPSMT"/>
-        </w:rPr>
-        <w:t>.</w:t>
-      </w:r>
-      <w:proofErr w:type="gramStart"/>
-      <w:r>
-        <w:rPr>
-          <w:rFonts w:cs="TimesNewRomanPSMT"/>
-        </w:rPr>
-        <w:t>ville</w:t>
-      </w:r>
-      <w:proofErr w:type="spellEnd"/>
-      <w:r>
-        <w:rPr>
-          <w:rFonts w:cs="TimesNewRomanPSMT"/>
-        </w:rPr>
-        <w:t xml:space="preserve"> }</w:t>
-      </w:r>
-      <w:proofErr w:type="gramEnd"/>
-      <w:r>
-        <w:rPr>
-          <w:rFonts w:cs="TimesNewRomanPSMT"/>
-        </w:rPr>
-        <w:t>}</w:t>
+        <w:t>}}</w:t>
       </w:r>
     </w:p>
     <w:p>
@@ -2719,285 +2632,6 @@
       <w:proofErr w:type="spellEnd"/>
       <w:r>
         <w:t>}}</w:t>
-      </w:r>
-    </w:p>
-    <w:p/>
-    <w:p>
-      <w:pPr>
-        <w:rPr>
-          <w:rFonts w:cs="TimesNewRomanPSMT"/>
-        </w:rPr>
-      </w:pPr>
-      <w:r>
-        <w:rPr>
-          <w:b/>
-          <w:bCs/>
-        </w:rPr>
-        <w:t xml:space="preserve">{% if </w:t>
-      </w:r>
-      <w:proofErr w:type="spellStart"/>
-      <w:r>
-        <w:rPr>
-          <w:b/>
-          <w:bCs/>
-        </w:rPr>
-        <w:t>programme.is_foyer</w:t>
-      </w:r>
-      <w:proofErr w:type="spellEnd"/>
-      <w:r>
-        <w:rPr>
-          <w:b/>
-          <w:bCs/>
-        </w:rPr>
-        <w:t xml:space="preserve"> or </w:t>
-      </w:r>
-      <w:proofErr w:type="spellStart"/>
-      <w:r>
-        <w:rPr>
-          <w:b/>
-          <w:bCs/>
-        </w:rPr>
-        <w:t>programme.is_residence</w:t>
-      </w:r>
-      <w:proofErr w:type="spellEnd"/>
-      <w:r>
-        <w:rPr>
-          <w:b/>
-          <w:bCs/>
-        </w:rPr>
-        <w:t xml:space="preserve"> </w:t>
-      </w:r>
-      <w:proofErr w:type="gramStart"/>
-      <w:r>
-        <w:rPr>
-          <w:b/>
-          <w:bCs/>
-        </w:rPr>
-        <w:t>%}Redevance</w:t>
-      </w:r>
-      <w:proofErr w:type="gramEnd"/>
-      <w:r>
-        <w:rPr>
-          <w:b/>
-          <w:bCs/>
-        </w:rPr>
-        <w:t xml:space="preserve">{% </w:t>
-      </w:r>
-      <w:proofErr w:type="spellStart"/>
-      <w:r>
-        <w:rPr>
-          <w:b/>
-          <w:bCs/>
-        </w:rPr>
-        <w:t>else</w:t>
-      </w:r>
-      <w:proofErr w:type="spellEnd"/>
-      <w:r>
-        <w:rPr>
-          <w:b/>
-          <w:bCs/>
-        </w:rPr>
-        <w:t xml:space="preserve"> </w:t>
-      </w:r>
-      <w:proofErr w:type="gramStart"/>
-      <w:r>
-        <w:rPr>
-          <w:b/>
-          <w:bCs/>
-        </w:rPr>
-        <w:t>%}Loyer</w:t>
-      </w:r>
-      <w:proofErr w:type="gramEnd"/>
-      <w:r>
-        <w:rPr>
-          <w:b/>
-          <w:bCs/>
-        </w:rPr>
-        <w:t xml:space="preserve">{% </w:t>
-      </w:r>
-      <w:proofErr w:type="spellStart"/>
-      <w:r>
-        <w:rPr>
-          <w:b/>
-          <w:bCs/>
-        </w:rPr>
-        <w:t>endif</w:t>
-      </w:r>
-      <w:proofErr w:type="spellEnd"/>
-      <w:r>
-        <w:rPr>
-          <w:b/>
-          <w:bCs/>
-        </w:rPr>
-        <w:t xml:space="preserve"> %} maximum mensuel :</w:t>
-      </w:r>
-      <w:r>
-        <w:rPr>
-          <w:rFonts w:cs="TimesNewRomanPSMT"/>
-        </w:rPr>
-        <w:t xml:space="preserve"> {% for lot in lots %} </w:t>
-      </w:r>
-      <w:proofErr w:type="gramStart"/>
-      <w:r>
-        <w:rPr>
-          <w:rFonts w:cs="TimesNewRomanPSMT"/>
-        </w:rPr>
-        <w:t xml:space="preserve">{{ </w:t>
-      </w:r>
-      <w:proofErr w:type="spellStart"/>
-      <w:r>
-        <w:rPr>
-          <w:rFonts w:cs="TimesNewRomanPSMT"/>
-        </w:rPr>
-        <w:t>lot</w:t>
-      </w:r>
-      <w:proofErr w:type="gramEnd"/>
-      <w:r>
-        <w:rPr>
-          <w:rFonts w:cs="TimesNewRomanPSMT"/>
-        </w:rPr>
-        <w:t>.</w:t>
-      </w:r>
-      <w:proofErr w:type="gramStart"/>
-      <w:r>
-        <w:rPr>
-          <w:rFonts w:cs="TimesNewRomanPSMT"/>
-        </w:rPr>
-        <w:t>financement</w:t>
-      </w:r>
-      <w:proofErr w:type="spellEnd"/>
-      <w:r>
-        <w:rPr>
-          <w:rFonts w:cs="TimesNewRomanPSMT"/>
-        </w:rPr>
-        <w:t xml:space="preserve"> }</w:t>
-      </w:r>
-      <w:proofErr w:type="gramEnd"/>
-      <w:r>
-        <w:rPr>
-          <w:rFonts w:cs="TimesNewRomanPSMT"/>
-        </w:rPr>
-        <w:t>} : {{</w:t>
-      </w:r>
-      <w:proofErr w:type="gramStart"/>
-      <w:r>
-        <w:rPr>
-          <w:rFonts w:cs="TimesNewRomanPSMT"/>
-        </w:rPr>
-        <w:t>lot._</w:t>
-      </w:r>
-      <w:proofErr w:type="spellStart"/>
-      <w:proofErr w:type="gramEnd"/>
-      <w:r>
-        <w:rPr>
-          <w:rFonts w:cs="TimesNewRomanPSMT"/>
-        </w:rPr>
-        <w:t>get_loyer_par_metre_</w:t>
-      </w:r>
-      <w:proofErr w:type="gramStart"/>
-      <w:r>
-        <w:rPr>
-          <w:rFonts w:cs="TimesNewRomanPSMT"/>
-        </w:rPr>
-        <w:t>carre</w:t>
-      </w:r>
-      <w:proofErr w:type="spellEnd"/>
-      <w:r>
-        <w:rPr>
-          <w:rFonts w:cs="TimesNewRomanPSMT"/>
-        </w:rPr>
-        <w:t>(</w:t>
-      </w:r>
-      <w:proofErr w:type="gramEnd"/>
-      <w:r>
-        <w:rPr>
-          <w:rFonts w:cs="TimesNewRomanPSMT"/>
-        </w:rPr>
-        <w:t>)}}</w:t>
-      </w:r>
-      <w:r>
-        <w:rPr>
-          <w:rFonts w:cs="TimesNewRomanPSMT"/>
-          <w:bCs/>
-        </w:rPr>
-        <w:t xml:space="preserve"> € le mètre carré par mois</w:t>
-      </w:r>
-      <w:r>
-        <w:rPr>
-          <w:rFonts w:cs="TimesNewRomanPSMT"/>
-        </w:rPr>
-        <w:t xml:space="preserve"> </w:t>
-      </w:r>
-      <w:r>
-        <w:rPr>
-          <w:rFonts w:cs="TimesNewRomanPSMT"/>
-        </w:rPr>
-        <w:t xml:space="preserve">{% if not </w:t>
-      </w:r>
-      <w:proofErr w:type="spellStart"/>
-      <w:proofErr w:type="gramStart"/>
-      <w:r>
-        <w:rPr>
-          <w:rFonts w:cs="TimesNewRomanPSMT"/>
-        </w:rPr>
-        <w:t>loop.last</w:t>
-      </w:r>
-      <w:proofErr w:type="spellEnd"/>
-      <w:proofErr w:type="gramEnd"/>
-      <w:r>
-        <w:rPr>
-          <w:rFonts w:cs="TimesNewRomanPSMT"/>
-        </w:rPr>
-        <w:t xml:space="preserve"> %}, {% </w:t>
-      </w:r>
-      <w:proofErr w:type="spellStart"/>
-      <w:r>
-        <w:rPr>
-          <w:rFonts w:cs="TimesNewRomanPSMT"/>
-        </w:rPr>
-        <w:t>endif</w:t>
-      </w:r>
-      <w:proofErr w:type="spellEnd"/>
-      <w:r>
-        <w:rPr>
-          <w:rFonts w:cs="TimesNewRomanPSMT"/>
-        </w:rPr>
-        <w:t xml:space="preserve"> </w:t>
-      </w:r>
-      <w:proofErr w:type="gramStart"/>
-      <w:r>
-        <w:rPr>
-          <w:rFonts w:cs="TimesNewRomanPSMT"/>
-        </w:rPr>
-        <w:t>%}{</w:t>
-      </w:r>
-      <w:proofErr w:type="gramEnd"/>
-      <w:r>
-        <w:rPr>
-          <w:rFonts w:cs="TimesNewRomanPSMT"/>
-        </w:rPr>
-        <w:t xml:space="preserve">% </w:t>
-      </w:r>
-      <w:proofErr w:type="spellStart"/>
-      <w:r>
-        <w:rPr>
-          <w:rFonts w:cs="TimesNewRomanPSMT"/>
-        </w:rPr>
-        <w:t>endfor</w:t>
-      </w:r>
-      <w:proofErr w:type="spellEnd"/>
-      <w:r>
-        <w:rPr>
-          <w:rFonts w:cs="TimesNewRomanPSMT"/>
-        </w:rPr>
-        <w:t xml:space="preserve"> %}</w:t>
-      </w:r>
-      <w:r>
-        <w:rPr>
-          <w:rFonts w:cs="TimesNewRomanPSMT"/>
-          <w:bCs/>
-        </w:rPr>
-        <w:t>.</w:t>
       </w:r>
     </w:p>
     <w:p/>
@@ -4933,6 +4567,7 @@
   <w:style w:type="character" w:default="1" w:styleId="Policepardfaut">
     <w:name w:val="Default Paragraph Font"/>
     <w:uiPriority w:val="1"/>
+    <w:semiHidden/>
     <w:unhideWhenUsed/>
   </w:style>
   <w:style w:type="table" w:default="1" w:styleId="TableauNormal">

</xml_diff>